<commit_message>
docs(paper): add two VLIW code-compression references; update 28nm synthesis summary
</commit_message>
<xml_diff>
--- a/汇总28nm综合结果.docx
+++ b/汇总28nm综合结果.docx
@@ -1,13 +1,10 @@
 
 <file path=word/document.xml><?xml version="1.0" encoding="utf-8"?>
-<w:document xmlns:wpc="http://schemas.microsoft.com/office/word/2010/wordprocessingCanvas" xmlns:cx="http://schemas.microsoft.com/office/drawing/2014/chartex" xmlns:cx1="http://schemas.microsoft.com/office/drawing/2015/9/8/chartex" xmlns:cx2="http://schemas.microsoft.com/office/drawing/2015/10/21/chartex" xmlns:cx3="http://schemas.microsoft.com/office/drawing/2016/5/9/chartex" xmlns:cx4="http://schemas.microsoft.com/office/drawing/2016/5/10/chartex" xmlns:cx5="http://schemas.microsoft.com/office/drawing/2016/5/11/chartex" xmlns:cx6="http://schemas.microsoft.com/office/drawing/2016/5/12/chartex" xmlns:cx7="http://schemas.microsoft.com/office/drawing/2016/5/13/chartex" xmlns:cx8="http://schemas.microsoft.com/office/drawing/2016/5/14/chartex" xmlns:mc="http://schemas.openxmlformats.org/markup-compatibility/2006" xmlns:aink="http://schemas.microsoft.com/office/drawing/2016/ink" xmlns:am3d="http://schemas.microsoft.com/office/drawing/2017/model3d" xmlns:o="urn:schemas-microsoft-com:office:office" xmlns:r="http://schemas.openxmlformats.org/officeDocument/2006/relationships" xmlns:m="http://schemas.openxmlformats.org/officeDocument/2006/math" xmlns:v="urn:schemas-microsoft-com:vml" xmlns:wp14="http://schemas.microsoft.com/office/word/2010/wordprocessingDrawing" xmlns:wp="http://schemas.openxmlformats.org/drawingml/2006/wordprocessingDrawing" xmlns:w10="urn:schemas-microsoft-com:office:word" xmlns:w="http://schemas.openxmlformats.org/wordprocessingml/2006/main" xmlns:w14="http://schemas.microsoft.com/office/word/2010/wordml" xmlns:w15="http://schemas.microsoft.com/office/word/2012/wordml" xmlns:w16cid="http://schemas.microsoft.com/office/word/2016/wordml/cid" xmlns:w16se="http://schemas.microsoft.com/office/word/2015/wordml/symex" xmlns:wpg="http://schemas.microsoft.com/office/word/2010/wordprocessingGroup" xmlns:wpi="http://schemas.microsoft.com/office/word/2010/wordprocessingInk" xmlns:wne="http://schemas.microsoft.com/office/word/2006/wordml" xmlns:wps="http://schemas.microsoft.com/office/word/2010/wordprocessingShape" mc:Ignorable="w14 w15 w16se w16cid wp14">
+<w:document xmlns:wpc="http://schemas.microsoft.com/office/word/2010/wordprocessingCanvas" xmlns:cx="http://schemas.microsoft.com/office/drawing/2014/chartex" xmlns:cx1="http://schemas.microsoft.com/office/drawing/2015/9/8/chartex" xmlns:cx2="http://schemas.microsoft.com/office/drawing/2015/10/21/chartex" xmlns:cx3="http://schemas.microsoft.com/office/drawing/2016/5/9/chartex" xmlns:cx4="http://schemas.microsoft.com/office/drawing/2016/5/10/chartex" xmlns:cx5="http://schemas.microsoft.com/office/drawing/2016/5/11/chartex" xmlns:cx6="http://schemas.microsoft.com/office/drawing/2016/5/12/chartex" xmlns:cx7="http://schemas.microsoft.com/office/drawing/2016/5/13/chartex" xmlns:cx8="http://schemas.microsoft.com/office/drawing/2016/5/14/chartex" xmlns:mc="http://schemas.openxmlformats.org/markup-compatibility/2006" xmlns:m="http://schemas.openxmlformats.org/officeDocument/2006/math" xmlns:aink="http://schemas.microsoft.com/office/drawing/2016/ink" xmlns:am3d="http://schemas.microsoft.com/office/drawing/2017/model3d" xmlns:oel="http://schemas.microsoft.com/office/2019/extlst" xmlns:r="http://schemas.openxmlformats.org/officeDocument/2006/relationships" xmlns:wp14="http://schemas.microsoft.com/office/word/2010/wordprocessingDrawing" xmlns:wp="http://schemas.openxmlformats.org/drawingml/2006/wordprocessingDrawing" xmlns:wpg="http://schemas.microsoft.com/office/word/2010/wordprocessingGroup" xmlns:wpi="http://schemas.microsoft.com/office/word/2010/wordprocessingInk" xmlns:wps="http://schemas.microsoft.com/office/word/2010/wordprocessingShape" xmlns:o="urn:schemas-microsoft-com:office:office" xmlns:v="urn:schemas-microsoft-com:vml" xmlns:w10="urn:schemas-microsoft-com:office:word" xmlns:w="http://schemas.openxmlformats.org/wordprocessingml/2006/main" xmlns:w14="http://schemas.microsoft.com/office/word/2010/wordml" xmlns:w15="http://schemas.microsoft.com/office/word/2012/wordml" xmlns:w16cex="http://schemas.microsoft.com/office/word/2018/wordml/cex" xmlns:w16cid="http://schemas.microsoft.com/office/word/2016/wordml/cid" xmlns:w16="http://schemas.microsoft.com/office/word/2018/wordml" xmlns:w16sdtdh="http://schemas.microsoft.com/office/word/2020/wordml/sdtdatahash" xmlns:w16sdtfl="http://schemas.microsoft.com/office/word/2024/wordml/sdtformatlock" xmlns:w16se="http://schemas.microsoft.com/office/word/2015/wordml/symex" xmlns:w16du="http://schemas.microsoft.com/office/word/2023/wordml/word16du" xmlns:wne="http://schemas.microsoft.com/office/word/2006/wordml" mc:Ignorable="w14 w15 w16se w16cid w16 w16cex w16sdtdh w16sdtfl w16du wp14">
   <w:body>
     <w:p>
       <w:pPr>
         <w:pStyle w:val="1"/>
-        <w:rPr>
-          <w:rFonts w:hint="eastAsia"/>
-        </w:rPr>
       </w:pPr>
       <w:r>
         <w:rPr>
@@ -57,9 +54,6 @@
           <w:p>
             <w:pPr>
               <w:ind w:firstLine="0"/>
-              <w:rPr>
-                <w:rFonts w:hint="eastAsia"/>
-              </w:rPr>
             </w:pPr>
             <w:proofErr w:type="spellStart"/>
             <w:r>
@@ -84,9 +78,6 @@
           <w:p>
             <w:pPr>
               <w:ind w:firstLine="0"/>
-              <w:rPr>
-                <w:rFonts w:hint="eastAsia"/>
-              </w:rPr>
             </w:pPr>
             <w:r>
               <w:rPr>
@@ -103,9 +94,6 @@
           <w:p>
             <w:pPr>
               <w:ind w:firstLine="0"/>
-              <w:rPr>
-                <w:rFonts w:hint="eastAsia"/>
-              </w:rPr>
             </w:pPr>
             <w:r>
               <w:rPr>
@@ -140,9 +128,6 @@
           <w:p>
             <w:pPr>
               <w:ind w:firstLine="0"/>
-              <w:rPr>
-                <w:rFonts w:hint="eastAsia"/>
-              </w:rPr>
             </w:pPr>
             <w:r>
               <w:rPr>
@@ -181,9 +166,6 @@
           <w:p>
             <w:pPr>
               <w:ind w:firstLine="0"/>
-              <w:rPr>
-                <w:rFonts w:hint="eastAsia"/>
-              </w:rPr>
             </w:pPr>
             <w:r>
               <w:rPr>
@@ -209,9 +191,6 @@
           <w:p>
             <w:pPr>
               <w:ind w:firstLine="0"/>
-              <w:rPr>
-                <w:rFonts w:hint="eastAsia"/>
-              </w:rPr>
             </w:pPr>
             <w:r>
               <w:t>2</w:t>
@@ -305,9 +284,6 @@
           <w:p>
             <w:pPr>
               <w:ind w:firstLine="0"/>
-              <w:rPr>
-                <w:rFonts w:hint="eastAsia"/>
-              </w:rPr>
             </w:pPr>
             <w:r>
               <w:rPr>
@@ -327,9 +303,6 @@
           <w:p>
             <w:pPr>
               <w:ind w:firstLine="0"/>
-              <w:rPr>
-                <w:rFonts w:hint="eastAsia"/>
-              </w:rPr>
             </w:pPr>
             <w:r>
               <w:rPr>
@@ -351,9 +324,6 @@
           <w:p>
             <w:pPr>
               <w:ind w:firstLine="0"/>
-              <w:rPr>
-                <w:rFonts w:hint="eastAsia"/>
-              </w:rPr>
             </w:pPr>
             <w:r>
               <w:rPr>
@@ -379,9 +349,6 @@
           <w:p>
             <w:pPr>
               <w:ind w:firstLine="0"/>
-              <w:rPr>
-                <w:rFonts w:hint="eastAsia"/>
-              </w:rPr>
             </w:pPr>
             <w:r>
               <w:rPr>
@@ -430,9 +397,6 @@
           <w:p>
             <w:pPr>
               <w:ind w:firstLine="0"/>
-              <w:rPr>
-                <w:rFonts w:hint="eastAsia"/>
-              </w:rPr>
             </w:pPr>
             <w:r>
               <w:rPr>
@@ -452,9 +416,6 @@
           <w:p>
             <w:pPr>
               <w:ind w:firstLine="0"/>
-              <w:rPr>
-                <w:rFonts w:hint="eastAsia"/>
-              </w:rPr>
             </w:pPr>
             <w:r>
               <w:rPr>
@@ -476,9 +437,6 @@
           <w:p>
             <w:pPr>
               <w:ind w:firstLine="0"/>
-              <w:rPr>
-                <w:rFonts w:hint="eastAsia"/>
-              </w:rPr>
             </w:pPr>
             <w:r>
               <w:rPr>
@@ -504,9 +462,6 @@
           <w:p>
             <w:pPr>
               <w:ind w:firstLine="0"/>
-              <w:rPr>
-                <w:rFonts w:hint="eastAsia"/>
-              </w:rPr>
             </w:pPr>
             <w:r>
               <w:rPr>
@@ -531,9 +486,6 @@
           <w:p>
             <w:pPr>
               <w:ind w:firstLine="0"/>
-              <w:rPr>
-                <w:rFonts w:hint="eastAsia"/>
-              </w:rPr>
             </w:pPr>
             <w:r>
               <w:rPr>
@@ -553,9 +505,6 @@
           <w:p>
             <w:pPr>
               <w:ind w:firstLine="0"/>
-              <w:rPr>
-                <w:rFonts w:hint="eastAsia"/>
-              </w:rPr>
             </w:pPr>
             <w:r>
               <w:rPr>
@@ -577,9 +526,6 @@
           <w:p>
             <w:pPr>
               <w:ind w:firstLine="0"/>
-              <w:rPr>
-                <w:rFonts w:hint="eastAsia"/>
-              </w:rPr>
             </w:pPr>
             <w:r>
               <w:rPr>
@@ -605,9 +551,6 @@
           <w:p>
             <w:pPr>
               <w:ind w:firstLine="0"/>
-              <w:rPr>
-                <w:rFonts w:hint="eastAsia"/>
-              </w:rPr>
             </w:pPr>
             <w:r>
               <w:rPr>
@@ -653,9 +596,6 @@
           <w:p>
             <w:pPr>
               <w:ind w:firstLine="0"/>
-              <w:rPr>
-                <w:rFonts w:hint="eastAsia"/>
-              </w:rPr>
             </w:pPr>
             <w:r>
               <w:rPr>
@@ -675,9 +615,6 @@
           <w:p>
             <w:pPr>
               <w:ind w:firstLine="0"/>
-              <w:rPr>
-                <w:rFonts w:hint="eastAsia"/>
-              </w:rPr>
             </w:pPr>
             <w:r>
               <w:rPr>
@@ -699,9 +636,6 @@
           <w:p>
             <w:pPr>
               <w:ind w:firstLine="0"/>
-              <w:rPr>
-                <w:rFonts w:hint="eastAsia"/>
-              </w:rPr>
             </w:pPr>
             <w:r>
               <w:rPr>
@@ -727,9 +661,6 @@
           <w:p>
             <w:pPr>
               <w:ind w:firstLine="0"/>
-              <w:rPr>
-                <w:rFonts w:hint="eastAsia"/>
-              </w:rPr>
             </w:pPr>
             <w:r>
               <w:rPr>
@@ -776,8 +707,6 @@
               </w:rPr>
               <w:t>SRAM</w:t>
             </w:r>
-            <w:bookmarkStart w:id="0" w:name="_GoBack"/>
-            <w:bookmarkEnd w:id="0"/>
           </w:p>
         </w:tc>
         <w:tc>
@@ -787,9 +716,6 @@
           <w:p>
             <w:pPr>
               <w:ind w:firstLine="0"/>
-              <w:rPr>
-                <w:rFonts w:hint="eastAsia"/>
-              </w:rPr>
             </w:pPr>
             <w:r>
               <w:rPr>
@@ -809,9 +735,6 @@
           <w:p>
             <w:pPr>
               <w:ind w:firstLine="0"/>
-              <w:rPr>
-                <w:rFonts w:hint="eastAsia"/>
-              </w:rPr>
             </w:pPr>
             <w:r>
               <w:rPr>
@@ -828,8 +751,3239 @@
     </w:tbl>
     <w:p>
       <w:pPr>
-        <w:ind w:firstLine="480"/>
-      </w:pPr>
+        <w:pStyle w:val="1"/>
+      </w:pPr>
+    </w:p>
+    <w:p>
+      <w:pPr>
+        <w:rPr>
+          <w:rFonts w:hint="eastAsia"/>
+        </w:rPr>
+      </w:pPr>
+      <w:r>
+        <w:rPr>
+          <w:rFonts w:hint="eastAsia"/>
+        </w:rPr>
+        <w:t>满足</w:t>
+      </w:r>
+      <w:r>
+        <w:rPr>
+          <w:rFonts w:hint="eastAsia"/>
+        </w:rPr>
+        <w:t>28nm</w:t>
+      </w:r>
+      <w:r>
+        <w:rPr>
+          <w:rFonts w:hint="eastAsia"/>
+        </w:rPr>
+        <w:t>下的</w:t>
+      </w:r>
+      <w:r>
+        <w:rPr>
+          <w:rFonts w:hint="eastAsia"/>
+        </w:rPr>
+        <w:t>1GHz</w:t>
+      </w:r>
+      <w:r>
+        <w:rPr>
+          <w:rFonts w:hint="eastAsia"/>
+        </w:rPr>
+        <w:t>，无建立时间违例</w:t>
+      </w:r>
+    </w:p>
+    <w:tbl>
+      <w:tblPr>
+        <w:tblStyle w:val="a5"/>
+        <w:tblW w:w="8500" w:type="dxa"/>
+        <w:tblLook w:val="04A0" w:firstRow="1" w:lastRow="0" w:firstColumn="1" w:lastColumn="0" w:noHBand="0" w:noVBand="1"/>
+      </w:tblPr>
+      <w:tblGrid>
+        <w:gridCol w:w="2630"/>
+        <w:gridCol w:w="2502"/>
+        <w:gridCol w:w="1660"/>
+        <w:gridCol w:w="1708"/>
+      </w:tblGrid>
+      <w:tr>
+        <w:tc>
+          <w:tcPr>
+            <w:tcW w:w="988" w:type="dxa"/>
+          </w:tcPr>
+          <w:p>
+            <w:pPr>
+              <w:ind w:firstLine="0"/>
+              <w:rPr>
+                <w:rFonts w:hint="eastAsia"/>
+              </w:rPr>
+            </w:pPr>
+            <w:r>
+              <w:rPr>
+                <w:rFonts w:hint="eastAsia"/>
+              </w:rPr>
+              <w:t>实验类型</w:t>
+            </w:r>
+          </w:p>
+        </w:tc>
+        <w:tc>
+          <w:tcPr>
+            <w:tcW w:w="3882" w:type="dxa"/>
+          </w:tcPr>
+          <w:p>
+            <w:pPr>
+              <w:ind w:firstLine="0"/>
+              <w:rPr>
+                <w:rFonts w:hint="eastAsia"/>
+              </w:rPr>
+            </w:pPr>
+            <w:r>
+              <w:rPr>
+                <w:rFonts w:hint="eastAsia"/>
+              </w:rPr>
+              <w:t>备注</w:t>
+            </w:r>
+          </w:p>
+        </w:tc>
+        <w:tc>
+          <w:tcPr>
+            <w:tcW w:w="1765" w:type="dxa"/>
+          </w:tcPr>
+          <w:p>
+            <w:pPr>
+              <w:ind w:firstLine="0"/>
+              <w:rPr>
+                <w:rFonts w:hint="eastAsia"/>
+              </w:rPr>
+            </w:pPr>
+            <w:proofErr w:type="spellStart"/>
+            <w:r>
+              <w:t>F</w:t>
+            </w:r>
+            <w:r>
+              <w:rPr>
+                <w:rFonts w:hint="eastAsia"/>
+              </w:rPr>
+              <w:t>etch+decode</w:t>
+            </w:r>
+            <w:proofErr w:type="spellEnd"/>
+            <w:r>
+              <w:rPr>
+                <w:rFonts w:hint="eastAsia"/>
+              </w:rPr>
+              <w:t>综合面积</w:t>
+            </w:r>
+            <w:r>
+              <w:rPr>
+                <w:rFonts w:hint="eastAsia"/>
+              </w:rPr>
+              <w:t>(um^2)</w:t>
+            </w:r>
+          </w:p>
+        </w:tc>
+        <w:tc>
+          <w:tcPr>
+            <w:tcW w:w="1865" w:type="dxa"/>
+          </w:tcPr>
+          <w:p>
+            <w:pPr>
+              <w:ind w:firstLine="0"/>
+              <w:rPr>
+                <w:rFonts w:hint="eastAsia"/>
+              </w:rPr>
+            </w:pPr>
+            <w:proofErr w:type="spellStart"/>
+            <w:r>
+              <w:t>F</w:t>
+            </w:r>
+            <w:r>
+              <w:rPr>
+                <w:rFonts w:hint="eastAsia"/>
+              </w:rPr>
+              <w:t>etch+decode</w:t>
+            </w:r>
+            <w:proofErr w:type="spellEnd"/>
+            <w:r>
+              <w:rPr>
+                <w:rFonts w:hint="eastAsia"/>
+              </w:rPr>
+              <w:t>综合功耗</w:t>
+            </w:r>
+            <w:r>
+              <w:rPr>
+                <w:rFonts w:hint="eastAsia"/>
+              </w:rPr>
+              <w:t>(</w:t>
+            </w:r>
+            <w:proofErr w:type="spellStart"/>
+            <w:r>
+              <w:rPr>
+                <w:rFonts w:hint="eastAsia"/>
+              </w:rPr>
+              <w:t>mW</w:t>
+            </w:r>
+            <w:proofErr w:type="spellEnd"/>
+            <w:r>
+              <w:rPr>
+                <w:rFonts w:hint="eastAsia"/>
+              </w:rPr>
+              <w:t>)</w:t>
+            </w:r>
+          </w:p>
+        </w:tc>
+      </w:tr>
+      <w:tr>
+        <w:tc>
+          <w:tcPr>
+            <w:tcW w:w="988" w:type="dxa"/>
+          </w:tcPr>
+          <w:p>
+            <w:pPr>
+              <w:ind w:firstLine="0"/>
+              <w:rPr>
+                <w:rFonts w:hint="eastAsia"/>
+              </w:rPr>
+            </w:pPr>
+            <w:r>
+              <w:rPr>
+                <w:rFonts w:hint="eastAsia"/>
+              </w:rPr>
+              <w:t>exp0_uncompressed_top</w:t>
+            </w:r>
+          </w:p>
+        </w:tc>
+        <w:tc>
+          <w:tcPr>
+            <w:tcW w:w="3882" w:type="dxa"/>
+          </w:tcPr>
+          <w:p>
+            <w:pPr>
+              <w:ind w:firstLine="0"/>
+              <w:rPr>
+                <w:rFonts w:hint="eastAsia"/>
+              </w:rPr>
+            </w:pPr>
+            <w:r>
+              <w:rPr>
+                <w:rFonts w:hint="eastAsia"/>
+              </w:rPr>
+              <w:t>未压缩，</w:t>
+            </w:r>
+            <w:r>
+              <w:rPr>
+                <w:rFonts w:hint="eastAsia"/>
+              </w:rPr>
+              <w:t>5 slot</w:t>
+            </w:r>
+            <w:r>
+              <w:rPr>
+                <w:rFonts w:hint="eastAsia"/>
+              </w:rPr>
+              <w:t>并发</w:t>
+            </w:r>
+          </w:p>
+        </w:tc>
+        <w:tc>
+          <w:tcPr>
+            <w:tcW w:w="1765" w:type="dxa"/>
+          </w:tcPr>
+          <w:p>
+            <w:pPr>
+              <w:ind w:firstLine="0"/>
+              <w:rPr>
+                <w:rFonts w:hint="eastAsia"/>
+              </w:rPr>
+            </w:pPr>
+            <w:r>
+              <w:rPr>
+                <w:rFonts w:hint="eastAsia"/>
+              </w:rPr>
+              <w:t>289077</w:t>
+            </w:r>
+          </w:p>
+        </w:tc>
+        <w:tc>
+          <w:tcPr>
+            <w:tcW w:w="1865" w:type="dxa"/>
+          </w:tcPr>
+          <w:p>
+            <w:pPr>
+              <w:ind w:firstLine="0"/>
+              <w:rPr>
+                <w:rFonts w:hint="eastAsia"/>
+              </w:rPr>
+            </w:pPr>
+            <w:r>
+              <w:rPr>
+                <w:rFonts w:hint="eastAsia"/>
+              </w:rPr>
+              <w:t>39.41</w:t>
+            </w:r>
+          </w:p>
+        </w:tc>
+      </w:tr>
+      <w:tr>
+        <w:tc>
+          <w:tcPr>
+            <w:tcW w:w="988" w:type="dxa"/>
+          </w:tcPr>
+          <w:p>
+            <w:pPr>
+              <w:ind w:firstLine="0"/>
+              <w:rPr>
+                <w:rFonts w:hint="eastAsia"/>
+              </w:rPr>
+            </w:pPr>
+            <w:r>
+              <w:rPr>
+                <w:rFonts w:hint="eastAsia"/>
+              </w:rPr>
+              <w:t>exp1_candidate_a_top</w:t>
+            </w:r>
+          </w:p>
+        </w:tc>
+        <w:tc>
+          <w:tcPr>
+            <w:tcW w:w="3882" w:type="dxa"/>
+          </w:tcPr>
+          <w:p>
+            <w:pPr>
+              <w:ind w:firstLine="0"/>
+              <w:rPr>
+                <w:rFonts w:hint="eastAsia"/>
+              </w:rPr>
+            </w:pPr>
+            <w:r>
+              <w:rPr>
+                <w:rFonts w:hint="eastAsia"/>
+              </w:rPr>
+              <w:t>纵向压缩</w:t>
+            </w:r>
+            <w:r>
+              <w:rPr>
+                <w:rFonts w:hint="eastAsia"/>
+              </w:rPr>
+              <w:t>baseline</w:t>
+            </w:r>
+            <w:r>
+              <w:rPr>
+                <w:rFonts w:hint="eastAsia"/>
+              </w:rPr>
+              <w:t>，</w:t>
+            </w:r>
+            <w:r>
+              <w:rPr>
+                <w:rFonts w:hint="eastAsia"/>
+              </w:rPr>
+              <w:t>5slot</w:t>
+            </w:r>
+            <w:r>
+              <w:rPr>
+                <w:rFonts w:hint="eastAsia"/>
+              </w:rPr>
+              <w:t>并发</w:t>
+            </w:r>
+          </w:p>
+        </w:tc>
+        <w:tc>
+          <w:tcPr>
+            <w:tcW w:w="1765" w:type="dxa"/>
+          </w:tcPr>
+          <w:p>
+            <w:pPr>
+              <w:ind w:firstLine="0"/>
+              <w:rPr>
+                <w:rFonts w:hint="eastAsia"/>
+              </w:rPr>
+            </w:pPr>
+            <w:r>
+              <w:rPr>
+                <w:rFonts w:hint="eastAsia"/>
+              </w:rPr>
+              <w:t>96268</w:t>
+            </w:r>
+          </w:p>
+        </w:tc>
+        <w:tc>
+          <w:tcPr>
+            <w:tcW w:w="1865" w:type="dxa"/>
+          </w:tcPr>
+          <w:p>
+            <w:pPr>
+              <w:ind w:firstLine="0"/>
+              <w:rPr>
+                <w:rFonts w:hint="eastAsia"/>
+              </w:rPr>
+            </w:pPr>
+            <w:r>
+              <w:rPr>
+                <w:rFonts w:hint="eastAsia"/>
+              </w:rPr>
+              <w:t>6.029</w:t>
+            </w:r>
+          </w:p>
+        </w:tc>
+      </w:tr>
+      <w:tr>
+        <w:tc>
+          <w:tcPr>
+            <w:tcW w:w="988" w:type="dxa"/>
+          </w:tcPr>
+          <w:p>
+            <w:pPr>
+              <w:ind w:firstLine="0"/>
+              <w:rPr>
+                <w:rFonts w:hint="eastAsia"/>
+              </w:rPr>
+            </w:pPr>
+            <w:r>
+              <w:rPr>
+                <w:rFonts w:hint="eastAsia"/>
+              </w:rPr>
+              <w:t>exp2_adaptive_4slot_top</w:t>
+            </w:r>
+          </w:p>
+        </w:tc>
+        <w:tc>
+          <w:tcPr>
+            <w:tcW w:w="3882" w:type="dxa"/>
+          </w:tcPr>
+          <w:p>
+            <w:pPr>
+              <w:ind w:firstLine="0"/>
+              <w:rPr>
+                <w:rFonts w:hint="eastAsia"/>
+              </w:rPr>
+            </w:pPr>
+            <w:r>
+              <w:rPr>
+                <w:rFonts w:hint="eastAsia"/>
+              </w:rPr>
+              <w:t>核心考虑方案，限制最多</w:t>
+            </w:r>
+            <w:r>
+              <w:rPr>
+                <w:rFonts w:hint="eastAsia"/>
+              </w:rPr>
+              <w:t>4slot</w:t>
+            </w:r>
+            <w:r>
+              <w:rPr>
+                <w:rFonts w:hint="eastAsia"/>
+              </w:rPr>
+              <w:t>并发</w:t>
+            </w:r>
+          </w:p>
+        </w:tc>
+        <w:tc>
+          <w:tcPr>
+            <w:tcW w:w="1765" w:type="dxa"/>
+          </w:tcPr>
+          <w:p>
+            <w:pPr>
+              <w:ind w:firstLine="0"/>
+              <w:rPr>
+                <w:rFonts w:hint="eastAsia"/>
+              </w:rPr>
+            </w:pPr>
+            <w:r>
+              <w:rPr>
+                <w:rFonts w:hint="eastAsia"/>
+              </w:rPr>
+              <w:t>80364</w:t>
+            </w:r>
+          </w:p>
+        </w:tc>
+        <w:tc>
+          <w:tcPr>
+            <w:tcW w:w="1865" w:type="dxa"/>
+          </w:tcPr>
+          <w:p>
+            <w:pPr>
+              <w:ind w:firstLine="0"/>
+              <w:rPr>
+                <w:rFonts w:hint="eastAsia"/>
+              </w:rPr>
+            </w:pPr>
+            <w:r>
+              <w:rPr>
+                <w:rFonts w:hint="eastAsia"/>
+              </w:rPr>
+              <w:t>5.44</w:t>
+            </w:r>
+          </w:p>
+        </w:tc>
+      </w:tr>
+      <w:tr>
+        <w:tc>
+          <w:tcPr>
+            <w:tcW w:w="988" w:type="dxa"/>
+          </w:tcPr>
+          <w:p>
+            <w:pPr>
+              <w:ind w:firstLine="0"/>
+              <w:rPr>
+                <w:rFonts w:hint="eastAsia"/>
+              </w:rPr>
+            </w:pPr>
+            <w:r>
+              <w:rPr>
+                <w:rFonts w:hint="eastAsia"/>
+              </w:rPr>
+              <w:t>exp3_2slot2lane_top</w:t>
+            </w:r>
+          </w:p>
+        </w:tc>
+        <w:tc>
+          <w:tcPr>
+            <w:tcW w:w="3882" w:type="dxa"/>
+          </w:tcPr>
+          <w:p>
+            <w:pPr>
+              <w:ind w:firstLine="0"/>
+              <w:rPr>
+                <w:rFonts w:hint="eastAsia"/>
+              </w:rPr>
+            </w:pPr>
+            <w:r>
+              <w:rPr>
+                <w:rFonts w:hint="eastAsia"/>
+              </w:rPr>
+              <w:t>限制最多</w:t>
+            </w:r>
+            <w:r>
+              <w:rPr>
+                <w:rFonts w:hint="eastAsia"/>
+              </w:rPr>
+              <w:t>2slot</w:t>
+            </w:r>
+            <w:r>
+              <w:rPr>
+                <w:rFonts w:hint="eastAsia"/>
+              </w:rPr>
+              <w:t>并发，通用性较差</w:t>
+            </w:r>
+          </w:p>
+        </w:tc>
+        <w:tc>
+          <w:tcPr>
+            <w:tcW w:w="1765" w:type="dxa"/>
+          </w:tcPr>
+          <w:p>
+            <w:pPr>
+              <w:ind w:firstLine="0"/>
+              <w:rPr>
+                <w:rFonts w:hint="eastAsia"/>
+              </w:rPr>
+            </w:pPr>
+            <w:r>
+              <w:rPr>
+                <w:rFonts w:hint="eastAsia"/>
+              </w:rPr>
+              <w:t>79668</w:t>
+            </w:r>
+          </w:p>
+        </w:tc>
+        <w:tc>
+          <w:tcPr>
+            <w:tcW w:w="1865" w:type="dxa"/>
+          </w:tcPr>
+          <w:p>
+            <w:pPr>
+              <w:ind w:firstLine="0"/>
+              <w:rPr>
+                <w:rFonts w:hint="eastAsia"/>
+              </w:rPr>
+            </w:pPr>
+            <w:r>
+              <w:rPr>
+                <w:rFonts w:hint="eastAsia"/>
+              </w:rPr>
+              <w:t>5.869</w:t>
+            </w:r>
+          </w:p>
+        </w:tc>
+      </w:tr>
+      <w:tr>
+        <w:tc>
+          <w:tcPr>
+            <w:tcW w:w="988" w:type="dxa"/>
+          </w:tcPr>
+          <w:p>
+            <w:pPr>
+              <w:ind w:firstLine="0"/>
+              <w:rPr>
+                <w:rFonts w:hint="eastAsia"/>
+              </w:rPr>
+            </w:pPr>
+            <w:r>
+              <w:rPr>
+                <w:rFonts w:hint="eastAsia"/>
+              </w:rPr>
+              <w:t>exp4_2slot4lane_top</w:t>
+            </w:r>
+          </w:p>
+        </w:tc>
+        <w:tc>
+          <w:tcPr>
+            <w:tcW w:w="3882" w:type="dxa"/>
+          </w:tcPr>
+          <w:p>
+            <w:pPr>
+              <w:ind w:firstLine="0"/>
+              <w:rPr>
+                <w:rFonts w:hint="eastAsia"/>
+              </w:rPr>
+            </w:pPr>
+            <w:r>
+              <w:rPr>
+                <w:rFonts w:hint="eastAsia"/>
+              </w:rPr>
+              <w:t>限制最多</w:t>
+            </w:r>
+            <w:r>
+              <w:rPr>
+                <w:rFonts w:hint="eastAsia"/>
+              </w:rPr>
+              <w:t>2slot</w:t>
+            </w:r>
+            <w:r>
+              <w:rPr>
+                <w:rFonts w:hint="eastAsia"/>
+              </w:rPr>
+              <w:t>并发，通用性较差</w:t>
+            </w:r>
+          </w:p>
+        </w:tc>
+        <w:tc>
+          <w:tcPr>
+            <w:tcW w:w="1765" w:type="dxa"/>
+          </w:tcPr>
+          <w:p>
+            <w:pPr>
+              <w:ind w:firstLine="0"/>
+              <w:rPr>
+                <w:rFonts w:hint="eastAsia"/>
+              </w:rPr>
+            </w:pPr>
+            <w:r>
+              <w:rPr>
+                <w:rFonts w:hint="eastAsia"/>
+              </w:rPr>
+              <w:t>81820</w:t>
+            </w:r>
+          </w:p>
+        </w:tc>
+        <w:tc>
+          <w:tcPr>
+            <w:tcW w:w="1865" w:type="dxa"/>
+          </w:tcPr>
+          <w:p>
+            <w:pPr>
+              <w:ind w:firstLine="0"/>
+            </w:pPr>
+            <w:r>
+              <w:rPr>
+                <w:rFonts w:hint="eastAsia"/>
+              </w:rPr>
+              <w:t>5.160</w:t>
+            </w:r>
+          </w:p>
+        </w:tc>
+      </w:tr>
+    </w:tbl>
+    <w:p>
+      <w:r>
+        <w:rPr>
+          <w:rFonts w:hint="eastAsia"/>
+        </w:rPr>
+        <w:t>担心：目前版本太简单了。是否可以做一个调度</w:t>
+      </w:r>
+      <w:r>
+        <w:rPr>
+          <w:rFonts w:hint="eastAsia"/>
+        </w:rPr>
+        <w:t>+</w:t>
+      </w:r>
+      <w:r>
+        <w:rPr>
+          <w:rFonts w:hint="eastAsia"/>
+        </w:rPr>
+        <w:t>压缩的联合优化？</w:t>
+      </w:r>
+    </w:p>
+    <w:p/>
+    <w:p/>
+    <w:p>
+      <w:r>
+        <w:rPr>
+          <w:rFonts w:hint="eastAsia"/>
+        </w:rPr>
+        <w:t>具体的</w:t>
+      </w:r>
+      <w:r>
+        <w:rPr>
+          <w:rFonts w:hint="eastAsia"/>
+        </w:rPr>
+        <w:t>exp2</w:t>
+      </w:r>
+      <w:r>
+        <w:rPr>
+          <w:rFonts w:hint="eastAsia"/>
+        </w:rPr>
+        <w:t>硬件顶层设计</w:t>
+      </w:r>
+    </w:p>
+    <w:p>
+      <w:r>
+        <w:t>S</w:t>
+      </w:r>
+      <w:r>
+        <w:rPr>
+          <w:rFonts w:hint="eastAsia"/>
+        </w:rPr>
+        <w:t>tage A</w:t>
+      </w:r>
+      <w:r>
+        <w:rPr>
+          <w:rFonts w:hint="eastAsia"/>
+        </w:rPr>
+        <w:t>：</w:t>
+      </w:r>
+    </w:p>
+    <w:p>
+      <w:pPr>
+        <w:rPr>
+          <w:b/>
+          <w:bCs/>
+        </w:rPr>
+      </w:pPr>
+      <w:r>
+        <w:rPr>
+          <w:b/>
+          <w:bCs/>
+        </w:rPr>
+        <w:t>各寄存器含义</w:t>
+      </w:r>
+    </w:p>
+    <w:tbl>
+      <w:tblPr>
+        <w:tblW w:w="0" w:type="auto"/>
+        <w:tblCellSpacing w:w="15" w:type="dxa"/>
+        <w:tblCellMar>
+          <w:top w:w="15" w:type="dxa"/>
+          <w:left w:w="15" w:type="dxa"/>
+          <w:bottom w:w="15" w:type="dxa"/>
+          <w:right w:w="15" w:type="dxa"/>
+        </w:tblCellMar>
+        <w:tblLook w:val="04A0" w:firstRow="1" w:lastRow="0" w:firstColumn="1" w:lastColumn="0" w:noHBand="0" w:noVBand="1"/>
+      </w:tblPr>
+      <w:tblGrid>
+        <w:gridCol w:w="1477"/>
+        <w:gridCol w:w="1217"/>
+        <w:gridCol w:w="5612"/>
+      </w:tblGrid>
+      <w:tr>
+        <w:trPr>
+          <w:tblHeader/>
+          <w:tblCellSpacing w:w="15" w:type="dxa"/>
+        </w:trPr>
+        <w:tc>
+          <w:tcPr>
+            <w:tcW w:w="0" w:type="auto"/>
+            <w:noWrap/>
+            <w:tcMar>
+              <w:top w:w="90" w:type="dxa"/>
+              <w:left w:w="150" w:type="dxa"/>
+              <w:bottom w:w="90" w:type="dxa"/>
+              <w:right w:w="150" w:type="dxa"/>
+            </w:tcMar>
+            <w:hideMark/>
+          </w:tcPr>
+          <w:p>
+            <w:pPr>
+              <w:rPr>
+                <w:b/>
+                <w:bCs/>
+              </w:rPr>
+            </w:pPr>
+            <w:r>
+              <w:rPr>
+                <w:b/>
+                <w:bCs/>
+              </w:rPr>
+              <w:lastRenderedPageBreak/>
+              <w:t>寄存器</w:t>
+            </w:r>
+          </w:p>
+        </w:tc>
+        <w:tc>
+          <w:tcPr>
+            <w:tcW w:w="0" w:type="auto"/>
+            <w:noWrap/>
+            <w:tcMar>
+              <w:top w:w="90" w:type="dxa"/>
+              <w:left w:w="150" w:type="dxa"/>
+              <w:bottom w:w="90" w:type="dxa"/>
+              <w:right w:w="150" w:type="dxa"/>
+            </w:tcMar>
+            <w:hideMark/>
+          </w:tcPr>
+          <w:p>
+            <w:pPr>
+              <w:rPr>
+                <w:b/>
+                <w:bCs/>
+              </w:rPr>
+            </w:pPr>
+            <w:r>
+              <w:rPr>
+                <w:b/>
+                <w:bCs/>
+              </w:rPr>
+              <w:t>位宽</w:t>
+            </w:r>
+          </w:p>
+        </w:tc>
+        <w:tc>
+          <w:tcPr>
+            <w:tcW w:w="0" w:type="auto"/>
+            <w:noWrap/>
+            <w:tcMar>
+              <w:top w:w="90" w:type="dxa"/>
+              <w:left w:w="150" w:type="dxa"/>
+              <w:bottom w:w="90" w:type="dxa"/>
+              <w:right w:w="150" w:type="dxa"/>
+            </w:tcMar>
+            <w:hideMark/>
+          </w:tcPr>
+          <w:p>
+            <w:pPr>
+              <w:rPr>
+                <w:b/>
+                <w:bCs/>
+              </w:rPr>
+            </w:pPr>
+            <w:r>
+              <w:rPr>
+                <w:b/>
+                <w:bCs/>
+              </w:rPr>
+              <w:t>作用</w:t>
+            </w:r>
+          </w:p>
+        </w:tc>
+      </w:tr>
+      <w:tr>
+        <w:trPr>
+          <w:tblCellSpacing w:w="15" w:type="dxa"/>
+        </w:trPr>
+        <w:tc>
+          <w:tcPr>
+            <w:tcW w:w="0" w:type="auto"/>
+            <w:tcMar>
+              <w:top w:w="90" w:type="dxa"/>
+              <w:left w:w="150" w:type="dxa"/>
+              <w:bottom w:w="90" w:type="dxa"/>
+              <w:right w:w="150" w:type="dxa"/>
+            </w:tcMar>
+            <w:hideMark/>
+          </w:tcPr>
+          <w:p>
+            <w:proofErr w:type="spellStart"/>
+            <w:r>
+              <w:t>run_q</w:t>
+            </w:r>
+            <w:proofErr w:type="spellEnd"/>
+          </w:p>
+        </w:tc>
+        <w:tc>
+          <w:tcPr>
+            <w:tcW w:w="0" w:type="auto"/>
+            <w:tcMar>
+              <w:top w:w="90" w:type="dxa"/>
+              <w:left w:w="150" w:type="dxa"/>
+              <w:bottom w:w="90" w:type="dxa"/>
+              <w:right w:w="150" w:type="dxa"/>
+            </w:tcMar>
+            <w:hideMark/>
+          </w:tcPr>
+          <w:p>
+            <w:r>
+              <w:t>1</w:t>
+            </w:r>
+          </w:p>
+        </w:tc>
+        <w:tc>
+          <w:tcPr>
+            <w:tcW w:w="0" w:type="auto"/>
+            <w:tcMar>
+              <w:top w:w="90" w:type="dxa"/>
+              <w:left w:w="150" w:type="dxa"/>
+              <w:bottom w:w="90" w:type="dxa"/>
+              <w:right w:w="150" w:type="dxa"/>
+            </w:tcMar>
+            <w:hideMark/>
+          </w:tcPr>
+          <w:p>
+            <w:r>
+              <w:t>正在取指</w:t>
+            </w:r>
+          </w:p>
+        </w:tc>
+      </w:tr>
+      <w:tr>
+        <w:trPr>
+          <w:tblCellSpacing w:w="15" w:type="dxa"/>
+        </w:trPr>
+        <w:tc>
+          <w:tcPr>
+            <w:tcW w:w="0" w:type="auto"/>
+            <w:tcMar>
+              <w:top w:w="90" w:type="dxa"/>
+              <w:left w:w="150" w:type="dxa"/>
+              <w:bottom w:w="90" w:type="dxa"/>
+              <w:right w:w="150" w:type="dxa"/>
+            </w:tcMar>
+            <w:hideMark/>
+          </w:tcPr>
+          <w:p>
+            <w:proofErr w:type="spellStart"/>
+            <w:r>
+              <w:t>cfg_pc</w:t>
+            </w:r>
+            <w:proofErr w:type="spellEnd"/>
+          </w:p>
+        </w:tc>
+        <w:tc>
+          <w:tcPr>
+            <w:tcW w:w="0" w:type="auto"/>
+            <w:tcMar>
+              <w:top w:w="90" w:type="dxa"/>
+              <w:left w:w="150" w:type="dxa"/>
+              <w:bottom w:w="90" w:type="dxa"/>
+              <w:right w:w="150" w:type="dxa"/>
+            </w:tcMar>
+            <w:hideMark/>
+          </w:tcPr>
+          <w:p>
+            <w:r>
+              <w:t>14</w:t>
+            </w:r>
+          </w:p>
+        </w:tc>
+        <w:tc>
+          <w:tcPr>
+            <w:tcW w:w="0" w:type="auto"/>
+            <w:tcMar>
+              <w:top w:w="90" w:type="dxa"/>
+              <w:left w:w="150" w:type="dxa"/>
+              <w:bottom w:w="90" w:type="dxa"/>
+              <w:right w:w="150" w:type="dxa"/>
+            </w:tcMar>
+            <w:hideMark/>
+          </w:tcPr>
+          <w:p>
+            <w:r>
+              <w:t xml:space="preserve">config </w:t>
+            </w:r>
+            <w:r>
+              <w:t>宏的绝对地址（池基址</w:t>
+            </w:r>
+            <w:r>
+              <w:t xml:space="preserve"> + </w:t>
+            </w:r>
+            <w:r>
+              <w:t>偏移）</w:t>
+            </w:r>
+          </w:p>
+        </w:tc>
+      </w:tr>
+      <w:tr>
+        <w:trPr>
+          <w:tblCellSpacing w:w="15" w:type="dxa"/>
+        </w:trPr>
+        <w:tc>
+          <w:tcPr>
+            <w:tcW w:w="0" w:type="auto"/>
+            <w:tcMar>
+              <w:top w:w="90" w:type="dxa"/>
+              <w:left w:w="150" w:type="dxa"/>
+              <w:bottom w:w="90" w:type="dxa"/>
+              <w:right w:w="150" w:type="dxa"/>
+            </w:tcMar>
+            <w:hideMark/>
+          </w:tcPr>
+          <w:p>
+            <w:proofErr w:type="spellStart"/>
+            <w:r>
+              <w:t>cfg_cnt</w:t>
+            </w:r>
+            <w:proofErr w:type="spellEnd"/>
+          </w:p>
+        </w:tc>
+        <w:tc>
+          <w:tcPr>
+            <w:tcW w:w="0" w:type="auto"/>
+            <w:tcMar>
+              <w:top w:w="90" w:type="dxa"/>
+              <w:left w:w="150" w:type="dxa"/>
+              <w:bottom w:w="90" w:type="dxa"/>
+              <w:right w:w="150" w:type="dxa"/>
+            </w:tcMar>
+            <w:hideMark/>
+          </w:tcPr>
+          <w:p>
+            <w:r>
+              <w:t>14</w:t>
+            </w:r>
+          </w:p>
+        </w:tc>
+        <w:tc>
+          <w:tcPr>
+            <w:tcW w:w="0" w:type="auto"/>
+            <w:tcMar>
+              <w:top w:w="90" w:type="dxa"/>
+              <w:left w:w="150" w:type="dxa"/>
+              <w:bottom w:w="90" w:type="dxa"/>
+              <w:right w:w="150" w:type="dxa"/>
+            </w:tcMar>
+            <w:hideMark/>
+          </w:tcPr>
+          <w:p>
+            <w:r>
+              <w:t>已发射的</w:t>
+            </w:r>
+            <w:r>
+              <w:t xml:space="preserve"> config </w:t>
+            </w:r>
+            <w:r>
+              <w:t>读计数（</w:t>
+            </w:r>
+            <w:r>
+              <w:t>0..T</w:t>
+            </w:r>
+            <w:r>
+              <w:t>）</w:t>
+            </w:r>
+          </w:p>
+        </w:tc>
+      </w:tr>
+      <w:tr>
+        <w:trPr>
+          <w:tblCellSpacing w:w="15" w:type="dxa"/>
+        </w:trPr>
+        <w:tc>
+          <w:tcPr>
+            <w:tcW w:w="0" w:type="auto"/>
+            <w:tcMar>
+              <w:top w:w="90" w:type="dxa"/>
+              <w:left w:w="150" w:type="dxa"/>
+              <w:bottom w:w="90" w:type="dxa"/>
+              <w:right w:w="150" w:type="dxa"/>
+            </w:tcMar>
+            <w:hideMark/>
+          </w:tcPr>
+          <w:p>
+            <w:proofErr w:type="spellStart"/>
+            <w:r>
+              <w:t>len_q</w:t>
+            </w:r>
+            <w:proofErr w:type="spellEnd"/>
+          </w:p>
+        </w:tc>
+        <w:tc>
+          <w:tcPr>
+            <w:tcW w:w="0" w:type="auto"/>
+            <w:tcMar>
+              <w:top w:w="90" w:type="dxa"/>
+              <w:left w:w="150" w:type="dxa"/>
+              <w:bottom w:w="90" w:type="dxa"/>
+              <w:right w:w="150" w:type="dxa"/>
+            </w:tcMar>
+            <w:hideMark/>
+          </w:tcPr>
+          <w:p>
+            <w:r>
+              <w:t>14</w:t>
+            </w:r>
+          </w:p>
+        </w:tc>
+        <w:tc>
+          <w:tcPr>
+            <w:tcW w:w="0" w:type="auto"/>
+            <w:tcMar>
+              <w:top w:w="90" w:type="dxa"/>
+              <w:left w:w="150" w:type="dxa"/>
+              <w:bottom w:w="90" w:type="dxa"/>
+              <w:right w:w="150" w:type="dxa"/>
+            </w:tcMar>
+            <w:hideMark/>
+          </w:tcPr>
+          <w:p>
+            <w:r>
+              <w:t xml:space="preserve">start </w:t>
+            </w:r>
+            <w:r>
+              <w:t>时锁存的程序长度</w:t>
+            </w:r>
+            <w:r>
+              <w:t xml:space="preserve"> T</w:t>
+            </w:r>
+          </w:p>
+        </w:tc>
+      </w:tr>
+      <w:tr>
+        <w:trPr>
+          <w:tblCellSpacing w:w="15" w:type="dxa"/>
+        </w:trPr>
+        <w:tc>
+          <w:tcPr>
+            <w:tcW w:w="0" w:type="auto"/>
+            <w:tcMar>
+              <w:top w:w="90" w:type="dxa"/>
+              <w:left w:w="150" w:type="dxa"/>
+              <w:bottom w:w="90" w:type="dxa"/>
+              <w:right w:w="150" w:type="dxa"/>
+            </w:tcMar>
+            <w:hideMark/>
+          </w:tcPr>
+          <w:p>
+            <w:proofErr w:type="spellStart"/>
+            <w:r>
+              <w:t>b_vld</w:t>
+            </w:r>
+            <w:proofErr w:type="spellEnd"/>
+          </w:p>
+        </w:tc>
+        <w:tc>
+          <w:tcPr>
+            <w:tcW w:w="0" w:type="auto"/>
+            <w:tcMar>
+              <w:top w:w="90" w:type="dxa"/>
+              <w:left w:w="150" w:type="dxa"/>
+              <w:bottom w:w="90" w:type="dxa"/>
+              <w:right w:w="150" w:type="dxa"/>
+            </w:tcMar>
+            <w:hideMark/>
+          </w:tcPr>
+          <w:p>
+            <w:r>
+              <w:t>1</w:t>
+            </w:r>
+          </w:p>
+        </w:tc>
+        <w:tc>
+          <w:tcPr>
+            <w:tcW w:w="0" w:type="auto"/>
+            <w:tcMar>
+              <w:top w:w="90" w:type="dxa"/>
+              <w:left w:w="150" w:type="dxa"/>
+              <w:bottom w:w="90" w:type="dxa"/>
+              <w:right w:w="150" w:type="dxa"/>
+            </w:tcMar>
+            <w:hideMark/>
+          </w:tcPr>
+          <w:p>
+            <w:r>
+              <w:t>「本拍发射了一次</w:t>
+            </w:r>
+            <w:r>
+              <w:t xml:space="preserve"> config </w:t>
+            </w:r>
+            <w:r>
+              <w:t>读」</w:t>
+            </w:r>
+            <w:r>
+              <w:t xml:space="preserve">→ </w:t>
+            </w:r>
+            <w:r>
+              <w:t>送拍</w:t>
+            </w:r>
+            <w:r>
+              <w:t xml:space="preserve"> B </w:t>
+            </w:r>
+            <w:r>
+              <w:t>的有效位</w:t>
+            </w:r>
+          </w:p>
+        </w:tc>
+      </w:tr>
+    </w:tbl>
+    <w:p>
+      <w:r>
+        <w:t>S</w:t>
+      </w:r>
+      <w:r>
+        <w:rPr>
+          <w:rFonts w:hint="eastAsia"/>
+        </w:rPr>
+        <w:t>tage B</w:t>
+      </w:r>
+      <w:r>
+        <w:rPr>
+          <w:rFonts w:hint="eastAsia"/>
+        </w:rPr>
+        <w:t>：</w:t>
+      </w:r>
+    </w:p>
+    <w:p>
+      <w:pPr>
+        <w:rPr>
+          <w:rFonts w:hint="eastAsia"/>
+        </w:rPr>
+      </w:pPr>
+      <w:r>
+        <w:t>拍</w:t>
+      </w:r>
+      <w:r>
+        <w:t xml:space="preserve"> B </w:t>
+      </w:r>
+      <w:r>
+        <w:t>收到的是</w:t>
+      </w:r>
+      <w:r>
+        <w:t xml:space="preserve"> config </w:t>
+      </w:r>
+      <w:r>
+        <w:t>宏刚读出的</w:t>
+      </w:r>
+      <w:r>
+        <w:t xml:space="preserve"> 5-bit mask</w:t>
+      </w:r>
+      <w:r>
+        <w:t>（本拍哪几个槽有事件）。它要</w:t>
+      </w:r>
+      <w:r>
+        <w:rPr>
+          <w:rStyle w:val="font-semibold"/>
+        </w:rPr>
+        <w:t>在同一拍内</w:t>
+      </w:r>
+      <w:r>
+        <w:t>算出：</w:t>
+      </w:r>
+      <w:r>
+        <w:t xml:space="preserve">4 </w:t>
+      </w:r>
+      <w:r>
+        <w:t>条</w:t>
+      </w:r>
+      <w:r>
+        <w:t xml:space="preserve"> Lane </w:t>
+      </w:r>
+      <w:r>
+        <w:t>哪几条该读（使能）、读哪个地址（指针），并在拍末更新一组状态。这是全设计的关键路径。</w:t>
+      </w:r>
+    </w:p>
+    <w:p>
+      <w:r>
+        <w:t>把</w:t>
+      </w:r>
+      <w:r>
+        <w:t xml:space="preserve"> 4 </w:t>
+      </w:r>
+      <w:r>
+        <w:t>条</w:t>
+      </w:r>
+      <w:r>
+        <w:t xml:space="preserve"> Lane </w:t>
+      </w:r>
+      <w:r>
+        <w:t>想象成一个环：</w:t>
+      </w:r>
+      <w:r>
+        <w:t>lane0 → lane1 → lane2 → lane3 →</w:t>
+      </w:r>
+      <w:r>
+        <w:t>（绕回）</w:t>
+      </w:r>
+      <w:r>
+        <w:t>lane0</w:t>
+      </w:r>
+      <w:r>
+        <w:t>。</w:t>
+      </w:r>
+    </w:p>
+    <w:p>
+      <w:r>
+        <w:t>phase </w:t>
+      </w:r>
+      <w:r>
+        <w:t>是环上的「本次起始位置」。每拍做两件事：</w:t>
+      </w:r>
+    </w:p>
+    <w:p>
+      <w:pPr>
+        <w:numPr>
+          <w:ilvl w:val="0"/>
+          <w:numId w:val="4"/>
+        </w:numPr>
+      </w:pPr>
+      <w:r>
+        <w:t>把本拍的有效槽按</w:t>
+      </w:r>
+      <w:r>
+        <w:t xml:space="preserve"> LOAD→STORE→VECTOR→SCALAR→SFU </w:t>
+      </w:r>
+      <w:r>
+        <w:t>的顺序，从</w:t>
+      </w:r>
+      <w:r>
+        <w:t xml:space="preserve"> phase </w:t>
+      </w:r>
+      <w:r>
+        <w:t>那条</w:t>
+      </w:r>
+      <w:r>
+        <w:t xml:space="preserve"> Lane </w:t>
+      </w:r>
+      <w:r>
+        <w:t>开始，沿环一条接一条放上去；</w:t>
+      </w:r>
+    </w:p>
+    <w:p>
+      <w:pPr>
+        <w:numPr>
+          <w:ilvl w:val="0"/>
+          <w:numId w:val="4"/>
+        </w:numPr>
+      </w:pPr>
+      <w:r>
+        <w:t>放了几个，</w:t>
+      </w:r>
+      <w:r>
+        <w:t xml:space="preserve">phase </w:t>
+      </w:r>
+      <w:r>
+        <w:t>就往前走几步（</w:t>
+      </w:r>
+      <w:r>
+        <w:t xml:space="preserve">mod 4 </w:t>
+      </w:r>
+      <w:r>
+        <w:t>回绕）。</w:t>
+      </w:r>
+    </w:p>
+    <w:p>
+      <w:r>
+        <w:t>一个</w:t>
+      </w:r>
+      <w:r>
+        <w:t xml:space="preserve"> 3 </w:t>
+      </w:r>
+      <w:r>
+        <w:t>拍的例子：</w:t>
+      </w:r>
+    </w:p>
+    <w:tbl>
+      <w:tblPr>
+        <w:tblW w:w="0" w:type="auto"/>
+        <w:tblCellSpacing w:w="15" w:type="dxa"/>
+        <w:tblCellMar>
+          <w:top w:w="15" w:type="dxa"/>
+          <w:left w:w="15" w:type="dxa"/>
+          <w:bottom w:w="15" w:type="dxa"/>
+          <w:right w:w="15" w:type="dxa"/>
+        </w:tblCellMar>
+        <w:tblLook w:val="04A0" w:firstRow="1" w:lastRow="0" w:firstColumn="1" w:lastColumn="0" w:noHBand="0" w:noVBand="1"/>
+      </w:tblPr>
+      <w:tblGrid>
+        <w:gridCol w:w="874"/>
+        <w:gridCol w:w="1142"/>
+        <w:gridCol w:w="1668"/>
+        <w:gridCol w:w="2960"/>
+        <w:gridCol w:w="1662"/>
+      </w:tblGrid>
+      <w:tr>
+        <w:trPr>
+          <w:tblHeader/>
+          <w:tblCellSpacing w:w="15" w:type="dxa"/>
+        </w:trPr>
+        <w:tc>
+          <w:tcPr>
+            <w:tcW w:w="0" w:type="auto"/>
+            <w:noWrap/>
+            <w:tcMar>
+              <w:top w:w="90" w:type="dxa"/>
+              <w:left w:w="150" w:type="dxa"/>
+              <w:bottom w:w="90" w:type="dxa"/>
+              <w:right w:w="150" w:type="dxa"/>
+            </w:tcMar>
+            <w:hideMark/>
+          </w:tcPr>
+          <w:p>
+            <w:pPr>
+              <w:rPr>
+                <w:b/>
+                <w:bCs/>
+              </w:rPr>
+            </w:pPr>
+            <w:r>
+              <w:rPr>
+                <w:b/>
+                <w:bCs/>
+              </w:rPr>
+              <w:t>拍</w:t>
+            </w:r>
+          </w:p>
+        </w:tc>
+        <w:tc>
+          <w:tcPr>
+            <w:tcW w:w="0" w:type="auto"/>
+            <w:noWrap/>
+            <w:tcMar>
+              <w:top w:w="90" w:type="dxa"/>
+              <w:left w:w="150" w:type="dxa"/>
+              <w:bottom w:w="90" w:type="dxa"/>
+              <w:right w:w="150" w:type="dxa"/>
+            </w:tcMar>
+            <w:hideMark/>
+          </w:tcPr>
+          <w:p>
+            <w:pPr>
+              <w:rPr>
+                <w:b/>
+                <w:bCs/>
+              </w:rPr>
+            </w:pPr>
+            <w:r>
+              <w:rPr>
+                <w:b/>
+                <w:bCs/>
+              </w:rPr>
+              <w:t>phase</w:t>
+            </w:r>
+          </w:p>
+        </w:tc>
+        <w:tc>
+          <w:tcPr>
+            <w:tcW w:w="0" w:type="auto"/>
+            <w:noWrap/>
+            <w:tcMar>
+              <w:top w:w="90" w:type="dxa"/>
+              <w:left w:w="150" w:type="dxa"/>
+              <w:bottom w:w="90" w:type="dxa"/>
+              <w:right w:w="150" w:type="dxa"/>
+            </w:tcMar>
+            <w:hideMark/>
+          </w:tcPr>
+          <w:p>
+            <w:pPr>
+              <w:rPr>
+                <w:b/>
+                <w:bCs/>
+              </w:rPr>
+            </w:pPr>
+            <w:r>
+              <w:rPr>
+                <w:b/>
+                <w:bCs/>
+              </w:rPr>
+              <w:t>本拍有效槽</w:t>
+            </w:r>
+          </w:p>
+        </w:tc>
+        <w:tc>
+          <w:tcPr>
+            <w:tcW w:w="0" w:type="auto"/>
+            <w:noWrap/>
+            <w:tcMar>
+              <w:top w:w="90" w:type="dxa"/>
+              <w:left w:w="150" w:type="dxa"/>
+              <w:bottom w:w="90" w:type="dxa"/>
+              <w:right w:w="150" w:type="dxa"/>
+            </w:tcMar>
+            <w:hideMark/>
+          </w:tcPr>
+          <w:p>
+            <w:pPr>
+              <w:rPr>
+                <w:b/>
+                <w:bCs/>
+              </w:rPr>
+            </w:pPr>
+            <w:r>
+              <w:rPr>
+                <w:b/>
+                <w:bCs/>
+              </w:rPr>
+              <w:t>摆放（从</w:t>
+            </w:r>
+            <w:r>
+              <w:rPr>
+                <w:b/>
+                <w:bCs/>
+              </w:rPr>
+              <w:t xml:space="preserve"> phase </w:t>
+            </w:r>
+            <w:r>
+              <w:rPr>
+                <w:b/>
+                <w:bCs/>
+              </w:rPr>
+              <w:t>沿环放）</w:t>
+            </w:r>
+          </w:p>
+        </w:tc>
+        <w:tc>
+          <w:tcPr>
+            <w:tcW w:w="0" w:type="auto"/>
+            <w:noWrap/>
+            <w:tcMar>
+              <w:top w:w="90" w:type="dxa"/>
+              <w:left w:w="150" w:type="dxa"/>
+              <w:bottom w:w="90" w:type="dxa"/>
+              <w:right w:w="150" w:type="dxa"/>
+            </w:tcMar>
+            <w:hideMark/>
+          </w:tcPr>
+          <w:p>
+            <w:pPr>
+              <w:rPr>
+                <w:b/>
+                <w:bCs/>
+              </w:rPr>
+            </w:pPr>
+            <w:r>
+              <w:rPr>
+                <w:b/>
+                <w:bCs/>
+              </w:rPr>
+              <w:t>拍末</w:t>
+            </w:r>
+            <w:r>
+              <w:rPr>
+                <w:b/>
+                <w:bCs/>
+              </w:rPr>
+              <w:t xml:space="preserve"> phase</w:t>
+            </w:r>
+          </w:p>
+        </w:tc>
+      </w:tr>
+      <w:tr>
+        <w:trPr>
+          <w:tblCellSpacing w:w="15" w:type="dxa"/>
+        </w:trPr>
+        <w:tc>
+          <w:tcPr>
+            <w:tcW w:w="0" w:type="auto"/>
+            <w:tcMar>
+              <w:top w:w="90" w:type="dxa"/>
+              <w:left w:w="150" w:type="dxa"/>
+              <w:bottom w:w="90" w:type="dxa"/>
+              <w:right w:w="150" w:type="dxa"/>
+            </w:tcMar>
+            <w:hideMark/>
+          </w:tcPr>
+          <w:p>
+            <w:r>
+              <w:t>0</w:t>
+            </w:r>
+          </w:p>
+        </w:tc>
+        <w:tc>
+          <w:tcPr>
+            <w:tcW w:w="0" w:type="auto"/>
+            <w:tcMar>
+              <w:top w:w="90" w:type="dxa"/>
+              <w:left w:w="150" w:type="dxa"/>
+              <w:bottom w:w="90" w:type="dxa"/>
+              <w:right w:w="150" w:type="dxa"/>
+            </w:tcMar>
+            <w:hideMark/>
+          </w:tcPr>
+          <w:p>
+            <w:r>
+              <w:t>0</w:t>
+            </w:r>
+          </w:p>
+        </w:tc>
+        <w:tc>
+          <w:tcPr>
+            <w:tcW w:w="0" w:type="auto"/>
+            <w:tcMar>
+              <w:top w:w="90" w:type="dxa"/>
+              <w:left w:w="150" w:type="dxa"/>
+              <w:bottom w:w="90" w:type="dxa"/>
+              <w:right w:w="150" w:type="dxa"/>
+            </w:tcMar>
+            <w:hideMark/>
+          </w:tcPr>
+          <w:p>
+            <w:r>
+              <w:t>LOAD, VECTOR</w:t>
+            </w:r>
+            <w:r>
+              <w:t>（</w:t>
+            </w:r>
+            <w:r>
+              <w:t xml:space="preserve">2 </w:t>
+            </w:r>
+            <w:r>
+              <w:t>个）</w:t>
+            </w:r>
+          </w:p>
+        </w:tc>
+        <w:tc>
+          <w:tcPr>
+            <w:tcW w:w="0" w:type="auto"/>
+            <w:tcMar>
+              <w:top w:w="90" w:type="dxa"/>
+              <w:left w:w="150" w:type="dxa"/>
+              <w:bottom w:w="90" w:type="dxa"/>
+              <w:right w:w="150" w:type="dxa"/>
+            </w:tcMar>
+            <w:hideMark/>
+          </w:tcPr>
+          <w:p>
+            <w:r>
+              <w:t>lane0←LOAD</w:t>
+            </w:r>
+            <w:r>
+              <w:t>，</w:t>
+            </w:r>
+            <w:r>
+              <w:t>lane1←VECTOR</w:t>
+            </w:r>
+          </w:p>
+        </w:tc>
+        <w:tc>
+          <w:tcPr>
+            <w:tcW w:w="0" w:type="auto"/>
+            <w:tcMar>
+              <w:top w:w="90" w:type="dxa"/>
+              <w:left w:w="150" w:type="dxa"/>
+              <w:bottom w:w="90" w:type="dxa"/>
+              <w:right w:w="150" w:type="dxa"/>
+            </w:tcMar>
+            <w:hideMark/>
+          </w:tcPr>
+          <w:p>
+            <w:r>
+              <w:t xml:space="preserve">0+2=2… </w:t>
+            </w:r>
+            <w:r>
+              <w:t>等等，是</w:t>
+            </w:r>
+            <w:r>
+              <w:t xml:space="preserve"> 2</w:t>
+            </w:r>
+          </w:p>
+        </w:tc>
+      </w:tr>
+      <w:tr>
+        <w:trPr>
+          <w:tblCellSpacing w:w="15" w:type="dxa"/>
+        </w:trPr>
+        <w:tc>
+          <w:tcPr>
+            <w:tcW w:w="0" w:type="auto"/>
+            <w:tcMar>
+              <w:top w:w="90" w:type="dxa"/>
+              <w:left w:w="150" w:type="dxa"/>
+              <w:bottom w:w="90" w:type="dxa"/>
+              <w:right w:w="150" w:type="dxa"/>
+            </w:tcMar>
+            <w:hideMark/>
+          </w:tcPr>
+          <w:p>
+            <w:r>
+              <w:t>1</w:t>
+            </w:r>
+          </w:p>
+        </w:tc>
+        <w:tc>
+          <w:tcPr>
+            <w:tcW w:w="0" w:type="auto"/>
+            <w:tcMar>
+              <w:top w:w="90" w:type="dxa"/>
+              <w:left w:w="150" w:type="dxa"/>
+              <w:bottom w:w="90" w:type="dxa"/>
+              <w:right w:w="150" w:type="dxa"/>
+            </w:tcMar>
+            <w:hideMark/>
+          </w:tcPr>
+          <w:p>
+            <w:r>
+              <w:t>2</w:t>
+            </w:r>
+          </w:p>
+        </w:tc>
+        <w:tc>
+          <w:tcPr>
+            <w:tcW w:w="0" w:type="auto"/>
+            <w:tcMar>
+              <w:top w:w="90" w:type="dxa"/>
+              <w:left w:w="150" w:type="dxa"/>
+              <w:bottom w:w="90" w:type="dxa"/>
+              <w:right w:w="150" w:type="dxa"/>
+            </w:tcMar>
+            <w:hideMark/>
+          </w:tcPr>
+          <w:p>
+            <w:r>
+              <w:t>STORE</w:t>
+            </w:r>
+            <w:r>
+              <w:t>（</w:t>
+            </w:r>
+            <w:r>
+              <w:t xml:space="preserve">1 </w:t>
+            </w:r>
+            <w:r>
+              <w:t>个）</w:t>
+            </w:r>
+          </w:p>
+        </w:tc>
+        <w:tc>
+          <w:tcPr>
+            <w:tcW w:w="0" w:type="auto"/>
+            <w:tcMar>
+              <w:top w:w="90" w:type="dxa"/>
+              <w:left w:w="150" w:type="dxa"/>
+              <w:bottom w:w="90" w:type="dxa"/>
+              <w:right w:w="150" w:type="dxa"/>
+            </w:tcMar>
+            <w:hideMark/>
+          </w:tcPr>
+          <w:p>
+            <w:r>
+              <w:t>lane2←STORE</w:t>
+            </w:r>
+          </w:p>
+        </w:tc>
+        <w:tc>
+          <w:tcPr>
+            <w:tcW w:w="0" w:type="auto"/>
+            <w:tcMar>
+              <w:top w:w="90" w:type="dxa"/>
+              <w:left w:w="150" w:type="dxa"/>
+              <w:bottom w:w="90" w:type="dxa"/>
+              <w:right w:w="150" w:type="dxa"/>
+            </w:tcMar>
+            <w:hideMark/>
+          </w:tcPr>
+          <w:p>
+            <w:r>
+              <w:t>2+1=3</w:t>
+            </w:r>
+          </w:p>
+        </w:tc>
+      </w:tr>
+      <w:tr>
+        <w:trPr>
+          <w:tblCellSpacing w:w="15" w:type="dxa"/>
+        </w:trPr>
+        <w:tc>
+          <w:tcPr>
+            <w:tcW w:w="0" w:type="auto"/>
+            <w:tcMar>
+              <w:top w:w="90" w:type="dxa"/>
+              <w:left w:w="150" w:type="dxa"/>
+              <w:bottom w:w="90" w:type="dxa"/>
+              <w:right w:w="150" w:type="dxa"/>
+            </w:tcMar>
+            <w:hideMark/>
+          </w:tcPr>
+          <w:p>
+            <w:r>
+              <w:t>2</w:t>
+            </w:r>
+          </w:p>
+        </w:tc>
+        <w:tc>
+          <w:tcPr>
+            <w:tcW w:w="0" w:type="auto"/>
+            <w:tcMar>
+              <w:top w:w="90" w:type="dxa"/>
+              <w:left w:w="150" w:type="dxa"/>
+              <w:bottom w:w="90" w:type="dxa"/>
+              <w:right w:w="150" w:type="dxa"/>
+            </w:tcMar>
+            <w:hideMark/>
+          </w:tcPr>
+          <w:p>
+            <w:r>
+              <w:t>3</w:t>
+            </w:r>
+          </w:p>
+        </w:tc>
+        <w:tc>
+          <w:tcPr>
+            <w:tcW w:w="0" w:type="auto"/>
+            <w:tcMar>
+              <w:top w:w="90" w:type="dxa"/>
+              <w:left w:w="150" w:type="dxa"/>
+              <w:bottom w:w="90" w:type="dxa"/>
+              <w:right w:w="150" w:type="dxa"/>
+            </w:tcMar>
+            <w:hideMark/>
+          </w:tcPr>
+          <w:p>
+            <w:r>
+              <w:t>LOAD, STORE, VECTOR</w:t>
+            </w:r>
+            <w:r>
+              <w:t>（</w:t>
+            </w:r>
+            <w:r>
+              <w:t xml:space="preserve">3 </w:t>
+            </w:r>
+            <w:r>
+              <w:t>个）</w:t>
+            </w:r>
+          </w:p>
+        </w:tc>
+        <w:tc>
+          <w:tcPr>
+            <w:tcW w:w="0" w:type="auto"/>
+            <w:tcMar>
+              <w:top w:w="90" w:type="dxa"/>
+              <w:left w:w="150" w:type="dxa"/>
+              <w:bottom w:w="90" w:type="dxa"/>
+              <w:right w:w="150" w:type="dxa"/>
+            </w:tcMar>
+            <w:hideMark/>
+          </w:tcPr>
+          <w:p>
+            <w:r>
+              <w:t>lane3←LOAD</w:t>
+            </w:r>
+            <w:r>
+              <w:t>，</w:t>
+            </w:r>
+            <w:r>
+              <w:t>lane0←STORE</w:t>
+            </w:r>
+            <w:r>
+              <w:t>（绕回！），</w:t>
+            </w:r>
+            <w:r>
+              <w:t>lane1←VECTOR</w:t>
+            </w:r>
+          </w:p>
+        </w:tc>
+        <w:tc>
+          <w:tcPr>
+            <w:tcW w:w="0" w:type="auto"/>
+            <w:tcMar>
+              <w:top w:w="90" w:type="dxa"/>
+              <w:left w:w="150" w:type="dxa"/>
+              <w:bottom w:w="90" w:type="dxa"/>
+              <w:right w:w="150" w:type="dxa"/>
+            </w:tcMar>
+            <w:hideMark/>
+          </w:tcPr>
+          <w:p>
+            <w:r>
+              <w:t>(3+</w:t>
+            </w:r>
+            <w:proofErr w:type="gramStart"/>
+            <w:r>
+              <w:t>3)%</w:t>
+            </w:r>
+            <w:proofErr w:type="gramEnd"/>
+            <w:r>
+              <w:t>4=2</w:t>
+            </w:r>
+          </w:p>
+        </w:tc>
+      </w:tr>
+    </w:tbl>
+    <w:p>
+      <w:r>
+        <w:t>注意拍</w:t>
+      </w:r>
+      <w:r>
+        <w:t xml:space="preserve"> 2</w:t>
+      </w:r>
+      <w:r>
+        <w:t>：从</w:t>
+      </w:r>
+      <w:r>
+        <w:t xml:space="preserve"> lane3 </w:t>
+      </w:r>
+      <w:r>
+        <w:t>开始放，放满就绕回</w:t>
+      </w:r>
+      <w:r>
+        <w:t xml:space="preserve"> lane0</w:t>
+      </w:r>
+      <w:r>
+        <w:t>、</w:t>
+      </w:r>
+      <w:r>
+        <w:t>lane1——</w:t>
+      </w:r>
+      <w:r>
+        <w:t>这就是「环」和</w:t>
+      </w:r>
+      <w:r>
+        <w:t> mod 4 </w:t>
+      </w:r>
+      <w:r>
+        <w:t>的全部含义。</w:t>
+      </w:r>
+    </w:p>
+    <w:p>
+      <w:pPr>
+        <w:rPr>
+          <w:b/>
+          <w:bCs/>
+        </w:rPr>
+      </w:pPr>
+      <w:r>
+        <w:rPr>
+          <w:b/>
+          <w:bCs/>
+        </w:rPr>
+        <w:lastRenderedPageBreak/>
+        <w:t xml:space="preserve">2. </w:t>
+      </w:r>
+      <w:r>
+        <w:rPr>
+          <w:b/>
+          <w:bCs/>
+        </w:rPr>
+        <w:t>解码要回答两个问题</w:t>
+      </w:r>
+    </w:p>
+    <w:p>
+      <w:r>
+        <w:t>硬件在拍</w:t>
+      </w:r>
+      <w:r>
+        <w:t xml:space="preserve"> B </w:t>
+      </w:r>
+      <w:r>
+        <w:t>拿到</w:t>
+      </w:r>
+      <w:r>
+        <w:t xml:space="preserve"> mask</w:t>
+      </w:r>
+      <w:r>
+        <w:t>（知道哪几个槽有效），但不知道</w:t>
+      </w:r>
+      <w:r>
+        <w:t xml:space="preserve"> Lane </w:t>
+      </w:r>
+      <w:r>
+        <w:t>上这条数据原来是哪个槽的。它要反推出：</w:t>
+      </w:r>
+    </w:p>
+    <w:p>
+      <w:pPr>
+        <w:numPr>
+          <w:ilvl w:val="0"/>
+          <w:numId w:val="5"/>
+        </w:numPr>
+      </w:pPr>
+      <w:r>
+        <w:t xml:space="preserve">(a) </w:t>
+      </w:r>
+      <w:r>
+        <w:t>这条</w:t>
+      </w:r>
+      <w:r>
+        <w:t xml:space="preserve"> Lane </w:t>
+      </w:r>
+      <w:r>
+        <w:t>本拍有没有货？</w:t>
+      </w:r>
+      <w:r>
+        <w:t xml:space="preserve"> → </w:t>
+      </w:r>
+      <w:r>
+        <w:t>决定读不读它（门控省电）；</w:t>
+      </w:r>
+    </w:p>
+    <w:p>
+      <w:pPr>
+        <w:numPr>
+          <w:ilvl w:val="0"/>
+          <w:numId w:val="5"/>
+        </w:numPr>
+      </w:pPr>
+      <w:r>
+        <w:t xml:space="preserve">(b) </w:t>
+      </w:r>
+      <w:r>
+        <w:t>它装的是哪个槽？</w:t>
+      </w:r>
+      <w:r>
+        <w:t xml:space="preserve"> → </w:t>
+      </w:r>
+      <w:r>
+        <w:t>决定散布到哪个输出寄存器。</w:t>
+      </w:r>
+    </w:p>
+    <w:p>
+      <w:pPr>
+        <w:rPr>
+          <w:b/>
+          <w:bCs/>
+        </w:rPr>
+      </w:pPr>
+      <w:r>
+        <w:rPr>
+          <w:b/>
+          <w:bCs/>
+        </w:rPr>
+        <w:t xml:space="preserve">3. </w:t>
+      </w:r>
+      <w:r>
+        <w:rPr>
+          <w:b/>
+          <w:bCs/>
+        </w:rPr>
+        <w:t>由环直接读出公式</w:t>
+      </w:r>
+    </w:p>
+    <w:p>
+      <w:r>
+        <w:t>关键观察：因为是「从</w:t>
+      </w:r>
+      <w:r>
+        <w:t xml:space="preserve"> phase </w:t>
+      </w:r>
+      <w:r>
+        <w:t>开始沿环顺次放」，所以</w:t>
+      </w:r>
+      <w:r>
+        <w:t>——</w:t>
+      </w:r>
+    </w:p>
+    <w:p>
+      <w:r>
+        <w:t xml:space="preserve">lane N </w:t>
+      </w:r>
+      <w:r>
+        <w:t>本拍装的是「环上第</w:t>
+      </w:r>
+      <w:r>
+        <w:t xml:space="preserve"> (N − phase) </w:t>
+      </w:r>
+      <w:r>
+        <w:t>步」那个事件。</w:t>
+      </w:r>
+    </w:p>
+    <w:p>
+      <w:r>
+        <w:t>「环上第几步」就是代码里的</w:t>
+      </w:r>
+      <w:r>
+        <w:t> </w:t>
+      </w:r>
+      <w:proofErr w:type="spellStart"/>
+      <w:r>
+        <w:t>rk_laneN</w:t>
+      </w:r>
+      <w:proofErr w:type="spellEnd"/>
+      <w:r>
+        <w:t xml:space="preserve"> = (N − phase) mod 4</w:t>
+      </w:r>
+      <w:r>
+        <w:t>（</w:t>
+      </w:r>
+      <w:r>
+        <w:t xml:space="preserve">2-bit </w:t>
+      </w:r>
+      <w:r>
+        <w:t>减法自动回绕，就是沿环数步数）。</w:t>
+      </w:r>
+    </w:p>
+    <w:p>
+      <w:r>
+        <w:t xml:space="preserve">(a) </w:t>
+      </w:r>
+      <w:r>
+        <w:t>有没有货：本拍一共放了</w:t>
+      </w:r>
+      <w:r>
+        <w:t> </w:t>
+      </w:r>
+      <w:proofErr w:type="spellStart"/>
+      <w:r>
+        <w:t>pcnt</w:t>
+      </w:r>
+      <w:proofErr w:type="spellEnd"/>
+      <w:r>
+        <w:t> </w:t>
+      </w:r>
+      <w:r>
+        <w:t>个（</w:t>
+      </w:r>
+      <w:proofErr w:type="spellStart"/>
+      <w:r>
+        <w:t>popcount</w:t>
+      </w:r>
+      <w:proofErr w:type="spellEnd"/>
+      <w:r>
+        <w:t>），占的是环上第</w:t>
+      </w:r>
+      <w:r>
+        <w:t xml:space="preserve"> 0, 1, …, pcnt−1 </w:t>
+      </w:r>
+      <w:r>
+        <w:t>步。所以：</w:t>
+      </w:r>
+    </w:p>
+    <w:p>
+      <w:proofErr w:type="spellStart"/>
+      <w:r>
+        <w:t>en</w:t>
+      </w:r>
+      <w:proofErr w:type="spellEnd"/>
+      <w:r>
+        <w:t>(N) = (</w:t>
+      </w:r>
+      <w:proofErr w:type="spellStart"/>
+      <w:r>
+        <w:t>rk_laneN</w:t>
+      </w:r>
+      <w:proofErr w:type="spellEnd"/>
+      <w:r>
+        <w:t xml:space="preserve"> &lt; </w:t>
+      </w:r>
+      <w:proofErr w:type="spellStart"/>
+      <w:r>
+        <w:t>pcnt</w:t>
+      </w:r>
+      <w:proofErr w:type="spellEnd"/>
+      <w:r>
+        <w:t xml:space="preserve">)      // lane N </w:t>
+      </w:r>
+      <w:r>
+        <w:t>的步数在放置范围内</w:t>
+      </w:r>
+      <w:r>
+        <w:t xml:space="preserve"> → </w:t>
+      </w:r>
+      <w:r>
+        <w:t>有货</w:t>
+      </w:r>
+    </w:p>
+    <w:p>
+      <w:r>
+        <w:t xml:space="preserve">(b) </w:t>
+      </w:r>
+      <w:r>
+        <w:t>装的是哪个槽：第</w:t>
+      </w:r>
+      <w:r>
+        <w:t xml:space="preserve"> r </w:t>
+      </w:r>
+      <w:r>
+        <w:t>步放的是「第</w:t>
+      </w:r>
+      <w:r>
+        <w:t xml:space="preserve"> r </w:t>
+      </w:r>
+      <w:r>
+        <w:t>个有效槽」（按</w:t>
+      </w:r>
+      <w:r>
+        <w:t xml:space="preserve"> LOAD→…→SFU </w:t>
+      </w:r>
+      <w:r>
+        <w:t>排序）。槽</w:t>
+      </w:r>
+      <w:r>
+        <w:t xml:space="preserve"> s </w:t>
+      </w:r>
+      <w:r>
+        <w:t>是第几个有效槽</w:t>
+      </w:r>
+      <w:r>
+        <w:t xml:space="preserve"> = mask </w:t>
+      </w:r>
+      <w:r>
+        <w:t>里比</w:t>
+      </w:r>
+      <w:r>
+        <w:t xml:space="preserve"> s </w:t>
+      </w:r>
+      <w:r>
+        <w:t>低的位有几个</w:t>
+      </w:r>
+      <w:r>
+        <w:t xml:space="preserve"> 1</w:t>
+      </w:r>
+      <w:r>
+        <w:t>（前缀计数，就是</w:t>
+      </w:r>
+      <w:r>
+        <w:t> pre </w:t>
+      </w:r>
+      <w:r>
+        <w:t>那条链）。所以槽</w:t>
+      </w:r>
+      <w:r>
+        <w:t xml:space="preserve"> s </w:t>
+      </w:r>
+      <w:r>
+        <w:t>在环上的位置</w:t>
+      </w:r>
+      <w:r>
+        <w:t xml:space="preserve"> = (phase + rank(s)) mod 4</w:t>
+      </w:r>
+      <w:r>
+        <w:t>，拍</w:t>
+      </w:r>
+      <w:r>
+        <w:t xml:space="preserve"> C </w:t>
+      </w:r>
+      <w:r>
+        <w:t>据此从对应</w:t>
+      </w:r>
+      <w:r>
+        <w:t xml:space="preserve"> Lane </w:t>
+      </w:r>
+      <w:r>
+        <w:t>取数据。</w:t>
+      </w:r>
+    </w:p>
+    <w:p>
+      <w:pPr>
+        <w:rPr>
+          <w:b/>
+          <w:bCs/>
+        </w:rPr>
+      </w:pPr>
+      <w:r>
+        <w:rPr>
+          <w:b/>
+          <w:bCs/>
+        </w:rPr>
+        <w:t xml:space="preserve">4. </w:t>
+      </w:r>
+      <w:r>
+        <w:rPr>
+          <w:b/>
+          <w:bCs/>
+        </w:rPr>
+        <w:t>用拍</w:t>
+      </w:r>
+      <w:r>
+        <w:rPr>
+          <w:b/>
+          <w:bCs/>
+        </w:rPr>
+        <w:t xml:space="preserve"> 2 </w:t>
+      </w:r>
+      <w:r>
+        <w:rPr>
+          <w:b/>
+          <w:bCs/>
+        </w:rPr>
+        <w:t>验证一遍</w:t>
+      </w:r>
+    </w:p>
+    <w:p>
+      <w:r>
+        <w:t>phase=3</w:t>
+      </w:r>
+      <w:r>
+        <w:t>，</w:t>
+      </w:r>
+      <w:r>
+        <w:t>mask=00111</w:t>
+      </w:r>
+      <w:r>
+        <w:t>（</w:t>
+      </w:r>
+      <w:r>
+        <w:t xml:space="preserve">LOAD/STORE/VECTOR </w:t>
+      </w:r>
+      <w:r>
+        <w:t>有效，</w:t>
+      </w:r>
+      <w:proofErr w:type="spellStart"/>
+      <w:r>
+        <w:t>pcnt</w:t>
+      </w:r>
+      <w:proofErr w:type="spellEnd"/>
+      <w:r>
+        <w:t>=3</w:t>
+      </w:r>
+      <w:r>
+        <w:t>）：</w:t>
+      </w:r>
+    </w:p>
+    <w:tbl>
+      <w:tblPr>
+        <w:tblW w:w="0" w:type="auto"/>
+        <w:tblCellSpacing w:w="15" w:type="dxa"/>
+        <w:tblCellMar>
+          <w:top w:w="15" w:type="dxa"/>
+          <w:left w:w="15" w:type="dxa"/>
+          <w:bottom w:w="15" w:type="dxa"/>
+          <w:right w:w="15" w:type="dxa"/>
+        </w:tblCellMar>
+        <w:tblLook w:val="04A0" w:firstRow="1" w:lastRow="0" w:firstColumn="1" w:lastColumn="0" w:noHBand="0" w:noVBand="1"/>
+      </w:tblPr>
+      <w:tblGrid>
+        <w:gridCol w:w="1169"/>
+        <w:gridCol w:w="2508"/>
+        <w:gridCol w:w="1803"/>
+        <w:gridCol w:w="2826"/>
+      </w:tblGrid>
+      <w:tr>
+        <w:trPr>
+          <w:tblHeader/>
+          <w:tblCellSpacing w:w="15" w:type="dxa"/>
+        </w:trPr>
+        <w:tc>
+          <w:tcPr>
+            <w:tcW w:w="0" w:type="auto"/>
+            <w:noWrap/>
+            <w:tcMar>
+              <w:top w:w="90" w:type="dxa"/>
+              <w:left w:w="150" w:type="dxa"/>
+              <w:bottom w:w="90" w:type="dxa"/>
+              <w:right w:w="150" w:type="dxa"/>
+            </w:tcMar>
+            <w:hideMark/>
+          </w:tcPr>
+          <w:p>
+            <w:pPr>
+              <w:rPr>
+                <w:b/>
+                <w:bCs/>
+              </w:rPr>
+            </w:pPr>
+            <w:r>
+              <w:rPr>
+                <w:b/>
+                <w:bCs/>
+              </w:rPr>
+              <w:t>lane</w:t>
+            </w:r>
+          </w:p>
+        </w:tc>
+        <w:tc>
+          <w:tcPr>
+            <w:tcW w:w="0" w:type="auto"/>
+            <w:noWrap/>
+            <w:tcMar>
+              <w:top w:w="90" w:type="dxa"/>
+              <w:left w:w="150" w:type="dxa"/>
+              <w:bottom w:w="90" w:type="dxa"/>
+              <w:right w:w="150" w:type="dxa"/>
+            </w:tcMar>
+            <w:hideMark/>
+          </w:tcPr>
+          <w:p>
+            <w:pPr>
+              <w:rPr>
+                <w:b/>
+                <w:bCs/>
+              </w:rPr>
+            </w:pPr>
+            <w:proofErr w:type="spellStart"/>
+            <w:r>
+              <w:rPr>
+                <w:b/>
+                <w:bCs/>
+              </w:rPr>
+              <w:t>rk</w:t>
+            </w:r>
+            <w:proofErr w:type="spellEnd"/>
+            <w:r>
+              <w:rPr>
+                <w:b/>
+                <w:bCs/>
+              </w:rPr>
+              <w:t xml:space="preserve"> = (N−3) mod 4</w:t>
+            </w:r>
+          </w:p>
+        </w:tc>
+        <w:tc>
+          <w:tcPr>
+            <w:tcW w:w="0" w:type="auto"/>
+            <w:noWrap/>
+            <w:tcMar>
+              <w:top w:w="90" w:type="dxa"/>
+              <w:left w:w="150" w:type="dxa"/>
+              <w:bottom w:w="90" w:type="dxa"/>
+              <w:right w:w="150" w:type="dxa"/>
+            </w:tcMar>
+            <w:hideMark/>
+          </w:tcPr>
+          <w:p>
+            <w:pPr>
+              <w:rPr>
+                <w:b/>
+                <w:bCs/>
+              </w:rPr>
+            </w:pPr>
+            <w:proofErr w:type="spellStart"/>
+            <w:r>
+              <w:rPr>
+                <w:b/>
+                <w:bCs/>
+              </w:rPr>
+              <w:t>rk</w:t>
+            </w:r>
+            <w:proofErr w:type="spellEnd"/>
+            <w:r>
+              <w:rPr>
+                <w:b/>
+                <w:bCs/>
+              </w:rPr>
+              <w:t>&lt;3?</w:t>
+            </w:r>
+          </w:p>
+        </w:tc>
+        <w:tc>
+          <w:tcPr>
+            <w:tcW w:w="0" w:type="auto"/>
+            <w:noWrap/>
+            <w:tcMar>
+              <w:top w:w="90" w:type="dxa"/>
+              <w:left w:w="150" w:type="dxa"/>
+              <w:bottom w:w="90" w:type="dxa"/>
+              <w:right w:w="150" w:type="dxa"/>
+            </w:tcMar>
+            <w:hideMark/>
+          </w:tcPr>
+          <w:p>
+            <w:pPr>
+              <w:rPr>
+                <w:b/>
+                <w:bCs/>
+              </w:rPr>
+            </w:pPr>
+            <w:r>
+              <w:rPr>
+                <w:b/>
+                <w:bCs/>
+              </w:rPr>
+              <w:t>装的槽（</w:t>
+            </w:r>
+            <w:r>
+              <w:rPr>
+                <w:b/>
+                <w:bCs/>
+              </w:rPr>
+              <w:t xml:space="preserve">rank </w:t>
+            </w:r>
+            <w:r>
+              <w:rPr>
+                <w:b/>
+                <w:bCs/>
+              </w:rPr>
+              <w:t>几）</w:t>
+            </w:r>
+          </w:p>
+        </w:tc>
+      </w:tr>
+      <w:tr>
+        <w:trPr>
+          <w:tblCellSpacing w:w="15" w:type="dxa"/>
+        </w:trPr>
+        <w:tc>
+          <w:tcPr>
+            <w:tcW w:w="0" w:type="auto"/>
+            <w:tcMar>
+              <w:top w:w="90" w:type="dxa"/>
+              <w:left w:w="150" w:type="dxa"/>
+              <w:bottom w:w="90" w:type="dxa"/>
+              <w:right w:w="150" w:type="dxa"/>
+            </w:tcMar>
+            <w:hideMark/>
+          </w:tcPr>
+          <w:p>
+            <w:r>
+              <w:t>0</w:t>
+            </w:r>
+          </w:p>
+        </w:tc>
+        <w:tc>
+          <w:tcPr>
+            <w:tcW w:w="0" w:type="auto"/>
+            <w:tcMar>
+              <w:top w:w="90" w:type="dxa"/>
+              <w:left w:w="150" w:type="dxa"/>
+              <w:bottom w:w="90" w:type="dxa"/>
+              <w:right w:w="150" w:type="dxa"/>
+            </w:tcMar>
+            <w:hideMark/>
+          </w:tcPr>
+          <w:p>
+            <w:r>
+              <w:t>(0−</w:t>
+            </w:r>
+            <w:proofErr w:type="gramStart"/>
+            <w:r>
+              <w:t>3)%</w:t>
+            </w:r>
+            <w:proofErr w:type="gramEnd"/>
+            <w:r>
+              <w:t>4 = 1</w:t>
+            </w:r>
+          </w:p>
+        </w:tc>
+        <w:tc>
+          <w:tcPr>
+            <w:tcW w:w="0" w:type="auto"/>
+            <w:tcMar>
+              <w:top w:w="90" w:type="dxa"/>
+              <w:left w:w="150" w:type="dxa"/>
+              <w:bottom w:w="90" w:type="dxa"/>
+              <w:right w:w="150" w:type="dxa"/>
+            </w:tcMar>
+            <w:hideMark/>
+          </w:tcPr>
+          <w:p>
+            <w:r>
+              <w:rPr>
+                <w:rFonts w:ascii="Apple Color Emoji" w:hAnsi="Apple Color Emoji" w:cs="Apple Color Emoji"/>
+              </w:rPr>
+              <w:t>✅</w:t>
+            </w:r>
+          </w:p>
+        </w:tc>
+        <w:tc>
+          <w:tcPr>
+            <w:tcW w:w="0" w:type="auto"/>
+            <w:tcMar>
+              <w:top w:w="90" w:type="dxa"/>
+              <w:left w:w="150" w:type="dxa"/>
+              <w:bottom w:w="90" w:type="dxa"/>
+              <w:right w:w="150" w:type="dxa"/>
+            </w:tcMar>
+            <w:hideMark/>
+          </w:tcPr>
+          <w:p>
+            <w:r>
+              <w:t>rank 1 = STORE</w:t>
+            </w:r>
+          </w:p>
+        </w:tc>
+      </w:tr>
+      <w:tr>
+        <w:trPr>
+          <w:tblCellSpacing w:w="15" w:type="dxa"/>
+        </w:trPr>
+        <w:tc>
+          <w:tcPr>
+            <w:tcW w:w="0" w:type="auto"/>
+            <w:tcMar>
+              <w:top w:w="90" w:type="dxa"/>
+              <w:left w:w="150" w:type="dxa"/>
+              <w:bottom w:w="90" w:type="dxa"/>
+              <w:right w:w="150" w:type="dxa"/>
+            </w:tcMar>
+            <w:hideMark/>
+          </w:tcPr>
+          <w:p>
+            <w:r>
+              <w:t>1</w:t>
+            </w:r>
+          </w:p>
+        </w:tc>
+        <w:tc>
+          <w:tcPr>
+            <w:tcW w:w="0" w:type="auto"/>
+            <w:tcMar>
+              <w:top w:w="90" w:type="dxa"/>
+              <w:left w:w="150" w:type="dxa"/>
+              <w:bottom w:w="90" w:type="dxa"/>
+              <w:right w:w="150" w:type="dxa"/>
+            </w:tcMar>
+            <w:hideMark/>
+          </w:tcPr>
+          <w:p>
+            <w:r>
+              <w:t>(1−</w:t>
+            </w:r>
+            <w:proofErr w:type="gramStart"/>
+            <w:r>
+              <w:t>3)%</w:t>
+            </w:r>
+            <w:proofErr w:type="gramEnd"/>
+            <w:r>
+              <w:t>4 = 2</w:t>
+            </w:r>
+          </w:p>
+        </w:tc>
+        <w:tc>
+          <w:tcPr>
+            <w:tcW w:w="0" w:type="auto"/>
+            <w:tcMar>
+              <w:top w:w="90" w:type="dxa"/>
+              <w:left w:w="150" w:type="dxa"/>
+              <w:bottom w:w="90" w:type="dxa"/>
+              <w:right w:w="150" w:type="dxa"/>
+            </w:tcMar>
+            <w:hideMark/>
+          </w:tcPr>
+          <w:p>
+            <w:r>
+              <w:rPr>
+                <w:rFonts w:ascii="Apple Color Emoji" w:hAnsi="Apple Color Emoji" w:cs="Apple Color Emoji"/>
+              </w:rPr>
+              <w:t>✅</w:t>
+            </w:r>
+          </w:p>
+        </w:tc>
+        <w:tc>
+          <w:tcPr>
+            <w:tcW w:w="0" w:type="auto"/>
+            <w:tcMar>
+              <w:top w:w="90" w:type="dxa"/>
+              <w:left w:w="150" w:type="dxa"/>
+              <w:bottom w:w="90" w:type="dxa"/>
+              <w:right w:w="150" w:type="dxa"/>
+            </w:tcMar>
+            <w:hideMark/>
+          </w:tcPr>
+          <w:p>
+            <w:r>
+              <w:t>rank 2 = VECTOR</w:t>
+            </w:r>
+          </w:p>
+        </w:tc>
+      </w:tr>
+      <w:tr>
+        <w:trPr>
+          <w:tblCellSpacing w:w="15" w:type="dxa"/>
+        </w:trPr>
+        <w:tc>
+          <w:tcPr>
+            <w:tcW w:w="0" w:type="auto"/>
+            <w:tcMar>
+              <w:top w:w="90" w:type="dxa"/>
+              <w:left w:w="150" w:type="dxa"/>
+              <w:bottom w:w="90" w:type="dxa"/>
+              <w:right w:w="150" w:type="dxa"/>
+            </w:tcMar>
+            <w:hideMark/>
+          </w:tcPr>
+          <w:p>
+            <w:r>
+              <w:t>2</w:t>
+            </w:r>
+          </w:p>
+        </w:tc>
+        <w:tc>
+          <w:tcPr>
+            <w:tcW w:w="0" w:type="auto"/>
+            <w:tcMar>
+              <w:top w:w="90" w:type="dxa"/>
+              <w:left w:w="150" w:type="dxa"/>
+              <w:bottom w:w="90" w:type="dxa"/>
+              <w:right w:w="150" w:type="dxa"/>
+            </w:tcMar>
+            <w:hideMark/>
+          </w:tcPr>
+          <w:p>
+            <w:r>
+              <w:t>(2−</w:t>
+            </w:r>
+            <w:proofErr w:type="gramStart"/>
+            <w:r>
+              <w:t>3)%</w:t>
+            </w:r>
+            <w:proofErr w:type="gramEnd"/>
+            <w:r>
+              <w:t>4 = 3</w:t>
+            </w:r>
+          </w:p>
+        </w:tc>
+        <w:tc>
+          <w:tcPr>
+            <w:tcW w:w="0" w:type="auto"/>
+            <w:tcMar>
+              <w:top w:w="90" w:type="dxa"/>
+              <w:left w:w="150" w:type="dxa"/>
+              <w:bottom w:w="90" w:type="dxa"/>
+              <w:right w:w="150" w:type="dxa"/>
+            </w:tcMar>
+            <w:hideMark/>
+          </w:tcPr>
+          <w:p>
+            <w:r>
+              <w:rPr>
+                <w:rFonts w:ascii="Apple Color Emoji" w:hAnsi="Apple Color Emoji" w:cs="Apple Color Emoji"/>
+              </w:rPr>
+              <w:t>❌</w:t>
+            </w:r>
+            <w:r>
+              <w:t>（</w:t>
+            </w:r>
+            <w:r>
+              <w:t xml:space="preserve">3 </w:t>
+            </w:r>
+            <w:r>
+              <w:t>不</w:t>
+            </w:r>
+            <w:r>
+              <w:t>&lt;3</w:t>
+            </w:r>
+            <w:r>
+              <w:t>）</w:t>
+            </w:r>
+          </w:p>
+        </w:tc>
+        <w:tc>
+          <w:tcPr>
+            <w:tcW w:w="0" w:type="auto"/>
+            <w:tcMar>
+              <w:top w:w="90" w:type="dxa"/>
+              <w:left w:w="150" w:type="dxa"/>
+              <w:bottom w:w="90" w:type="dxa"/>
+              <w:right w:w="150" w:type="dxa"/>
+            </w:tcMar>
+            <w:hideMark/>
+          </w:tcPr>
+          <w:p>
+            <w:r>
+              <w:t>不读</w:t>
+            </w:r>
+          </w:p>
+        </w:tc>
+      </w:tr>
+      <w:tr>
+        <w:trPr>
+          <w:tblCellSpacing w:w="15" w:type="dxa"/>
+        </w:trPr>
+        <w:tc>
+          <w:tcPr>
+            <w:tcW w:w="0" w:type="auto"/>
+            <w:tcMar>
+              <w:top w:w="90" w:type="dxa"/>
+              <w:left w:w="150" w:type="dxa"/>
+              <w:bottom w:w="90" w:type="dxa"/>
+              <w:right w:w="150" w:type="dxa"/>
+            </w:tcMar>
+            <w:hideMark/>
+          </w:tcPr>
+          <w:p>
+            <w:r>
+              <w:t>3</w:t>
+            </w:r>
+          </w:p>
+        </w:tc>
+        <w:tc>
+          <w:tcPr>
+            <w:tcW w:w="0" w:type="auto"/>
+            <w:tcMar>
+              <w:top w:w="90" w:type="dxa"/>
+              <w:left w:w="150" w:type="dxa"/>
+              <w:bottom w:w="90" w:type="dxa"/>
+              <w:right w:w="150" w:type="dxa"/>
+            </w:tcMar>
+            <w:hideMark/>
+          </w:tcPr>
+          <w:p>
+            <w:r>
+              <w:t>(3−</w:t>
+            </w:r>
+            <w:proofErr w:type="gramStart"/>
+            <w:r>
+              <w:t>3)%</w:t>
+            </w:r>
+            <w:proofErr w:type="gramEnd"/>
+            <w:r>
+              <w:t>4 = 0</w:t>
+            </w:r>
+          </w:p>
+        </w:tc>
+        <w:tc>
+          <w:tcPr>
+            <w:tcW w:w="0" w:type="auto"/>
+            <w:tcMar>
+              <w:top w:w="90" w:type="dxa"/>
+              <w:left w:w="150" w:type="dxa"/>
+              <w:bottom w:w="90" w:type="dxa"/>
+              <w:right w:w="150" w:type="dxa"/>
+            </w:tcMar>
+            <w:hideMark/>
+          </w:tcPr>
+          <w:p>
+            <w:r>
+              <w:rPr>
+                <w:rFonts w:ascii="Apple Color Emoji" w:hAnsi="Apple Color Emoji" w:cs="Apple Color Emoji"/>
+              </w:rPr>
+              <w:t>✅</w:t>
+            </w:r>
+          </w:p>
+        </w:tc>
+        <w:tc>
+          <w:tcPr>
+            <w:tcW w:w="0" w:type="auto"/>
+            <w:tcMar>
+              <w:top w:w="90" w:type="dxa"/>
+              <w:left w:w="150" w:type="dxa"/>
+              <w:bottom w:w="90" w:type="dxa"/>
+              <w:right w:w="150" w:type="dxa"/>
+            </w:tcMar>
+            <w:hideMark/>
+          </w:tcPr>
+          <w:p>
+            <w:r>
+              <w:t>rank 0 = LOAD</w:t>
+            </w:r>
+          </w:p>
+        </w:tc>
+      </w:tr>
+    </w:tbl>
+    <w:p>
+      <w:r>
+        <w:lastRenderedPageBreak/>
+        <w:t>对照上面编码表拍</w:t>
+      </w:r>
+      <w:r>
+        <w:t xml:space="preserve"> 2</w:t>
+      </w:r>
+      <w:r>
+        <w:t>：</w:t>
+      </w:r>
+      <w:r>
+        <w:t>lane3←LOAD</w:t>
+      </w:r>
+      <w:r>
+        <w:t>、</w:t>
+      </w:r>
+      <w:r>
+        <w:t>lane0←STORE</w:t>
+      </w:r>
+      <w:r>
+        <w:t>、</w:t>
+      </w:r>
+      <w:r>
+        <w:t>lane1←VECTOR</w:t>
+      </w:r>
+      <w:r>
+        <w:t>、</w:t>
+      </w:r>
+      <w:r>
+        <w:t xml:space="preserve">lane2 </w:t>
+      </w:r>
+      <w:r>
+        <w:t>空</w:t>
+      </w:r>
+      <w:r>
+        <w:t>——</w:t>
+      </w:r>
+      <w:r>
+        <w:t>完全吻合。</w:t>
+      </w:r>
+    </w:p>
+    <w:p>
+      <w:pPr>
+        <w:rPr>
+          <w:b/>
+          <w:bCs/>
+        </w:rPr>
+      </w:pPr>
+      <w:r>
+        <w:rPr>
+          <w:b/>
+          <w:bCs/>
+        </w:rPr>
+        <w:t xml:space="preserve">5. </w:t>
+      </w:r>
+      <w:r>
+        <w:rPr>
+          <w:b/>
+          <w:bCs/>
+        </w:rPr>
+        <w:t>回到代码</w:t>
+      </w:r>
+    </w:p>
+    <w:p>
+      <w:pPr>
+        <w:numPr>
+          <w:ilvl w:val="0"/>
+          <w:numId w:val="6"/>
+        </w:numPr>
+      </w:pPr>
+      <w:proofErr w:type="spellStart"/>
+      <w:r>
+        <w:t>pcnt</w:t>
+      </w:r>
+      <w:proofErr w:type="spellEnd"/>
+      <w:r>
+        <w:t>（</w:t>
+      </w:r>
+      <w:proofErr w:type="spellStart"/>
+      <w:r>
+        <w:t>popcount</w:t>
+      </w:r>
+      <w:proofErr w:type="spellEnd"/>
+      <w:r>
+        <w:t>）</w:t>
+      </w:r>
+      <w:r>
+        <w:t xml:space="preserve">= </w:t>
+      </w:r>
+      <w:r>
+        <w:t>本拍放了几个</w:t>
+      </w:r>
+      <w:r>
+        <w:t xml:space="preserve"> = </w:t>
+      </w:r>
+      <w:r>
+        <w:t>前缀链</w:t>
+      </w:r>
+      <w:r>
+        <w:t> pre1..pre4 </w:t>
+      </w:r>
+      <w:r>
+        <w:t>累加出来；</w:t>
+      </w:r>
+    </w:p>
+    <w:p>
+      <w:pPr>
+        <w:numPr>
+          <w:ilvl w:val="0"/>
+          <w:numId w:val="6"/>
+        </w:numPr>
+      </w:pPr>
+      <w:r>
+        <w:t>拍</w:t>
+      </w:r>
+      <w:r>
+        <w:t xml:space="preserve"> C </w:t>
+      </w:r>
+      <w:r>
+        <w:t>散布时，槽</w:t>
+      </w:r>
+      <w:r>
+        <w:t xml:space="preserve"> s </w:t>
+      </w:r>
+      <w:r>
+        <w:t>的源</w:t>
+      </w:r>
+      <w:r>
+        <w:t xml:space="preserve"> Lane = </w:t>
+      </w:r>
+      <w:proofErr w:type="spellStart"/>
+      <w:r>
+        <w:t>phase_c</w:t>
+      </w:r>
+      <w:proofErr w:type="spellEnd"/>
+      <w:r>
+        <w:t xml:space="preserve"> + rank(s)</w:t>
+      </w:r>
+      <w:r>
+        <w:t>，</w:t>
+      </w:r>
+      <w:r>
+        <w:t>rank(s) </w:t>
+      </w:r>
+      <w:r>
+        <w:t>用同一条前缀链算（</w:t>
+      </w:r>
+      <w:proofErr w:type="spellStart"/>
+      <w:r>
+        <w:t>c_pre</w:t>
+      </w:r>
+      <w:proofErr w:type="spellEnd"/>
+      <w:r>
+        <w:t>*</w:t>
+      </w:r>
+      <w:r>
+        <w:t>）。</w:t>
+      </w:r>
+    </w:p>
+    <w:p>
+      <w:r>
+        <w:t>一句话：编码是「从</w:t>
+      </w:r>
+      <w:r>
+        <w:t xml:space="preserve"> phase </w:t>
+      </w:r>
+      <w:r>
+        <w:t>沿环顺次放」，解码是「沿环数步数</w:t>
+      </w:r>
+      <w:r>
+        <w:t xml:space="preserve"> (N−phase) </w:t>
+      </w:r>
+      <w:r>
+        <w:t>找回每个槽」</w:t>
+      </w:r>
+      <w:r>
+        <w:t>——mod 4 </w:t>
+      </w:r>
+      <w:r>
+        <w:t>只是绕环，</w:t>
+      </w:r>
+      <w:proofErr w:type="spellStart"/>
+      <w:r>
+        <w:t>popcount</w:t>
+      </w:r>
+      <w:proofErr w:type="spellEnd"/>
+      <w:r>
+        <w:t> </w:t>
+      </w:r>
+      <w:r>
+        <w:t>只是数放了几个。</w:t>
+      </w:r>
+    </w:p>
+    <w:p/>
+    <w:p>
+      <w:r>
+        <w:t>Stage C: scatter</w:t>
+      </w:r>
+    </w:p>
+    <w:p>
+      <w:r>
+        <w:rPr>
+          <w:rFonts w:hint="eastAsia"/>
+        </w:rPr>
+        <w:t>第一步，计算出</w:t>
+      </w:r>
+      <w:r>
+        <w:rPr>
+          <w:rFonts w:hint="eastAsia"/>
+        </w:rPr>
+        <w:t>rank</w:t>
+      </w:r>
+      <w:r>
+        <w:t>(s) for slot s</w:t>
+      </w:r>
+    </w:p>
+    <w:p>
+      <w:r>
+        <w:rPr>
+          <w:rFonts w:hint="eastAsia"/>
+        </w:rPr>
+        <w:t>第二</w:t>
+      </w:r>
+      <w:r>
+        <w:rPr>
+          <w:rFonts w:hint="eastAsia"/>
+        </w:rPr>
+        <w:t>步</w:t>
+      </w:r>
+      <w:r>
+        <w:rPr>
+          <w:rFonts w:hint="eastAsia"/>
+        </w:rPr>
+        <w:t>，计算出</w:t>
+      </w:r>
+      <w:r>
+        <w:rPr>
+          <w:rFonts w:hint="eastAsia"/>
+        </w:rPr>
+        <w:t>source lane for slot s</w:t>
+      </w:r>
+    </w:p>
+    <w:p>
+      <w:pPr>
+        <w:rPr>
+          <w:rFonts w:hint="eastAsia"/>
+        </w:rPr>
+      </w:pPr>
+      <w:r>
+        <w:rPr>
+          <w:rFonts w:hint="eastAsia"/>
+        </w:rPr>
+        <w:t>第三步，得到</w:t>
+      </w:r>
+      <w:r>
+        <w:rPr>
+          <w:rFonts w:hint="eastAsia"/>
+        </w:rPr>
+        <w:t>mux</w:t>
+      </w:r>
+      <w:r>
+        <w:rPr>
+          <w:rFonts w:hint="eastAsia"/>
+        </w:rPr>
+        <w:t>结果</w:t>
+      </w:r>
+    </w:p>
+    <w:p>
+      <w:pPr>
+        <w:pStyle w:val="a4"/>
+        <w:rPr>
+          <w:rFonts w:hint="eastAsia"/>
+        </w:rPr>
+      </w:pPr>
+      <w:r>
+        <w:lastRenderedPageBreak/>
+        <w:drawing>
+          <wp:inline distT="0" distB="0" distL="0" distR="0" wp14:anchorId="1213B9A0" wp14:editId="20071D07">
+            <wp:extent cx="5274310" cy="4824730"/>
+            <wp:effectExtent l="0" t="0" r="0" b="1270"/>
+            <wp:docPr id="1960387756" name="图片 1"/>
+            <wp:cNvGraphicFramePr>
+              <a:graphicFrameLocks xmlns:a="http://schemas.openxmlformats.org/drawingml/2006/main" noChangeAspect="1"/>
+            </wp:cNvGraphicFramePr>
+            <a:graphic xmlns:a="http://schemas.openxmlformats.org/drawingml/2006/main">
+              <a:graphicData uri="http://schemas.openxmlformats.org/drawingml/2006/picture">
+                <pic:pic xmlns:pic="http://schemas.openxmlformats.org/drawingml/2006/picture">
+                  <pic:nvPicPr>
+                    <pic:cNvPr id="1960387756" name=""/>
+                    <pic:cNvPicPr/>
+                  </pic:nvPicPr>
+                  <pic:blipFill>
+                    <a:blip r:embed="rId5"/>
+                    <a:stretch>
+                      <a:fillRect/>
+                    </a:stretch>
+                  </pic:blipFill>
+                  <pic:spPr>
+                    <a:xfrm>
+                      <a:off x="0" y="0"/>
+                      <a:ext cx="5274310" cy="4824730"/>
+                    </a:xfrm>
+                    <a:prstGeom prst="rect">
+                      <a:avLst/>
+                    </a:prstGeom>
+                  </pic:spPr>
+                </pic:pic>
+              </a:graphicData>
+            </a:graphic>
+          </wp:inline>
+        </w:drawing>
+      </w:r>
+    </w:p>
+    <w:p>
+      <w:pPr>
+        <w:rPr>
+          <w:rFonts w:hint="eastAsia"/>
+        </w:rPr>
+      </w:pPr>
+    </w:p>
+    <w:p>
+      <w:pPr>
+        <w:pStyle w:val="1"/>
+        <w:rPr>
+          <w:rFonts w:hint="eastAsia"/>
+        </w:rPr>
+      </w:pPr>
+      <w:r>
+        <w:rPr>
+          <w:rFonts w:hint="eastAsia"/>
+        </w:rPr>
+        <w:t>如果下一步从</w:t>
+      </w:r>
+      <w:r>
+        <w:rPr>
+          <w:rFonts w:hint="eastAsia"/>
+        </w:rPr>
+        <w:t>3</w:t>
+      </w:r>
+      <w:r>
+        <w:rPr>
+          <w:rFonts w:hint="eastAsia"/>
+        </w:rPr>
+        <w:t>个函数扩展到</w:t>
+      </w:r>
+      <w:r>
+        <w:rPr>
+          <w:rFonts w:hint="eastAsia"/>
+        </w:rPr>
+        <w:t>10</w:t>
+      </w:r>
+      <w:r>
+        <w:rPr>
+          <w:rFonts w:hint="eastAsia"/>
+        </w:rPr>
+        <w:t>个函数</w:t>
+      </w:r>
+    </w:p>
+    <w:p>
+      <w:pPr>
+        <w:pStyle w:val="a4"/>
+      </w:pPr>
+      <w:r>
+        <w:rPr>
+          <w:rFonts w:hint="eastAsia"/>
+        </w:rPr>
+        <w:drawing>
+          <wp:inline distT="0" distB="0" distL="0" distR="0" wp14:anchorId="1A559338" wp14:editId="1F886772">
+            <wp:extent cx="5274310" cy="2461895"/>
+            <wp:effectExtent l="0" t="0" r="0" b="1905"/>
+            <wp:docPr id="1597771226" name="图片 1"/>
+            <wp:cNvGraphicFramePr>
+              <a:graphicFrameLocks xmlns:a="http://schemas.openxmlformats.org/drawingml/2006/main" noChangeAspect="1"/>
+            </wp:cNvGraphicFramePr>
+            <a:graphic xmlns:a="http://schemas.openxmlformats.org/drawingml/2006/main">
+              <a:graphicData uri="http://schemas.openxmlformats.org/drawingml/2006/picture">
+                <pic:pic xmlns:pic="http://schemas.openxmlformats.org/drawingml/2006/picture">
+                  <pic:nvPicPr>
+                    <pic:cNvPr id="1597771226" name="图片 1597771226"/>
+                    <pic:cNvPicPr/>
+                  </pic:nvPicPr>
+                  <pic:blipFill>
+                    <a:blip r:embed="rId6" cstate="print">
+                      <a:extLst>
+                        <a:ext uri="{28A0092B-C50C-407E-A947-70E740481C1C}">
+                          <a14:useLocalDpi xmlns:a14="http://schemas.microsoft.com/office/drawing/2010/main" val="0"/>
+                        </a:ext>
+                      </a:extLst>
+                    </a:blip>
+                    <a:stretch>
+                      <a:fillRect/>
+                    </a:stretch>
+                  </pic:blipFill>
+                  <pic:spPr>
+                    <a:xfrm>
+                      <a:off x="0" y="0"/>
+                      <a:ext cx="5274310" cy="2461895"/>
+                    </a:xfrm>
+                    <a:prstGeom prst="rect">
+                      <a:avLst/>
+                    </a:prstGeom>
+                  </pic:spPr>
+                </pic:pic>
+              </a:graphicData>
+            </a:graphic>
+          </wp:inline>
+        </w:drawing>
+      </w:r>
+    </w:p>
+    <w:p>
+      <w:pPr>
+        <w:pStyle w:val="a4"/>
+        <w:rPr>
+          <w:rFonts w:hint="eastAsia"/>
+        </w:rPr>
+      </w:pPr>
+      <w:r>
+        <w:lastRenderedPageBreak/>
+        <w:drawing>
+          <wp:inline distT="0" distB="0" distL="0" distR="0" wp14:anchorId="78B9A85F" wp14:editId="0F6B3978">
+            <wp:extent cx="5274310" cy="2287270"/>
+            <wp:effectExtent l="0" t="0" r="0" b="0"/>
+            <wp:docPr id="2049518491" name="图片 1"/>
+            <wp:cNvGraphicFramePr>
+              <a:graphicFrameLocks xmlns:a="http://schemas.openxmlformats.org/drawingml/2006/main" noChangeAspect="1"/>
+            </wp:cNvGraphicFramePr>
+            <a:graphic xmlns:a="http://schemas.openxmlformats.org/drawingml/2006/main">
+              <a:graphicData uri="http://schemas.openxmlformats.org/drawingml/2006/picture">
+                <pic:pic xmlns:pic="http://schemas.openxmlformats.org/drawingml/2006/picture">
+                  <pic:nvPicPr>
+                    <pic:cNvPr id="2049518491" name=""/>
+                    <pic:cNvPicPr/>
+                  </pic:nvPicPr>
+                  <pic:blipFill>
+                    <a:blip r:embed="rId7"/>
+                    <a:stretch>
+                      <a:fillRect/>
+                    </a:stretch>
+                  </pic:blipFill>
+                  <pic:spPr>
+                    <a:xfrm>
+                      <a:off x="0" y="0"/>
+                      <a:ext cx="5274310" cy="2287270"/>
+                    </a:xfrm>
+                    <a:prstGeom prst="rect">
+                      <a:avLst/>
+                    </a:prstGeom>
+                  </pic:spPr>
+                </pic:pic>
+              </a:graphicData>
+            </a:graphic>
+          </wp:inline>
+        </w:drawing>
+      </w:r>
     </w:p>
     <w:sectPr>
       <w:pgSz w:w="11906" w:h="16838"/>
@@ -842,7 +3996,7 @@
 </file>
 
 <file path=word/numbering.xml><?xml version="1.0" encoding="utf-8"?>
-<w:numbering xmlns:wpc="http://schemas.microsoft.com/office/word/2010/wordprocessingCanvas" xmlns:cx="http://schemas.microsoft.com/office/drawing/2014/chartex" xmlns:cx1="http://schemas.microsoft.com/office/drawing/2015/9/8/chartex" xmlns:cx2="http://schemas.microsoft.com/office/drawing/2015/10/21/chartex" xmlns:cx3="http://schemas.microsoft.com/office/drawing/2016/5/9/chartex" xmlns:cx4="http://schemas.microsoft.com/office/drawing/2016/5/10/chartex" xmlns:cx5="http://schemas.microsoft.com/office/drawing/2016/5/11/chartex" xmlns:cx6="http://schemas.microsoft.com/office/drawing/2016/5/12/chartex" xmlns:cx7="http://schemas.microsoft.com/office/drawing/2016/5/13/chartex" xmlns:cx8="http://schemas.microsoft.com/office/drawing/2016/5/14/chartex" xmlns:mc="http://schemas.openxmlformats.org/markup-compatibility/2006" xmlns:aink="http://schemas.microsoft.com/office/drawing/2016/ink" xmlns:am3d="http://schemas.microsoft.com/office/drawing/2017/model3d" xmlns:o="urn:schemas-microsoft-com:office:office" xmlns:r="http://schemas.openxmlformats.org/officeDocument/2006/relationships" xmlns:m="http://schemas.openxmlformats.org/officeDocument/2006/math" xmlns:v="urn:schemas-microsoft-com:vml" xmlns:wp14="http://schemas.microsoft.com/office/word/2010/wordprocessingDrawing" xmlns:wp="http://schemas.openxmlformats.org/drawingml/2006/wordprocessingDrawing" xmlns:w10="urn:schemas-microsoft-com:office:word" xmlns:w="http://schemas.openxmlformats.org/wordprocessingml/2006/main" xmlns:w14="http://schemas.microsoft.com/office/word/2010/wordml" xmlns:w15="http://schemas.microsoft.com/office/word/2012/wordml" xmlns:w16cid="http://schemas.microsoft.com/office/word/2016/wordml/cid" xmlns:w16se="http://schemas.microsoft.com/office/word/2015/wordml/symex" xmlns:wpg="http://schemas.microsoft.com/office/word/2010/wordprocessingGroup" xmlns:wpi="http://schemas.microsoft.com/office/word/2010/wordprocessingInk" xmlns:wne="http://schemas.microsoft.com/office/word/2006/wordml" xmlns:wps="http://schemas.microsoft.com/office/word/2010/wordprocessingShape" mc:Ignorable="w14 w15 w16se w16cid wp14">
+<w:numbering xmlns:wpc="http://schemas.microsoft.com/office/word/2010/wordprocessingCanvas" xmlns:cx="http://schemas.microsoft.com/office/drawing/2014/chartex" xmlns:cx1="http://schemas.microsoft.com/office/drawing/2015/9/8/chartex" xmlns:cx2="http://schemas.microsoft.com/office/drawing/2015/10/21/chartex" xmlns:cx3="http://schemas.microsoft.com/office/drawing/2016/5/9/chartex" xmlns:cx4="http://schemas.microsoft.com/office/drawing/2016/5/10/chartex" xmlns:cx5="http://schemas.microsoft.com/office/drawing/2016/5/11/chartex" xmlns:cx6="http://schemas.microsoft.com/office/drawing/2016/5/12/chartex" xmlns:cx7="http://schemas.microsoft.com/office/drawing/2016/5/13/chartex" xmlns:cx8="http://schemas.microsoft.com/office/drawing/2016/5/14/chartex" xmlns:mc="http://schemas.openxmlformats.org/markup-compatibility/2006" xmlns:m="http://schemas.openxmlformats.org/officeDocument/2006/math" xmlns:aink="http://schemas.microsoft.com/office/drawing/2016/ink" xmlns:am3d="http://schemas.microsoft.com/office/drawing/2017/model3d" xmlns:oel="http://schemas.microsoft.com/office/2019/extlst" xmlns:r="http://schemas.openxmlformats.org/officeDocument/2006/relationships" xmlns:wp14="http://schemas.microsoft.com/office/word/2010/wordprocessingDrawing" xmlns:wp="http://schemas.openxmlformats.org/drawingml/2006/wordprocessingDrawing" xmlns:wpg="http://schemas.microsoft.com/office/word/2010/wordprocessingGroup" xmlns:wpi="http://schemas.microsoft.com/office/word/2010/wordprocessingInk" xmlns:wps="http://schemas.microsoft.com/office/word/2010/wordprocessingShape" xmlns:o="urn:schemas-microsoft-com:office:office" xmlns:v="urn:schemas-microsoft-com:vml" xmlns:w10="urn:schemas-microsoft-com:office:word" xmlns:w="http://schemas.openxmlformats.org/wordprocessingml/2006/main" xmlns:w14="http://schemas.microsoft.com/office/word/2010/wordml" xmlns:w15="http://schemas.microsoft.com/office/word/2012/wordml" xmlns:w16cex="http://schemas.microsoft.com/office/word/2018/wordml/cex" xmlns:w16cid="http://schemas.microsoft.com/office/word/2016/wordml/cid" xmlns:w16="http://schemas.microsoft.com/office/word/2018/wordml" xmlns:w16sdtdh="http://schemas.microsoft.com/office/word/2020/wordml/sdtdatahash" xmlns:w16sdtfl="http://schemas.microsoft.com/office/word/2024/wordml/sdtformatlock" xmlns:w16se="http://schemas.microsoft.com/office/word/2015/wordml/symex" xmlns:w16du="http://schemas.microsoft.com/office/word/2023/wordml/word16du" xmlns:wne="http://schemas.microsoft.com/office/word/2006/wordml" mc:Ignorable="w14 w15 w16se w16cid w16 w16cex w16sdtdh w16sdtfl w16du wp14">
   <w:abstractNum w:abstractNumId="0" w15:restartNumberingAfterBreak="0">
     <w:nsid w:val="1F5A7414"/>
     <w:multiLevelType w:val="hybridMultilevel"/>
@@ -933,6 +4087,155 @@
     </w:lvl>
   </w:abstractNum>
   <w:abstractNum w:abstractNumId="1" w15:restartNumberingAfterBreak="0">
+    <w:nsid w:val="427D6537"/>
+    <w:multiLevelType w:val="multilevel"/>
+    <w:tmpl w:val="78827A70"/>
+    <w:lvl w:ilvl="0">
+      <w:start w:val="1"/>
+      <w:numFmt w:val="bullet"/>
+      <w:lvlText w:val=""/>
+      <w:lvlJc w:val="left"/>
+      <w:pPr>
+        <w:tabs>
+          <w:tab w:val="num" w:pos="720"/>
+        </w:tabs>
+        <w:ind w:left="720" w:hanging="360"/>
+      </w:pPr>
+      <w:rPr>
+        <w:rFonts w:ascii="Symbol" w:hAnsi="Symbol" w:hint="default"/>
+        <w:sz w:val="20"/>
+      </w:rPr>
+    </w:lvl>
+    <w:lvl w:ilvl="1" w:tentative="1">
+      <w:start w:val="1"/>
+      <w:numFmt w:val="bullet"/>
+      <w:lvlText w:val="o"/>
+      <w:lvlJc w:val="left"/>
+      <w:pPr>
+        <w:tabs>
+          <w:tab w:val="num" w:pos="1440"/>
+        </w:tabs>
+        <w:ind w:left="1440" w:hanging="360"/>
+      </w:pPr>
+      <w:rPr>
+        <w:rFonts w:ascii="Courier New" w:hAnsi="Courier New" w:hint="default"/>
+        <w:sz w:val="20"/>
+      </w:rPr>
+    </w:lvl>
+    <w:lvl w:ilvl="2" w:tentative="1">
+      <w:start w:val="1"/>
+      <w:numFmt w:val="bullet"/>
+      <w:lvlText w:val=""/>
+      <w:lvlJc w:val="left"/>
+      <w:pPr>
+        <w:tabs>
+          <w:tab w:val="num" w:pos="2160"/>
+        </w:tabs>
+        <w:ind w:left="2160" w:hanging="360"/>
+      </w:pPr>
+      <w:rPr>
+        <w:rFonts w:ascii="Wingdings" w:hAnsi="Wingdings" w:hint="default"/>
+        <w:sz w:val="20"/>
+      </w:rPr>
+    </w:lvl>
+    <w:lvl w:ilvl="3" w:tentative="1">
+      <w:start w:val="1"/>
+      <w:numFmt w:val="bullet"/>
+      <w:lvlText w:val=""/>
+      <w:lvlJc w:val="left"/>
+      <w:pPr>
+        <w:tabs>
+          <w:tab w:val="num" w:pos="2880"/>
+        </w:tabs>
+        <w:ind w:left="2880" w:hanging="360"/>
+      </w:pPr>
+      <w:rPr>
+        <w:rFonts w:ascii="Wingdings" w:hAnsi="Wingdings" w:hint="default"/>
+        <w:sz w:val="20"/>
+      </w:rPr>
+    </w:lvl>
+    <w:lvl w:ilvl="4" w:tentative="1">
+      <w:start w:val="1"/>
+      <w:numFmt w:val="bullet"/>
+      <w:lvlText w:val=""/>
+      <w:lvlJc w:val="left"/>
+      <w:pPr>
+        <w:tabs>
+          <w:tab w:val="num" w:pos="3600"/>
+        </w:tabs>
+        <w:ind w:left="3600" w:hanging="360"/>
+      </w:pPr>
+      <w:rPr>
+        <w:rFonts w:ascii="Wingdings" w:hAnsi="Wingdings" w:hint="default"/>
+        <w:sz w:val="20"/>
+      </w:rPr>
+    </w:lvl>
+    <w:lvl w:ilvl="5" w:tentative="1">
+      <w:start w:val="1"/>
+      <w:numFmt w:val="bullet"/>
+      <w:lvlText w:val=""/>
+      <w:lvlJc w:val="left"/>
+      <w:pPr>
+        <w:tabs>
+          <w:tab w:val="num" w:pos="4320"/>
+        </w:tabs>
+        <w:ind w:left="4320" w:hanging="360"/>
+      </w:pPr>
+      <w:rPr>
+        <w:rFonts w:ascii="Wingdings" w:hAnsi="Wingdings" w:hint="default"/>
+        <w:sz w:val="20"/>
+      </w:rPr>
+    </w:lvl>
+    <w:lvl w:ilvl="6" w:tentative="1">
+      <w:start w:val="1"/>
+      <w:numFmt w:val="bullet"/>
+      <w:lvlText w:val=""/>
+      <w:lvlJc w:val="left"/>
+      <w:pPr>
+        <w:tabs>
+          <w:tab w:val="num" w:pos="5040"/>
+        </w:tabs>
+        <w:ind w:left="5040" w:hanging="360"/>
+      </w:pPr>
+      <w:rPr>
+        <w:rFonts w:ascii="Wingdings" w:hAnsi="Wingdings" w:hint="default"/>
+        <w:sz w:val="20"/>
+      </w:rPr>
+    </w:lvl>
+    <w:lvl w:ilvl="7" w:tentative="1">
+      <w:start w:val="1"/>
+      <w:numFmt w:val="bullet"/>
+      <w:lvlText w:val=""/>
+      <w:lvlJc w:val="left"/>
+      <w:pPr>
+        <w:tabs>
+          <w:tab w:val="num" w:pos="5760"/>
+        </w:tabs>
+        <w:ind w:left="5760" w:hanging="360"/>
+      </w:pPr>
+      <w:rPr>
+        <w:rFonts w:ascii="Wingdings" w:hAnsi="Wingdings" w:hint="default"/>
+        <w:sz w:val="20"/>
+      </w:rPr>
+    </w:lvl>
+    <w:lvl w:ilvl="8" w:tentative="1">
+      <w:start w:val="1"/>
+      <w:numFmt w:val="bullet"/>
+      <w:lvlText w:val=""/>
+      <w:lvlJc w:val="left"/>
+      <w:pPr>
+        <w:tabs>
+          <w:tab w:val="num" w:pos="6480"/>
+        </w:tabs>
+        <w:ind w:left="6480" w:hanging="360"/>
+      </w:pPr>
+      <w:rPr>
+        <w:rFonts w:ascii="Wingdings" w:hAnsi="Wingdings" w:hint="default"/>
+        <w:sz w:val="20"/>
+      </w:rPr>
+    </w:lvl>
+  </w:abstractNum>
+  <w:abstractNum w:abstractNumId="2" w15:restartNumberingAfterBreak="0">
     <w:nsid w:val="4CEE7BEB"/>
     <w:multiLevelType w:val="hybridMultilevel"/>
     <w:tmpl w:val="69847582"/>
@@ -1021,7 +4324,7 @@
       </w:pPr>
     </w:lvl>
   </w:abstractNum>
-  <w:abstractNum w:abstractNumId="2" w15:restartNumberingAfterBreak="0">
+  <w:abstractNum w:abstractNumId="3" w15:restartNumberingAfterBreak="0">
     <w:nsid w:val="59D21984"/>
     <w:multiLevelType w:val="multilevel"/>
     <w:tmpl w:val="2D1CCF54"/>
@@ -1134,20 +4437,291 @@
       </w:pPr>
     </w:lvl>
   </w:abstractNum>
-  <w:num w:numId="1">
+  <w:abstractNum w:abstractNumId="4" w15:restartNumberingAfterBreak="0">
+    <w:nsid w:val="5C6E2A0B"/>
+    <w:multiLevelType w:val="multilevel"/>
+    <w:tmpl w:val="5ADC3AFE"/>
+    <w:lvl w:ilvl="0">
+      <w:start w:val="1"/>
+      <w:numFmt w:val="bullet"/>
+      <w:lvlText w:val=""/>
+      <w:lvlJc w:val="left"/>
+      <w:pPr>
+        <w:tabs>
+          <w:tab w:val="num" w:pos="720"/>
+        </w:tabs>
+        <w:ind w:left="720" w:hanging="360"/>
+      </w:pPr>
+      <w:rPr>
+        <w:rFonts w:ascii="Symbol" w:hAnsi="Symbol" w:hint="default"/>
+        <w:sz w:val="20"/>
+      </w:rPr>
+    </w:lvl>
+    <w:lvl w:ilvl="1" w:tentative="1">
+      <w:start w:val="1"/>
+      <w:numFmt w:val="bullet"/>
+      <w:lvlText w:val="o"/>
+      <w:lvlJc w:val="left"/>
+      <w:pPr>
+        <w:tabs>
+          <w:tab w:val="num" w:pos="1440"/>
+        </w:tabs>
+        <w:ind w:left="1440" w:hanging="360"/>
+      </w:pPr>
+      <w:rPr>
+        <w:rFonts w:ascii="Courier New" w:hAnsi="Courier New" w:hint="default"/>
+        <w:sz w:val="20"/>
+      </w:rPr>
+    </w:lvl>
+    <w:lvl w:ilvl="2" w:tentative="1">
+      <w:start w:val="1"/>
+      <w:numFmt w:val="bullet"/>
+      <w:lvlText w:val=""/>
+      <w:lvlJc w:val="left"/>
+      <w:pPr>
+        <w:tabs>
+          <w:tab w:val="num" w:pos="2160"/>
+        </w:tabs>
+        <w:ind w:left="2160" w:hanging="360"/>
+      </w:pPr>
+      <w:rPr>
+        <w:rFonts w:ascii="Wingdings" w:hAnsi="Wingdings" w:hint="default"/>
+        <w:sz w:val="20"/>
+      </w:rPr>
+    </w:lvl>
+    <w:lvl w:ilvl="3" w:tentative="1">
+      <w:start w:val="1"/>
+      <w:numFmt w:val="bullet"/>
+      <w:lvlText w:val=""/>
+      <w:lvlJc w:val="left"/>
+      <w:pPr>
+        <w:tabs>
+          <w:tab w:val="num" w:pos="2880"/>
+        </w:tabs>
+        <w:ind w:left="2880" w:hanging="360"/>
+      </w:pPr>
+      <w:rPr>
+        <w:rFonts w:ascii="Wingdings" w:hAnsi="Wingdings" w:hint="default"/>
+        <w:sz w:val="20"/>
+      </w:rPr>
+    </w:lvl>
+    <w:lvl w:ilvl="4" w:tentative="1">
+      <w:start w:val="1"/>
+      <w:numFmt w:val="bullet"/>
+      <w:lvlText w:val=""/>
+      <w:lvlJc w:val="left"/>
+      <w:pPr>
+        <w:tabs>
+          <w:tab w:val="num" w:pos="3600"/>
+        </w:tabs>
+        <w:ind w:left="3600" w:hanging="360"/>
+      </w:pPr>
+      <w:rPr>
+        <w:rFonts w:ascii="Wingdings" w:hAnsi="Wingdings" w:hint="default"/>
+        <w:sz w:val="20"/>
+      </w:rPr>
+    </w:lvl>
+    <w:lvl w:ilvl="5" w:tentative="1">
+      <w:start w:val="1"/>
+      <w:numFmt w:val="bullet"/>
+      <w:lvlText w:val=""/>
+      <w:lvlJc w:val="left"/>
+      <w:pPr>
+        <w:tabs>
+          <w:tab w:val="num" w:pos="4320"/>
+        </w:tabs>
+        <w:ind w:left="4320" w:hanging="360"/>
+      </w:pPr>
+      <w:rPr>
+        <w:rFonts w:ascii="Wingdings" w:hAnsi="Wingdings" w:hint="default"/>
+        <w:sz w:val="20"/>
+      </w:rPr>
+    </w:lvl>
+    <w:lvl w:ilvl="6" w:tentative="1">
+      <w:start w:val="1"/>
+      <w:numFmt w:val="bullet"/>
+      <w:lvlText w:val=""/>
+      <w:lvlJc w:val="left"/>
+      <w:pPr>
+        <w:tabs>
+          <w:tab w:val="num" w:pos="5040"/>
+        </w:tabs>
+        <w:ind w:left="5040" w:hanging="360"/>
+      </w:pPr>
+      <w:rPr>
+        <w:rFonts w:ascii="Wingdings" w:hAnsi="Wingdings" w:hint="default"/>
+        <w:sz w:val="20"/>
+      </w:rPr>
+    </w:lvl>
+    <w:lvl w:ilvl="7" w:tentative="1">
+      <w:start w:val="1"/>
+      <w:numFmt w:val="bullet"/>
+      <w:lvlText w:val=""/>
+      <w:lvlJc w:val="left"/>
+      <w:pPr>
+        <w:tabs>
+          <w:tab w:val="num" w:pos="5760"/>
+        </w:tabs>
+        <w:ind w:left="5760" w:hanging="360"/>
+      </w:pPr>
+      <w:rPr>
+        <w:rFonts w:ascii="Wingdings" w:hAnsi="Wingdings" w:hint="default"/>
+        <w:sz w:val="20"/>
+      </w:rPr>
+    </w:lvl>
+    <w:lvl w:ilvl="8" w:tentative="1">
+      <w:start w:val="1"/>
+      <w:numFmt w:val="bullet"/>
+      <w:lvlText w:val=""/>
+      <w:lvlJc w:val="left"/>
+      <w:pPr>
+        <w:tabs>
+          <w:tab w:val="num" w:pos="6480"/>
+        </w:tabs>
+        <w:ind w:left="6480" w:hanging="360"/>
+      </w:pPr>
+      <w:rPr>
+        <w:rFonts w:ascii="Wingdings" w:hAnsi="Wingdings" w:hint="default"/>
+        <w:sz w:val="20"/>
+      </w:rPr>
+    </w:lvl>
+  </w:abstractNum>
+  <w:abstractNum w:abstractNumId="5" w15:restartNumberingAfterBreak="0">
+    <w:nsid w:val="7CDA046C"/>
+    <w:multiLevelType w:val="multilevel"/>
+    <w:tmpl w:val="991C4EB0"/>
+    <w:lvl w:ilvl="0">
+      <w:start w:val="1"/>
+      <w:numFmt w:val="decimal"/>
+      <w:lvlText w:val="%1."/>
+      <w:lvlJc w:val="left"/>
+      <w:pPr>
+        <w:tabs>
+          <w:tab w:val="num" w:pos="720"/>
+        </w:tabs>
+        <w:ind w:left="720" w:hanging="360"/>
+      </w:pPr>
+    </w:lvl>
+    <w:lvl w:ilvl="1" w:tentative="1">
+      <w:start w:val="1"/>
+      <w:numFmt w:val="decimal"/>
+      <w:lvlText w:val="%2."/>
+      <w:lvlJc w:val="left"/>
+      <w:pPr>
+        <w:tabs>
+          <w:tab w:val="num" w:pos="1440"/>
+        </w:tabs>
+        <w:ind w:left="1440" w:hanging="360"/>
+      </w:pPr>
+    </w:lvl>
+    <w:lvl w:ilvl="2" w:tentative="1">
+      <w:start w:val="1"/>
+      <w:numFmt w:val="decimal"/>
+      <w:lvlText w:val="%3."/>
+      <w:lvlJc w:val="left"/>
+      <w:pPr>
+        <w:tabs>
+          <w:tab w:val="num" w:pos="2160"/>
+        </w:tabs>
+        <w:ind w:left="2160" w:hanging="360"/>
+      </w:pPr>
+    </w:lvl>
+    <w:lvl w:ilvl="3" w:tentative="1">
+      <w:start w:val="1"/>
+      <w:numFmt w:val="decimal"/>
+      <w:lvlText w:val="%4."/>
+      <w:lvlJc w:val="left"/>
+      <w:pPr>
+        <w:tabs>
+          <w:tab w:val="num" w:pos="2880"/>
+        </w:tabs>
+        <w:ind w:left="2880" w:hanging="360"/>
+      </w:pPr>
+    </w:lvl>
+    <w:lvl w:ilvl="4" w:tentative="1">
+      <w:start w:val="1"/>
+      <w:numFmt w:val="decimal"/>
+      <w:lvlText w:val="%5."/>
+      <w:lvlJc w:val="left"/>
+      <w:pPr>
+        <w:tabs>
+          <w:tab w:val="num" w:pos="3600"/>
+        </w:tabs>
+        <w:ind w:left="3600" w:hanging="360"/>
+      </w:pPr>
+    </w:lvl>
+    <w:lvl w:ilvl="5" w:tentative="1">
+      <w:start w:val="1"/>
+      <w:numFmt w:val="decimal"/>
+      <w:lvlText w:val="%6."/>
+      <w:lvlJc w:val="left"/>
+      <w:pPr>
+        <w:tabs>
+          <w:tab w:val="num" w:pos="4320"/>
+        </w:tabs>
+        <w:ind w:left="4320" w:hanging="360"/>
+      </w:pPr>
+    </w:lvl>
+    <w:lvl w:ilvl="6" w:tentative="1">
+      <w:start w:val="1"/>
+      <w:numFmt w:val="decimal"/>
+      <w:lvlText w:val="%7."/>
+      <w:lvlJc w:val="left"/>
+      <w:pPr>
+        <w:tabs>
+          <w:tab w:val="num" w:pos="5040"/>
+        </w:tabs>
+        <w:ind w:left="5040" w:hanging="360"/>
+      </w:pPr>
+    </w:lvl>
+    <w:lvl w:ilvl="7" w:tentative="1">
+      <w:start w:val="1"/>
+      <w:numFmt w:val="decimal"/>
+      <w:lvlText w:val="%8."/>
+      <w:lvlJc w:val="left"/>
+      <w:pPr>
+        <w:tabs>
+          <w:tab w:val="num" w:pos="5760"/>
+        </w:tabs>
+        <w:ind w:left="5760" w:hanging="360"/>
+      </w:pPr>
+    </w:lvl>
+    <w:lvl w:ilvl="8" w:tentative="1">
+      <w:start w:val="1"/>
+      <w:numFmt w:val="decimal"/>
+      <w:lvlText w:val="%9."/>
+      <w:lvlJc w:val="left"/>
+      <w:pPr>
+        <w:tabs>
+          <w:tab w:val="num" w:pos="6480"/>
+        </w:tabs>
+        <w:ind w:left="6480" w:hanging="360"/>
+      </w:pPr>
+    </w:lvl>
+  </w:abstractNum>
+  <w:num w:numId="1" w16cid:durableId="1117718701">
     <w:abstractNumId w:val="0"/>
   </w:num>
-  <w:num w:numId="2">
+  <w:num w:numId="2" w16cid:durableId="920676903">
+    <w:abstractNumId w:val="2"/>
+  </w:num>
+  <w:num w:numId="3" w16cid:durableId="604926802">
+    <w:abstractNumId w:val="3"/>
+  </w:num>
+  <w:num w:numId="4" w16cid:durableId="296223826">
+    <w:abstractNumId w:val="5"/>
+  </w:num>
+  <w:num w:numId="5" w16cid:durableId="913320325">
+    <w:abstractNumId w:val="4"/>
+  </w:num>
+  <w:num w:numId="6" w16cid:durableId="1006715422">
     <w:abstractNumId w:val="1"/>
-  </w:num>
-  <w:num w:numId="3">
-    <w:abstractNumId w:val="2"/>
   </w:num>
 </w:numbering>
 </file>
 
 <file path=word/styles.xml><?xml version="1.0" encoding="utf-8"?>
-<w:styles xmlns:mc="http://schemas.openxmlformats.org/markup-compatibility/2006" xmlns:r="http://schemas.openxmlformats.org/officeDocument/2006/relationships" xmlns:w="http://schemas.openxmlformats.org/wordprocessingml/2006/main" xmlns:w14="http://schemas.microsoft.com/office/word/2010/wordml" xmlns:w15="http://schemas.microsoft.com/office/word/2012/wordml" xmlns:w16cid="http://schemas.microsoft.com/office/word/2016/wordml/cid" xmlns:w16se="http://schemas.microsoft.com/office/word/2015/wordml/symex" mc:Ignorable="w14 w15 w16se w16cid">
+<w:styles xmlns:mc="http://schemas.openxmlformats.org/markup-compatibility/2006" xmlns:r="http://schemas.openxmlformats.org/officeDocument/2006/relationships" xmlns:w="http://schemas.openxmlformats.org/wordprocessingml/2006/main" xmlns:w14="http://schemas.microsoft.com/office/word/2010/wordml" xmlns:w15="http://schemas.microsoft.com/office/word/2012/wordml" xmlns:w16cex="http://schemas.microsoft.com/office/word/2018/wordml/cex" xmlns:w16cid="http://schemas.microsoft.com/office/word/2016/wordml/cid" xmlns:w16="http://schemas.microsoft.com/office/word/2018/wordml" xmlns:w16sdtdh="http://schemas.microsoft.com/office/word/2020/wordml/sdtdatahash" xmlns:w16sdtfl="http://schemas.microsoft.com/office/word/2024/wordml/sdtformatlock" xmlns:w16se="http://schemas.microsoft.com/office/word/2015/wordml/symex" xmlns:w16du="http://schemas.microsoft.com/office/word/2023/wordml/word16du" mc:Ignorable="w14 w15 w16se w16cid w16 w16cex w16sdtdh w16sdtfl w16du">
   <w:docDefaults>
     <w:rPrDefault>
       <w:rPr>
@@ -1166,7 +4740,7 @@
       </w:pPr>
     </w:pPrDefault>
   </w:docDefaults>
-  <w:latentStyles w:defLockedState="0" w:defUIPriority="99" w:defSemiHidden="0" w:defUnhideWhenUsed="0" w:defQFormat="0" w:count="375">
+  <w:latentStyles w:defLockedState="0" w:defUIPriority="99" w:defSemiHidden="0" w:defUnhideWhenUsed="0" w:defQFormat="0" w:count="376">
     <w:lsdException w:name="Normal" w:uiPriority="0" w:qFormat="1"/>
     <w:lsdException w:name="heading 1" w:uiPriority="9" w:qFormat="1"/>
     <w:lsdException w:name="heading 2" w:semiHidden="1" w:uiPriority="9" w:unhideWhenUsed="1" w:qFormat="1"/>
@@ -1542,6 +5116,7 @@
     <w:lsdException w:name="Smart Hyperlink" w:semiHidden="1" w:unhideWhenUsed="1"/>
     <w:lsdException w:name="Hashtag" w:semiHidden="1" w:unhideWhenUsed="1"/>
     <w:lsdException w:name="Unresolved Mention" w:semiHidden="1" w:unhideWhenUsed="1"/>
+    <w:lsdException w:name="Smart Link" w:semiHidden="1" w:unhideWhenUsed="1"/>
   </w:latentStyles>
   <w:style w:type="paragraph" w:default="1" w:styleId="a">
     <w:name w:val="Normal"/>
@@ -1623,7 +5198,6 @@
   <w:style w:type="character" w:default="1" w:styleId="a1">
     <w:name w:val="Default Paragraph Font"/>
     <w:uiPriority w:val="1"/>
-    <w:semiHidden/>
     <w:unhideWhenUsed/>
   </w:style>
   <w:style w:type="table" w:default="1" w:styleId="a2">
@@ -1728,6 +5302,11 @@
         <w:insideV w:val="single" w:sz="4" w:space="0" w:color="auto"/>
       </w:tblBorders>
     </w:tblPr>
+  </w:style>
+  <w:style w:type="character" w:customStyle="1" w:styleId="font-semibold">
+    <w:name w:val="font-semibold"/>
+    <w:basedOn w:val="a1"/>
+    <w:rsid w:val="00357A9B"/>
   </w:style>
 </w:styles>
 </file>

</xml_diff>

<commit_message>
docs: update 28nm synthesis summary; add experiment-method notes
</commit_message>
<xml_diff>
--- a/汇总28nm综合结果.docx
+++ b/汇总28nm综合结果.docx
@@ -755,11 +755,6 @@
       </w:pPr>
     </w:p>
     <w:p>
-      <w:pPr>
-        <w:rPr>
-          <w:rFonts w:hint="eastAsia"/>
-        </w:rPr>
-      </w:pPr>
       <w:r>
         <w:rPr>
           <w:rFonts w:hint="eastAsia"/>
@@ -794,26 +789,27 @@
     <w:tbl>
       <w:tblPr>
         <w:tblStyle w:val="a5"/>
-        <w:tblW w:w="8500" w:type="dxa"/>
+        <w:tblW w:w="9231" w:type="dxa"/>
         <w:tblLook w:val="04A0" w:firstRow="1" w:lastRow="0" w:firstColumn="1" w:lastColumn="0" w:noHBand="0" w:noVBand="1"/>
       </w:tblPr>
       <w:tblGrid>
-        <w:gridCol w:w="2630"/>
-        <w:gridCol w:w="2502"/>
-        <w:gridCol w:w="1660"/>
-        <w:gridCol w:w="1708"/>
+        <w:gridCol w:w="2629"/>
+        <w:gridCol w:w="1697"/>
+        <w:gridCol w:w="1565"/>
+        <w:gridCol w:w="1565"/>
+        <w:gridCol w:w="1775"/>
       </w:tblGrid>
       <w:tr>
-        <w:tc>
-          <w:tcPr>
-            <w:tcW w:w="988" w:type="dxa"/>
-          </w:tcPr>
-          <w:p>
-            <w:pPr>
-              <w:ind w:firstLine="0"/>
-              <w:rPr>
-                <w:rFonts w:hint="eastAsia"/>
-              </w:rPr>
+        <w:trPr>
+          <w:trHeight w:val="812"/>
+        </w:trPr>
+        <w:tc>
+          <w:tcPr>
+            <w:tcW w:w="2378" w:type="dxa"/>
+          </w:tcPr>
+          <w:p>
+            <w:pPr>
+              <w:ind w:firstLine="0"/>
             </w:pPr>
             <w:r>
               <w:rPr>
@@ -825,14 +821,11 @@
         </w:tc>
         <w:tc>
           <w:tcPr>
-            <w:tcW w:w="3882" w:type="dxa"/>
-          </w:tcPr>
-          <w:p>
-            <w:pPr>
-              <w:ind w:firstLine="0"/>
-              <w:rPr>
-                <w:rFonts w:hint="eastAsia"/>
-              </w:rPr>
+            <w:tcW w:w="1846" w:type="dxa"/>
+          </w:tcPr>
+          <w:p>
+            <w:pPr>
+              <w:ind w:firstLine="0"/>
             </w:pPr>
             <w:r>
               <w:rPr>
@@ -844,14 +837,11 @@
         </w:tc>
         <w:tc>
           <w:tcPr>
-            <w:tcW w:w="1765" w:type="dxa"/>
-          </w:tcPr>
-          <w:p>
-            <w:pPr>
-              <w:ind w:firstLine="0"/>
-              <w:rPr>
-                <w:rFonts w:hint="eastAsia"/>
-              </w:rPr>
+            <w:tcW w:w="1538" w:type="dxa"/>
+          </w:tcPr>
+          <w:p>
+            <w:pPr>
+              <w:ind w:firstLine="0"/>
             </w:pPr>
             <w:proofErr w:type="spellStart"/>
             <w:r>
@@ -880,14 +870,11 @@
         </w:tc>
         <w:tc>
           <w:tcPr>
-            <w:tcW w:w="1865" w:type="dxa"/>
-          </w:tcPr>
-          <w:p>
-            <w:pPr>
-              <w:ind w:firstLine="0"/>
-              <w:rPr>
-                <w:rFonts w:hint="eastAsia"/>
-              </w:rPr>
+            <w:tcW w:w="1415" w:type="dxa"/>
+          </w:tcPr>
+          <w:p>
+            <w:pPr>
+              <w:ind w:firstLine="0"/>
             </w:pPr>
             <w:proofErr w:type="spellStart"/>
             <w:r>
@@ -925,21 +912,52 @@
                 <w:rFonts w:hint="eastAsia"/>
               </w:rPr>
               <w:t>)</w:t>
+            </w:r>
+          </w:p>
+        </w:tc>
+        <w:tc>
+          <w:tcPr>
+            <w:tcW w:w="2054" w:type="dxa"/>
+          </w:tcPr>
+          <w:p>
+            <w:pPr>
+              <w:ind w:firstLine="0"/>
+              <w:rPr>
+                <w:rFonts w:hint="eastAsia"/>
+              </w:rPr>
+            </w:pPr>
+            <w:r>
+              <w:rPr>
+                <w:rFonts w:hint="eastAsia"/>
+              </w:rPr>
+              <w:t>实测功耗（</w:t>
+            </w:r>
+            <w:r>
+              <w:rPr>
+                <w:rFonts w:hint="eastAsia"/>
+              </w:rPr>
+              <w:t>W</w:t>
+            </w:r>
+            <w:r>
+              <w:rPr>
+                <w:rFonts w:hint="eastAsia"/>
+              </w:rPr>
+              <w:t>）</w:t>
             </w:r>
           </w:p>
         </w:tc>
       </w:tr>
       <w:tr>
-        <w:tc>
-          <w:tcPr>
-            <w:tcW w:w="988" w:type="dxa"/>
-          </w:tcPr>
-          <w:p>
-            <w:pPr>
-              <w:ind w:firstLine="0"/>
-              <w:rPr>
-                <w:rFonts w:hint="eastAsia"/>
-              </w:rPr>
+        <w:trPr>
+          <w:trHeight w:val="544"/>
+        </w:trPr>
+        <w:tc>
+          <w:tcPr>
+            <w:tcW w:w="2378" w:type="dxa"/>
+          </w:tcPr>
+          <w:p>
+            <w:pPr>
+              <w:ind w:firstLine="0"/>
             </w:pPr>
             <w:r>
               <w:rPr>
@@ -951,14 +969,11 @@
         </w:tc>
         <w:tc>
           <w:tcPr>
-            <w:tcW w:w="3882" w:type="dxa"/>
-          </w:tcPr>
-          <w:p>
-            <w:pPr>
-              <w:ind w:firstLine="0"/>
-              <w:rPr>
-                <w:rFonts w:hint="eastAsia"/>
-              </w:rPr>
+            <w:tcW w:w="1846" w:type="dxa"/>
+          </w:tcPr>
+          <w:p>
+            <w:pPr>
+              <w:ind w:firstLine="0"/>
             </w:pPr>
             <w:r>
               <w:rPr>
@@ -982,14 +997,11 @@
         </w:tc>
         <w:tc>
           <w:tcPr>
-            <w:tcW w:w="1765" w:type="dxa"/>
-          </w:tcPr>
-          <w:p>
-            <w:pPr>
-              <w:ind w:firstLine="0"/>
-              <w:rPr>
-                <w:rFonts w:hint="eastAsia"/>
-              </w:rPr>
+            <w:tcW w:w="1538" w:type="dxa"/>
+          </w:tcPr>
+          <w:p>
+            <w:pPr>
+              <w:ind w:firstLine="0"/>
             </w:pPr>
             <w:r>
               <w:rPr>
@@ -1001,35 +1013,48 @@
         </w:tc>
         <w:tc>
           <w:tcPr>
-            <w:tcW w:w="1865" w:type="dxa"/>
-          </w:tcPr>
-          <w:p>
-            <w:pPr>
-              <w:ind w:firstLine="0"/>
-              <w:rPr>
-                <w:rFonts w:hint="eastAsia"/>
-              </w:rPr>
+            <w:tcW w:w="1415" w:type="dxa"/>
+          </w:tcPr>
+          <w:p>
+            <w:pPr>
+              <w:ind w:firstLine="0"/>
             </w:pPr>
             <w:r>
               <w:rPr>
                 <w:rFonts w:hint="eastAsia"/>
               </w:rPr>
               <w:t>39.41</w:t>
+            </w:r>
+          </w:p>
+        </w:tc>
+        <w:tc>
+          <w:tcPr>
+            <w:tcW w:w="2054" w:type="dxa"/>
+          </w:tcPr>
+          <w:p>
+            <w:pPr>
+              <w:ind w:firstLine="0"/>
+              <w:rPr>
+                <w:rFonts w:hint="eastAsia"/>
+              </w:rPr>
+            </w:pPr>
+            <w:r>
+              <w:t>0.0554</w:t>
             </w:r>
           </w:p>
         </w:tc>
       </w:tr>
       <w:tr>
-        <w:tc>
-          <w:tcPr>
-            <w:tcW w:w="988" w:type="dxa"/>
-          </w:tcPr>
-          <w:p>
-            <w:pPr>
-              <w:ind w:firstLine="0"/>
-              <w:rPr>
-                <w:rFonts w:hint="eastAsia"/>
-              </w:rPr>
+        <w:trPr>
+          <w:trHeight w:val="812"/>
+        </w:trPr>
+        <w:tc>
+          <w:tcPr>
+            <w:tcW w:w="2378" w:type="dxa"/>
+          </w:tcPr>
+          <w:p>
+            <w:pPr>
+              <w:ind w:firstLine="0"/>
             </w:pPr>
             <w:r>
               <w:rPr>
@@ -1041,14 +1066,11 @@
         </w:tc>
         <w:tc>
           <w:tcPr>
-            <w:tcW w:w="3882" w:type="dxa"/>
-          </w:tcPr>
-          <w:p>
-            <w:pPr>
-              <w:ind w:firstLine="0"/>
-              <w:rPr>
-                <w:rFonts w:hint="eastAsia"/>
-              </w:rPr>
+            <w:tcW w:w="1846" w:type="dxa"/>
+          </w:tcPr>
+          <w:p>
+            <w:pPr>
+              <w:ind w:firstLine="0"/>
             </w:pPr>
             <w:r>
               <w:rPr>
@@ -1084,14 +1106,11 @@
         </w:tc>
         <w:tc>
           <w:tcPr>
-            <w:tcW w:w="1765" w:type="dxa"/>
-          </w:tcPr>
-          <w:p>
-            <w:pPr>
-              <w:ind w:firstLine="0"/>
-              <w:rPr>
-                <w:rFonts w:hint="eastAsia"/>
-              </w:rPr>
+            <w:tcW w:w="1538" w:type="dxa"/>
+          </w:tcPr>
+          <w:p>
+            <w:pPr>
+              <w:ind w:firstLine="0"/>
             </w:pPr>
             <w:r>
               <w:rPr>
@@ -1103,35 +1122,48 @@
         </w:tc>
         <w:tc>
           <w:tcPr>
-            <w:tcW w:w="1865" w:type="dxa"/>
-          </w:tcPr>
-          <w:p>
-            <w:pPr>
-              <w:ind w:firstLine="0"/>
-              <w:rPr>
-                <w:rFonts w:hint="eastAsia"/>
-              </w:rPr>
+            <w:tcW w:w="1415" w:type="dxa"/>
+          </w:tcPr>
+          <w:p>
+            <w:pPr>
+              <w:ind w:firstLine="0"/>
             </w:pPr>
             <w:r>
               <w:rPr>
                 <w:rFonts w:hint="eastAsia"/>
               </w:rPr>
               <w:t>6.029</w:t>
+            </w:r>
+          </w:p>
+        </w:tc>
+        <w:tc>
+          <w:tcPr>
+            <w:tcW w:w="2054" w:type="dxa"/>
+          </w:tcPr>
+          <w:p>
+            <w:pPr>
+              <w:ind w:firstLine="0"/>
+              <w:rPr>
+                <w:rFonts w:hint="eastAsia"/>
+              </w:rPr>
+            </w:pPr>
+            <w:r>
+              <w:t>0.0132</w:t>
             </w:r>
           </w:p>
         </w:tc>
       </w:tr>
       <w:tr>
-        <w:tc>
-          <w:tcPr>
-            <w:tcW w:w="988" w:type="dxa"/>
-          </w:tcPr>
-          <w:p>
-            <w:pPr>
-              <w:ind w:firstLine="0"/>
-              <w:rPr>
-                <w:rFonts w:hint="eastAsia"/>
-              </w:rPr>
+        <w:trPr>
+          <w:trHeight w:val="544"/>
+        </w:trPr>
+        <w:tc>
+          <w:tcPr>
+            <w:tcW w:w="2378" w:type="dxa"/>
+          </w:tcPr>
+          <w:p>
+            <w:pPr>
+              <w:ind w:firstLine="0"/>
             </w:pPr>
             <w:r>
               <w:rPr>
@@ -1143,14 +1175,11 @@
         </w:tc>
         <w:tc>
           <w:tcPr>
-            <w:tcW w:w="3882" w:type="dxa"/>
-          </w:tcPr>
-          <w:p>
-            <w:pPr>
-              <w:ind w:firstLine="0"/>
-              <w:rPr>
-                <w:rFonts w:hint="eastAsia"/>
-              </w:rPr>
+            <w:tcW w:w="1846" w:type="dxa"/>
+          </w:tcPr>
+          <w:p>
+            <w:pPr>
+              <w:ind w:firstLine="0"/>
             </w:pPr>
             <w:r>
               <w:rPr>
@@ -1174,14 +1203,11 @@
         </w:tc>
         <w:tc>
           <w:tcPr>
-            <w:tcW w:w="1765" w:type="dxa"/>
-          </w:tcPr>
-          <w:p>
-            <w:pPr>
-              <w:ind w:firstLine="0"/>
-              <w:rPr>
-                <w:rFonts w:hint="eastAsia"/>
-              </w:rPr>
+            <w:tcW w:w="1538" w:type="dxa"/>
+          </w:tcPr>
+          <w:p>
+            <w:pPr>
+              <w:ind w:firstLine="0"/>
             </w:pPr>
             <w:r>
               <w:rPr>
@@ -1193,35 +1219,48 @@
         </w:tc>
         <w:tc>
           <w:tcPr>
-            <w:tcW w:w="1865" w:type="dxa"/>
-          </w:tcPr>
-          <w:p>
-            <w:pPr>
-              <w:ind w:firstLine="0"/>
-              <w:rPr>
-                <w:rFonts w:hint="eastAsia"/>
-              </w:rPr>
+            <w:tcW w:w="1415" w:type="dxa"/>
+          </w:tcPr>
+          <w:p>
+            <w:pPr>
+              <w:ind w:firstLine="0"/>
             </w:pPr>
             <w:r>
               <w:rPr>
                 <w:rFonts w:hint="eastAsia"/>
               </w:rPr>
               <w:t>5.44</w:t>
+            </w:r>
+          </w:p>
+        </w:tc>
+        <w:tc>
+          <w:tcPr>
+            <w:tcW w:w="2054" w:type="dxa"/>
+          </w:tcPr>
+          <w:p>
+            <w:pPr>
+              <w:ind w:firstLine="0"/>
+              <w:rPr>
+                <w:rFonts w:hint="eastAsia"/>
+              </w:rPr>
+            </w:pPr>
+            <w:r>
+              <w:t>0.0135</w:t>
             </w:r>
           </w:p>
         </w:tc>
       </w:tr>
       <w:tr>
-        <w:tc>
-          <w:tcPr>
-            <w:tcW w:w="988" w:type="dxa"/>
-          </w:tcPr>
-          <w:p>
-            <w:pPr>
-              <w:ind w:firstLine="0"/>
-              <w:rPr>
-                <w:rFonts w:hint="eastAsia"/>
-              </w:rPr>
+        <w:trPr>
+          <w:trHeight w:val="544"/>
+        </w:trPr>
+        <w:tc>
+          <w:tcPr>
+            <w:tcW w:w="2378" w:type="dxa"/>
+          </w:tcPr>
+          <w:p>
+            <w:pPr>
+              <w:ind w:firstLine="0"/>
             </w:pPr>
             <w:r>
               <w:rPr>
@@ -1233,14 +1272,11 @@
         </w:tc>
         <w:tc>
           <w:tcPr>
-            <w:tcW w:w="3882" w:type="dxa"/>
-          </w:tcPr>
-          <w:p>
-            <w:pPr>
-              <w:ind w:firstLine="0"/>
-              <w:rPr>
-                <w:rFonts w:hint="eastAsia"/>
-              </w:rPr>
+            <w:tcW w:w="1846" w:type="dxa"/>
+          </w:tcPr>
+          <w:p>
+            <w:pPr>
+              <w:ind w:firstLine="0"/>
             </w:pPr>
             <w:r>
               <w:rPr>
@@ -1264,14 +1300,11 @@
         </w:tc>
         <w:tc>
           <w:tcPr>
-            <w:tcW w:w="1765" w:type="dxa"/>
-          </w:tcPr>
-          <w:p>
-            <w:pPr>
-              <w:ind w:firstLine="0"/>
-              <w:rPr>
-                <w:rFonts w:hint="eastAsia"/>
-              </w:rPr>
+            <w:tcW w:w="1538" w:type="dxa"/>
+          </w:tcPr>
+          <w:p>
+            <w:pPr>
+              <w:ind w:firstLine="0"/>
             </w:pPr>
             <w:r>
               <w:rPr>
@@ -1283,35 +1316,48 @@
         </w:tc>
         <w:tc>
           <w:tcPr>
-            <w:tcW w:w="1865" w:type="dxa"/>
-          </w:tcPr>
-          <w:p>
-            <w:pPr>
-              <w:ind w:firstLine="0"/>
-              <w:rPr>
-                <w:rFonts w:hint="eastAsia"/>
-              </w:rPr>
+            <w:tcW w:w="1415" w:type="dxa"/>
+          </w:tcPr>
+          <w:p>
+            <w:pPr>
+              <w:ind w:firstLine="0"/>
             </w:pPr>
             <w:r>
               <w:rPr>
                 <w:rFonts w:hint="eastAsia"/>
               </w:rPr>
               <w:t>5.869</w:t>
+            </w:r>
+          </w:p>
+        </w:tc>
+        <w:tc>
+          <w:tcPr>
+            <w:tcW w:w="2054" w:type="dxa"/>
+          </w:tcPr>
+          <w:p>
+            <w:pPr>
+              <w:ind w:firstLine="0"/>
+              <w:rPr>
+                <w:rFonts w:hint="eastAsia"/>
+              </w:rPr>
+            </w:pPr>
+            <w:r>
+              <w:t>0.0157</w:t>
             </w:r>
           </w:p>
         </w:tc>
       </w:tr>
       <w:tr>
-        <w:tc>
-          <w:tcPr>
-            <w:tcW w:w="988" w:type="dxa"/>
-          </w:tcPr>
-          <w:p>
-            <w:pPr>
-              <w:ind w:firstLine="0"/>
-              <w:rPr>
-                <w:rFonts w:hint="eastAsia"/>
-              </w:rPr>
+        <w:trPr>
+          <w:trHeight w:val="544"/>
+        </w:trPr>
+        <w:tc>
+          <w:tcPr>
+            <w:tcW w:w="2378" w:type="dxa"/>
+          </w:tcPr>
+          <w:p>
+            <w:pPr>
+              <w:ind w:firstLine="0"/>
             </w:pPr>
             <w:r>
               <w:rPr>
@@ -1323,14 +1369,11 @@
         </w:tc>
         <w:tc>
           <w:tcPr>
-            <w:tcW w:w="3882" w:type="dxa"/>
-          </w:tcPr>
-          <w:p>
-            <w:pPr>
-              <w:ind w:firstLine="0"/>
-              <w:rPr>
-                <w:rFonts w:hint="eastAsia"/>
-              </w:rPr>
+            <w:tcW w:w="1846" w:type="dxa"/>
+          </w:tcPr>
+          <w:p>
+            <w:pPr>
+              <w:ind w:firstLine="0"/>
             </w:pPr>
             <w:r>
               <w:rPr>
@@ -1354,14 +1397,11 @@
         </w:tc>
         <w:tc>
           <w:tcPr>
-            <w:tcW w:w="1765" w:type="dxa"/>
-          </w:tcPr>
-          <w:p>
-            <w:pPr>
-              <w:ind w:firstLine="0"/>
-              <w:rPr>
-                <w:rFonts w:hint="eastAsia"/>
-              </w:rPr>
+            <w:tcW w:w="1538" w:type="dxa"/>
+          </w:tcPr>
+          <w:p>
+            <w:pPr>
+              <w:ind w:firstLine="0"/>
             </w:pPr>
             <w:r>
               <w:rPr>
@@ -1373,7 +1413,7 @@
         </w:tc>
         <w:tc>
           <w:tcPr>
-            <w:tcW w:w="1865" w:type="dxa"/>
+            <w:tcW w:w="1415" w:type="dxa"/>
           </w:tcPr>
           <w:p>
             <w:pPr>
@@ -1384,17 +1424,849 @@
                 <w:rFonts w:hint="eastAsia"/>
               </w:rPr>
               <w:t>5.160</w:t>
+            </w:r>
+          </w:p>
+        </w:tc>
+        <w:tc>
+          <w:tcPr>
+            <w:tcW w:w="2054" w:type="dxa"/>
+          </w:tcPr>
+          <w:p>
+            <w:pPr>
+              <w:ind w:firstLine="0"/>
+              <w:rPr>
+                <w:rFonts w:hint="eastAsia"/>
+              </w:rPr>
+            </w:pPr>
+            <w:r>
+              <w:t>0.0136</w:t>
             </w:r>
           </w:p>
         </w:tc>
       </w:tr>
     </w:tbl>
     <w:p>
-      <w:r>
-        <w:rPr>
-          <w:rFonts w:hint="eastAsia"/>
-        </w:rPr>
-        <w:t>担心：目前版本太简单了。是否可以做一个调度</w:t>
+      <w:pPr>
+        <w:rPr>
+          <w:rFonts w:hint="eastAsia"/>
+        </w:rPr>
+      </w:pPr>
+      <w:r>
+        <w:rPr>
+          <w:rFonts w:hint="eastAsia"/>
+        </w:rPr>
+        <w:t>动态功耗</w:t>
+      </w:r>
+    </w:p>
+    <w:tbl>
+      <w:tblPr>
+        <w:tblStyle w:val="a5"/>
+        <w:tblW w:w="0" w:type="auto"/>
+        <w:tblLook w:val="04A0" w:firstRow="1" w:lastRow="0" w:firstColumn="1" w:lastColumn="0" w:noHBand="0" w:noVBand="1"/>
+      </w:tblPr>
+      <w:tblGrid>
+        <w:gridCol w:w="826"/>
+        <w:gridCol w:w="1116"/>
+        <w:gridCol w:w="1116"/>
+        <w:gridCol w:w="950"/>
+        <w:gridCol w:w="1150"/>
+        <w:gridCol w:w="949"/>
+        <w:gridCol w:w="904"/>
+      </w:tblGrid>
+      <w:tr>
+        <w:tc>
+          <w:tcPr>
+            <w:tcW w:w="826" w:type="dxa"/>
+          </w:tcPr>
+          <w:p>
+            <w:pPr>
+              <w:ind w:firstLine="0"/>
+            </w:pPr>
+            <w:r>
+              <w:t xml:space="preserve"> exp </w:t>
+            </w:r>
+          </w:p>
+        </w:tc>
+        <w:tc>
+          <w:tcPr>
+            <w:tcW w:w="1116" w:type="dxa"/>
+          </w:tcPr>
+          <w:p>
+            <w:pPr>
+              <w:ind w:firstLine="0"/>
+            </w:pPr>
+            <w:r>
+              <w:t xml:space="preserve">active ns </w:t>
+            </w:r>
+          </w:p>
+        </w:tc>
+        <w:tc>
+          <w:tcPr>
+            <w:tcW w:w="1116" w:type="dxa"/>
+          </w:tcPr>
+          <w:p>
+            <w:pPr>
+              <w:ind w:firstLine="0"/>
+            </w:pPr>
+            <w:r>
+              <w:t xml:space="preserve">dynamic W </w:t>
+            </w:r>
+          </w:p>
+        </w:tc>
+        <w:tc>
+          <w:tcPr>
+            <w:tcW w:w="950" w:type="dxa"/>
+          </w:tcPr>
+          <w:p>
+            <w:pPr>
+              <w:ind w:firstLine="0"/>
+            </w:pPr>
+            <w:r>
+              <w:t xml:space="preserve">internal W </w:t>
+            </w:r>
+          </w:p>
+        </w:tc>
+        <w:tc>
+          <w:tcPr>
+            <w:tcW w:w="1150" w:type="dxa"/>
+          </w:tcPr>
+          <w:p>
+            <w:pPr>
+              <w:ind w:firstLine="0"/>
+            </w:pPr>
+            <w:r>
+              <w:t xml:space="preserve">net switching W </w:t>
+            </w:r>
+          </w:p>
+        </w:tc>
+        <w:tc>
+          <w:tcPr>
+            <w:tcW w:w="949" w:type="dxa"/>
+          </w:tcPr>
+          <w:p>
+            <w:pPr>
+              <w:ind w:firstLine="0"/>
+            </w:pPr>
+            <w:r>
+              <w:t xml:space="preserve">leakage W </w:t>
+            </w:r>
+          </w:p>
+        </w:tc>
+        <w:tc>
+          <w:tcPr>
+            <w:tcW w:w="904" w:type="dxa"/>
+          </w:tcPr>
+          <w:p>
+            <w:pPr>
+              <w:ind w:firstLine="0"/>
+            </w:pPr>
+            <w:r>
+              <w:t xml:space="preserve">total W </w:t>
+            </w:r>
+          </w:p>
+        </w:tc>
+      </w:tr>
+      <w:tr>
+        <w:tc>
+          <w:tcPr>
+            <w:tcW w:w="826" w:type="dxa"/>
+          </w:tcPr>
+          <w:p>
+            <w:pPr>
+              <w:ind w:firstLine="0"/>
+            </w:pPr>
+            <w:r>
+              <w:lastRenderedPageBreak/>
+              <w:t xml:space="preserve"> exp0 </w:t>
+            </w:r>
+          </w:p>
+        </w:tc>
+        <w:tc>
+          <w:tcPr>
+            <w:tcW w:w="1116" w:type="dxa"/>
+          </w:tcPr>
+          <w:p>
+            <w:pPr>
+              <w:ind w:firstLine="0"/>
+            </w:pPr>
+            <w:r>
+              <w:t xml:space="preserve"> 5519.500 </w:t>
+            </w:r>
+          </w:p>
+        </w:tc>
+        <w:tc>
+          <w:tcPr>
+            <w:tcW w:w="1116" w:type="dxa"/>
+          </w:tcPr>
+          <w:p>
+            <w:pPr>
+              <w:ind w:firstLine="0"/>
+            </w:pPr>
+            <w:r>
+              <w:t xml:space="preserve"> 0.055225 </w:t>
+            </w:r>
+          </w:p>
+        </w:tc>
+        <w:tc>
+          <w:tcPr>
+            <w:tcW w:w="950" w:type="dxa"/>
+          </w:tcPr>
+          <w:p>
+            <w:pPr>
+              <w:ind w:firstLine="0"/>
+            </w:pPr>
+            <w:r>
+              <w:t xml:space="preserve"> 0.0552 </w:t>
+            </w:r>
+          </w:p>
+        </w:tc>
+        <w:tc>
+          <w:tcPr>
+            <w:tcW w:w="1150" w:type="dxa"/>
+          </w:tcPr>
+          <w:p>
+            <w:pPr>
+              <w:ind w:firstLine="0"/>
+            </w:pPr>
+            <w:r>
+              <w:t xml:space="preserve"> 2.497e-05 </w:t>
+            </w:r>
+          </w:p>
+        </w:tc>
+        <w:tc>
+          <w:tcPr>
+            <w:tcW w:w="949" w:type="dxa"/>
+          </w:tcPr>
+          <w:p>
+            <w:pPr>
+              <w:ind w:firstLine="0"/>
+            </w:pPr>
+            <w:r>
+              <w:t xml:space="preserve"> 2.071e-04 </w:t>
+            </w:r>
+          </w:p>
+        </w:tc>
+        <w:tc>
+          <w:tcPr>
+            <w:tcW w:w="904" w:type="dxa"/>
+          </w:tcPr>
+          <w:p>
+            <w:pPr>
+              <w:ind w:firstLine="0"/>
+            </w:pPr>
+            <w:r>
+              <w:t xml:space="preserve"> 0.0554 </w:t>
+            </w:r>
+          </w:p>
+        </w:tc>
+      </w:tr>
+      <w:tr>
+        <w:tc>
+          <w:tcPr>
+            <w:tcW w:w="826" w:type="dxa"/>
+          </w:tcPr>
+          <w:p>
+            <w:pPr>
+              <w:ind w:firstLine="0"/>
+            </w:pPr>
+            <w:r>
+              <w:t xml:space="preserve"> exp1 </w:t>
+            </w:r>
+          </w:p>
+        </w:tc>
+        <w:tc>
+          <w:tcPr>
+            <w:tcW w:w="1116" w:type="dxa"/>
+          </w:tcPr>
+          <w:p>
+            <w:pPr>
+              <w:ind w:firstLine="0"/>
+            </w:pPr>
+            <w:r>
+              <w:t xml:space="preserve"> 5522.500 </w:t>
+            </w:r>
+          </w:p>
+        </w:tc>
+        <w:tc>
+          <w:tcPr>
+            <w:tcW w:w="1116" w:type="dxa"/>
+          </w:tcPr>
+          <w:p>
+            <w:pPr>
+              <w:ind w:firstLine="0"/>
+            </w:pPr>
+            <w:r>
+              <w:t xml:space="preserve"> 0.013138 </w:t>
+            </w:r>
+          </w:p>
+        </w:tc>
+        <w:tc>
+          <w:tcPr>
+            <w:tcW w:w="950" w:type="dxa"/>
+          </w:tcPr>
+          <w:p>
+            <w:pPr>
+              <w:ind w:firstLine="0"/>
+            </w:pPr>
+            <w:r>
+              <w:t xml:space="preserve"> 0.0131 </w:t>
+            </w:r>
+          </w:p>
+        </w:tc>
+        <w:tc>
+          <w:tcPr>
+            <w:tcW w:w="1150" w:type="dxa"/>
+          </w:tcPr>
+          <w:p>
+            <w:pPr>
+              <w:ind w:firstLine="0"/>
+            </w:pPr>
+            <w:r>
+              <w:t xml:space="preserve"> 3.843e-05 </w:t>
+            </w:r>
+          </w:p>
+        </w:tc>
+        <w:tc>
+          <w:tcPr>
+            <w:tcW w:w="949" w:type="dxa"/>
+          </w:tcPr>
+          <w:p>
+            <w:pPr>
+              <w:ind w:firstLine="0"/>
+            </w:pPr>
+            <w:r>
+              <w:t xml:space="preserve"> 6.805e-05 </w:t>
+            </w:r>
+          </w:p>
+        </w:tc>
+        <w:tc>
+          <w:tcPr>
+            <w:tcW w:w="904" w:type="dxa"/>
+          </w:tcPr>
+          <w:p>
+            <w:pPr>
+              <w:ind w:firstLine="0"/>
+            </w:pPr>
+            <w:r>
+              <w:t xml:space="preserve"> 0.0132 </w:t>
+            </w:r>
+          </w:p>
+        </w:tc>
+      </w:tr>
+      <w:tr>
+        <w:tc>
+          <w:tcPr>
+            <w:tcW w:w="826" w:type="dxa"/>
+          </w:tcPr>
+          <w:p>
+            <w:pPr>
+              <w:ind w:firstLine="0"/>
+            </w:pPr>
+            <w:r>
+              <w:t xml:space="preserve"> exp2 </w:t>
+            </w:r>
+          </w:p>
+        </w:tc>
+        <w:tc>
+          <w:tcPr>
+            <w:tcW w:w="1116" w:type="dxa"/>
+          </w:tcPr>
+          <w:p>
+            <w:pPr>
+              <w:ind w:firstLine="0"/>
+            </w:pPr>
+            <w:r>
+              <w:t xml:space="preserve"> 5522.500 </w:t>
+            </w:r>
+          </w:p>
+        </w:tc>
+        <w:tc>
+          <w:tcPr>
+            <w:tcW w:w="1116" w:type="dxa"/>
+          </w:tcPr>
+          <w:p>
+            <w:pPr>
+              <w:ind w:firstLine="0"/>
+            </w:pPr>
+            <w:r>
+              <w:t xml:space="preserve"> 0.013435 </w:t>
+            </w:r>
+          </w:p>
+        </w:tc>
+        <w:tc>
+          <w:tcPr>
+            <w:tcW w:w="950" w:type="dxa"/>
+          </w:tcPr>
+          <w:p>
+            <w:pPr>
+              <w:ind w:firstLine="0"/>
+            </w:pPr>
+            <w:r>
+              <w:t xml:space="preserve"> 0.0133 </w:t>
+            </w:r>
+          </w:p>
+        </w:tc>
+        <w:tc>
+          <w:tcPr>
+            <w:tcW w:w="1150" w:type="dxa"/>
+          </w:tcPr>
+          <w:p>
+            <w:pPr>
+              <w:ind w:firstLine="0"/>
+            </w:pPr>
+            <w:r>
+              <w:t xml:space="preserve"> 1.345e-04 </w:t>
+            </w:r>
+          </w:p>
+        </w:tc>
+        <w:tc>
+          <w:tcPr>
+            <w:tcW w:w="949" w:type="dxa"/>
+          </w:tcPr>
+          <w:p>
+            <w:pPr>
+              <w:ind w:firstLine="0"/>
+            </w:pPr>
+            <w:r>
+              <w:t xml:space="preserve"> 5.785e-05 </w:t>
+            </w:r>
+          </w:p>
+        </w:tc>
+        <w:tc>
+          <w:tcPr>
+            <w:tcW w:w="904" w:type="dxa"/>
+          </w:tcPr>
+          <w:p>
+            <w:pPr>
+              <w:ind w:firstLine="0"/>
+            </w:pPr>
+            <w:r>
+              <w:t xml:space="preserve"> 0.0135 </w:t>
+            </w:r>
+          </w:p>
+        </w:tc>
+      </w:tr>
+      <w:tr>
+        <w:tc>
+          <w:tcPr>
+            <w:tcW w:w="826" w:type="dxa"/>
+          </w:tcPr>
+          <w:p>
+            <w:pPr>
+              <w:ind w:firstLine="0"/>
+            </w:pPr>
+            <w:r>
+              <w:t xml:space="preserve"> exp3 </w:t>
+            </w:r>
+          </w:p>
+        </w:tc>
+        <w:tc>
+          <w:tcPr>
+            <w:tcW w:w="1116" w:type="dxa"/>
+          </w:tcPr>
+          <w:p>
+            <w:pPr>
+              <w:ind w:firstLine="0"/>
+            </w:pPr>
+            <w:r>
+              <w:t xml:space="preserve"> 5615.500 </w:t>
+            </w:r>
+          </w:p>
+        </w:tc>
+        <w:tc>
+          <w:tcPr>
+            <w:tcW w:w="1116" w:type="dxa"/>
+          </w:tcPr>
+          <w:p>
+            <w:pPr>
+              <w:ind w:firstLine="0"/>
+            </w:pPr>
+            <w:r>
+              <w:t xml:space="preserve"> 0.015677 </w:t>
+            </w:r>
+          </w:p>
+        </w:tc>
+        <w:tc>
+          <w:tcPr>
+            <w:tcW w:w="950" w:type="dxa"/>
+          </w:tcPr>
+          <w:p>
+            <w:pPr>
+              <w:ind w:firstLine="0"/>
+            </w:pPr>
+            <w:r>
+              <w:t xml:space="preserve"> 0.0156 </w:t>
+            </w:r>
+          </w:p>
+        </w:tc>
+        <w:tc>
+          <w:tcPr>
+            <w:tcW w:w="1150" w:type="dxa"/>
+          </w:tcPr>
+          <w:p>
+            <w:pPr>
+              <w:ind w:firstLine="0"/>
+            </w:pPr>
+            <w:r>
+              <w:t xml:space="preserve"> 7.703e-05 </w:t>
+            </w:r>
+          </w:p>
+        </w:tc>
+        <w:tc>
+          <w:tcPr>
+            <w:tcW w:w="949" w:type="dxa"/>
+          </w:tcPr>
+          <w:p>
+            <w:pPr>
+              <w:ind w:firstLine="0"/>
+            </w:pPr>
+            <w:r>
+              <w:t xml:space="preserve"> 5.709e-05 </w:t>
+            </w:r>
+          </w:p>
+        </w:tc>
+        <w:tc>
+          <w:tcPr>
+            <w:tcW w:w="904" w:type="dxa"/>
+          </w:tcPr>
+          <w:p>
+            <w:pPr>
+              <w:ind w:firstLine="0"/>
+            </w:pPr>
+            <w:r>
+              <w:t xml:space="preserve"> 0.0157 </w:t>
+            </w:r>
+          </w:p>
+        </w:tc>
+      </w:tr>
+      <w:tr>
+        <w:tc>
+          <w:tcPr>
+            <w:tcW w:w="826" w:type="dxa"/>
+          </w:tcPr>
+          <w:p>
+            <w:pPr>
+              <w:ind w:firstLine="0"/>
+            </w:pPr>
+            <w:r>
+              <w:t xml:space="preserve"> exp4 </w:t>
+            </w:r>
+          </w:p>
+        </w:tc>
+        <w:tc>
+          <w:tcPr>
+            <w:tcW w:w="1116" w:type="dxa"/>
+          </w:tcPr>
+          <w:p>
+            <w:pPr>
+              <w:ind w:firstLine="0"/>
+            </w:pPr>
+            <w:r>
+              <w:t xml:space="preserve"> 5615.500 </w:t>
+            </w:r>
+          </w:p>
+        </w:tc>
+        <w:tc>
+          <w:tcPr>
+            <w:tcW w:w="1116" w:type="dxa"/>
+          </w:tcPr>
+          <w:p>
+            <w:pPr>
+              <w:ind w:firstLine="0"/>
+            </w:pPr>
+            <w:r>
+              <w:t xml:space="preserve"> 0.013520 </w:t>
+            </w:r>
+          </w:p>
+        </w:tc>
+        <w:tc>
+          <w:tcPr>
+            <w:tcW w:w="950" w:type="dxa"/>
+          </w:tcPr>
+          <w:p>
+            <w:pPr>
+              <w:ind w:firstLine="0"/>
+            </w:pPr>
+            <w:r>
+              <w:t xml:space="preserve"> 0.0134 </w:t>
+            </w:r>
+          </w:p>
+        </w:tc>
+        <w:tc>
+          <w:tcPr>
+            <w:tcW w:w="1150" w:type="dxa"/>
+          </w:tcPr>
+          <w:p>
+            <w:pPr>
+              <w:ind w:firstLine="0"/>
+            </w:pPr>
+            <w:r>
+              <w:t xml:space="preserve"> 1.201e-04 </w:t>
+            </w:r>
+          </w:p>
+        </w:tc>
+        <w:tc>
+          <w:tcPr>
+            <w:tcW w:w="949" w:type="dxa"/>
+          </w:tcPr>
+          <w:p>
+            <w:pPr>
+              <w:ind w:firstLine="0"/>
+            </w:pPr>
+            <w:r>
+              <w:t xml:space="preserve"> 5.871e-05 </w:t>
+            </w:r>
+          </w:p>
+        </w:tc>
+        <w:tc>
+          <w:tcPr>
+            <w:tcW w:w="904" w:type="dxa"/>
+          </w:tcPr>
+          <w:p>
+            <w:pPr>
+              <w:ind w:firstLine="0"/>
+            </w:pPr>
+            <w:r>
+              <w:t xml:space="preserve"> </w:t>
+            </w:r>
+            <w:bookmarkStart w:id="0" w:name="OLE_LINK2"/>
+            <w:r>
+              <w:t>0.0136</w:t>
+            </w:r>
+            <w:bookmarkEnd w:id="0"/>
+            <w:r>
+              <w:t xml:space="preserve"> </w:t>
+            </w:r>
+          </w:p>
+        </w:tc>
+      </w:tr>
+    </w:tbl>
+    <w:p>
+      <w:r>
+        <w:rPr>
+          <w:rFonts w:hint="eastAsia"/>
+        </w:rPr>
+        <w:t>注：</w:t>
+      </w:r>
+      <w:r>
+        <w:rPr>
+          <w:rFonts w:hint="eastAsia"/>
+        </w:rPr>
+        <w:t>1. exp1</w:t>
+      </w:r>
+      <w:r>
+        <w:rPr>
+          <w:rFonts w:hint="eastAsia"/>
+        </w:rPr>
+        <w:t>的</w:t>
+      </w:r>
+      <w:r>
+        <w:rPr>
+          <w:rFonts w:hint="eastAsia"/>
+        </w:rPr>
+        <w:t>baseline</w:t>
+      </w:r>
+      <w:r>
+        <w:rPr>
+          <w:rFonts w:hint="eastAsia"/>
+        </w:rPr>
+        <w:t>和</w:t>
+      </w:r>
+      <w:r>
+        <w:rPr>
+          <w:rFonts w:hint="eastAsia"/>
+        </w:rPr>
+        <w:t>exp2</w:t>
+      </w:r>
+      <w:r>
+        <w:rPr>
+          <w:rFonts w:hint="eastAsia"/>
+        </w:rPr>
+        <w:t>都是只存</w:t>
+      </w:r>
+      <w:r>
+        <w:rPr>
+          <w:rFonts w:hint="eastAsia"/>
+        </w:rPr>
+        <w:t>NOP</w:t>
+      </w:r>
+      <w:r>
+        <w:rPr>
+          <w:rFonts w:hint="eastAsia"/>
+        </w:rPr>
+        <w:t>，压缩后的</w:t>
+      </w:r>
+      <w:r>
+        <w:rPr>
+          <w:rFonts w:hint="eastAsia"/>
+        </w:rPr>
+        <w:t>logic</w:t>
+      </w:r>
+      <w:r>
+        <w:rPr>
+          <w:rFonts w:hint="eastAsia"/>
+        </w:rPr>
+        <w:t>量是一样的，只是部署时的</w:t>
+      </w:r>
+      <w:r>
+        <w:t>physical</w:t>
+      </w:r>
+      <w:r>
+        <w:rPr>
+          <w:rFonts w:hint="eastAsia"/>
+        </w:rPr>
+        <w:t>量不一样。</w:t>
+      </w:r>
+    </w:p>
+    <w:p>
+      <w:pPr>
+        <w:rPr>
+          <w:rFonts w:hint="eastAsia"/>
+        </w:rPr>
+      </w:pPr>
+      <w:r>
+        <w:rPr>
+          <w:rFonts w:hint="eastAsia"/>
+        </w:rPr>
+        <w:t xml:space="preserve">2. </w:t>
+      </w:r>
+      <w:r>
+        <w:rPr>
+          <w:rFonts w:hint="eastAsia"/>
+        </w:rPr>
+        <w:t>同时考虑了</w:t>
+      </w:r>
+      <w:proofErr w:type="spellStart"/>
+      <w:r>
+        <w:rPr>
+          <w:rFonts w:hint="eastAsia"/>
+        </w:rPr>
+        <w:t>softmax</w:t>
+      </w:r>
+      <w:proofErr w:type="spellEnd"/>
+      <w:r>
+        <w:rPr>
+          <w:rFonts w:hint="eastAsia"/>
+        </w:rPr>
+        <w:t>，</w:t>
+      </w:r>
+      <w:proofErr w:type="spellStart"/>
+      <w:r>
+        <w:rPr>
+          <w:rFonts w:hint="eastAsia"/>
+        </w:rPr>
+        <w:t>layernorm</w:t>
+      </w:r>
+      <w:proofErr w:type="spellEnd"/>
+      <w:r>
+        <w:rPr>
+          <w:rFonts w:hint="eastAsia"/>
+        </w:rPr>
+        <w:t>，</w:t>
+      </w:r>
+      <w:proofErr w:type="spellStart"/>
+      <w:r>
+        <w:rPr>
+          <w:rFonts w:hint="eastAsia"/>
+        </w:rPr>
+        <w:t>gelu</w:t>
+      </w:r>
+      <w:proofErr w:type="spellEnd"/>
+      <w:r>
+        <w:rPr>
+          <w:rFonts w:hint="eastAsia"/>
+        </w:rPr>
+        <w:t>三个函数。三个函数的有效</w:t>
+      </w:r>
+      <w:r>
+        <w:rPr>
+          <w:rFonts w:hint="eastAsia"/>
+        </w:rPr>
+        <w:t>slot</w:t>
+      </w:r>
+      <w:r>
+        <w:rPr>
+          <w:rFonts w:hint="eastAsia"/>
+        </w:rPr>
+        <w:t>紧密堆叠。但是编译</w:t>
+      </w:r>
+      <w:r>
+        <w:rPr>
+          <w:rFonts w:hint="eastAsia"/>
+        </w:rPr>
+        <w:t>SRAM</w:t>
+      </w:r>
+      <w:r>
+        <w:rPr>
+          <w:rFonts w:hint="eastAsia"/>
+        </w:rPr>
+        <w:t>的时候深度取</w:t>
+      </w:r>
+      <w:r>
+        <w:rPr>
+          <w:rFonts w:hint="eastAsia"/>
+        </w:rPr>
+        <w:t>padding</w:t>
+      </w:r>
+      <w:r>
+        <w:rPr>
+          <w:rFonts w:hint="eastAsia"/>
+        </w:rPr>
+        <w:t>到</w:t>
+      </w:r>
+      <w:r>
+        <w:rPr>
+          <w:rFonts w:hint="eastAsia"/>
+        </w:rPr>
+        <w:t>2</w:t>
+      </w:r>
+      <w:r>
+        <w:rPr>
+          <w:rFonts w:hint="eastAsia"/>
+        </w:rPr>
+        <w:t>幂次的深度（并没有使用未</w:t>
+      </w:r>
+      <w:r>
+        <w:rPr>
+          <w:rFonts w:hint="eastAsia"/>
+        </w:rPr>
+        <w:t>pad</w:t>
+      </w:r>
+      <w:r>
+        <w:rPr>
+          <w:rFonts w:hint="eastAsia"/>
+        </w:rPr>
+        <w:t>的深度）。</w:t>
+      </w:r>
+    </w:p>
+    <w:p>
+      <w:pPr>
+        <w:rPr>
+          <w:rFonts w:hint="eastAsia"/>
+        </w:rPr>
+      </w:pPr>
+    </w:p>
+    <w:p>
+      <w:r>
+        <w:rPr>
+          <w:rFonts w:hint="eastAsia"/>
+        </w:rPr>
+        <w:t>担心：</w:t>
+      </w:r>
+      <w:bookmarkStart w:id="1" w:name="OLE_LINK1"/>
+      <w:r>
+        <w:rPr>
+          <w:rFonts w:hint="eastAsia"/>
+        </w:rPr>
+        <w:t>目前版本太简单了。</w:t>
+      </w:r>
+    </w:p>
+    <w:p>
+      <w:r>
+        <w:rPr>
+          <w:rFonts w:hint="eastAsia"/>
+        </w:rPr>
+        <w:t>是否可以做一个调度</w:t>
       </w:r>
       <w:r>
         <w:rPr>
@@ -1407,6 +2279,86 @@
           <w:rFonts w:hint="eastAsia"/>
         </w:rPr>
         <w:t>压缩的联合优化？</w:t>
+      </w:r>
+      <w:bookmarkEnd w:id="1"/>
+      <w:r>
+        <w:rPr>
+          <w:rFonts w:hint="eastAsia"/>
+        </w:rPr>
+        <w:t>但感觉也没有思路。</w:t>
+      </w:r>
+    </w:p>
+    <w:p>
+      <w:pPr>
+        <w:rPr>
+          <w:rFonts w:hint="eastAsia"/>
+        </w:rPr>
+      </w:pPr>
+      <w:r>
+        <w:rPr>
+          <w:rFonts w:hint="eastAsia"/>
+        </w:rPr>
+        <w:t>如果给调度加上模版，只允许</w:t>
+      </w:r>
+      <w:r>
+        <w:rPr>
+          <w:rFonts w:hint="eastAsia"/>
+        </w:rPr>
+        <w:t>16</w:t>
+      </w:r>
+      <w:r>
+        <w:rPr>
+          <w:rFonts w:hint="eastAsia"/>
+        </w:rPr>
+        <w:t>中可用的</w:t>
+      </w:r>
+      <w:r>
+        <w:rPr>
+          <w:rFonts w:hint="eastAsia"/>
+        </w:rPr>
+        <w:t>mask</w:t>
+      </w:r>
+      <w:r>
+        <w:rPr>
+          <w:rFonts w:hint="eastAsia"/>
+        </w:rPr>
+        <w:t>模版，潜力是可以把</w:t>
+      </w:r>
+      <w:r>
+        <w:rPr>
+          <w:rFonts w:hint="eastAsia"/>
+        </w:rPr>
+        <w:t>config</w:t>
+      </w:r>
+      <w:r>
+        <w:rPr>
+          <w:rFonts w:hint="eastAsia"/>
+        </w:rPr>
+        <w:t>从</w:t>
+      </w:r>
+      <w:r>
+        <w:rPr>
+          <w:rFonts w:hint="eastAsia"/>
+        </w:rPr>
+        <w:t>5bit</w:t>
+      </w:r>
+      <w:r>
+        <w:rPr>
+          <w:rFonts w:hint="eastAsia"/>
+        </w:rPr>
+        <w:t>压到</w:t>
+      </w:r>
+      <w:r>
+        <w:rPr>
+          <w:rFonts w:hint="eastAsia"/>
+        </w:rPr>
+        <w:t>4bit</w:t>
+      </w:r>
+      <w:r>
+        <w:rPr>
+          <w:rFonts w:hint="eastAsia"/>
+        </w:rPr>
+        <w:t>，但是这样的结果可能不好，削弱通用性。</w:t>
       </w:r>
     </w:p>
     <w:p/>
@@ -1416,12 +2368,6 @@
         <w:rPr>
           <w:rFonts w:hint="eastAsia"/>
         </w:rPr>
-        <w:t>具体的</w:t>
-      </w:r>
-      <w:r>
-        <w:rPr>
-          <w:rFonts w:hint="eastAsia"/>
-        </w:rPr>
         <w:t>exp2</w:t>
       </w:r>
       <w:r>
@@ -1430,6 +2376,119 @@
         </w:rPr>
         <w:t>硬件顶层设计</w:t>
       </w:r>
+    </w:p>
+    <w:p>
+      <w:pPr>
+        <w:pStyle w:val="a4"/>
+      </w:pPr>
+      <w:r>
+        <w:rPr>
+          <w:rFonts w:hint="eastAsia"/>
+        </w:rPr>
+        <w:lastRenderedPageBreak/>
+        <w:drawing>
+          <wp:inline distT="0" distB="0" distL="0" distR="0" wp14:anchorId="1FBC69C6" wp14:editId="676B613E">
+            <wp:extent cx="4408038" cy="2403033"/>
+            <wp:effectExtent l="0" t="0" r="0" b="0"/>
+            <wp:docPr id="44262316" name="图片 3"/>
+            <wp:cNvGraphicFramePr>
+              <a:graphicFrameLocks xmlns:a="http://schemas.openxmlformats.org/drawingml/2006/main" noChangeAspect="1"/>
+            </wp:cNvGraphicFramePr>
+            <a:graphic xmlns:a="http://schemas.openxmlformats.org/drawingml/2006/main">
+              <a:graphicData uri="http://schemas.openxmlformats.org/drawingml/2006/picture">
+                <pic:pic xmlns:pic="http://schemas.openxmlformats.org/drawingml/2006/picture">
+                  <pic:nvPicPr>
+                    <pic:cNvPr id="44262316" name="图片 44262316"/>
+                    <pic:cNvPicPr/>
+                  </pic:nvPicPr>
+                  <pic:blipFill>
+                    <a:blip r:embed="rId5" cstate="print">
+                      <a:extLst>
+                        <a:ext uri="{28A0092B-C50C-407E-A947-70E740481C1C}">
+                          <a14:useLocalDpi xmlns:a14="http://schemas.microsoft.com/office/drawing/2010/main" val="0"/>
+                        </a:ext>
+                      </a:extLst>
+                    </a:blip>
+                    <a:stretch>
+                      <a:fillRect/>
+                    </a:stretch>
+                  </pic:blipFill>
+                  <pic:spPr>
+                    <a:xfrm>
+                      <a:off x="0" y="0"/>
+                      <a:ext cx="4462112" cy="2432511"/>
+                    </a:xfrm>
+                    <a:prstGeom prst="rect">
+                      <a:avLst/>
+                    </a:prstGeom>
+                  </pic:spPr>
+                </pic:pic>
+              </a:graphicData>
+            </a:graphic>
+          </wp:inline>
+        </w:drawing>
+      </w:r>
+    </w:p>
+    <w:p>
+      <w:pPr>
+        <w:pStyle w:val="a4"/>
+        <w:rPr>
+          <w:rFonts w:hint="eastAsia"/>
+        </w:rPr>
+      </w:pPr>
+      <w:r>
+        <w:rPr>
+          <w:rFonts w:hint="eastAsia"/>
+        </w:rPr>
+        <w:drawing>
+          <wp:inline distT="0" distB="0" distL="0" distR="0" wp14:anchorId="5BD29598" wp14:editId="50EB215A">
+            <wp:extent cx="5274310" cy="2875280"/>
+            <wp:effectExtent l="0" t="0" r="0" b="0"/>
+            <wp:docPr id="712123516" name="图片 4"/>
+            <wp:cNvGraphicFramePr>
+              <a:graphicFrameLocks xmlns:a="http://schemas.openxmlformats.org/drawingml/2006/main" noChangeAspect="1"/>
+            </wp:cNvGraphicFramePr>
+            <a:graphic xmlns:a="http://schemas.openxmlformats.org/drawingml/2006/main">
+              <a:graphicData uri="http://schemas.openxmlformats.org/drawingml/2006/picture">
+                <pic:pic xmlns:pic="http://schemas.openxmlformats.org/drawingml/2006/picture">
+                  <pic:nvPicPr>
+                    <pic:cNvPr id="712123516" name="图片 712123516"/>
+                    <pic:cNvPicPr/>
+                  </pic:nvPicPr>
+                  <pic:blipFill>
+                    <a:blip r:embed="rId6" cstate="print">
+                      <a:extLst>
+                        <a:ext uri="{28A0092B-C50C-407E-A947-70E740481C1C}">
+                          <a14:useLocalDpi xmlns:a14="http://schemas.microsoft.com/office/drawing/2010/main" val="0"/>
+                        </a:ext>
+                      </a:extLst>
+                    </a:blip>
+                    <a:stretch>
+                      <a:fillRect/>
+                    </a:stretch>
+                  </pic:blipFill>
+                  <pic:spPr>
+                    <a:xfrm>
+                      <a:off x="0" y="0"/>
+                      <a:ext cx="5274310" cy="2875280"/>
+                    </a:xfrm>
+                    <a:prstGeom prst="rect">
+                      <a:avLst/>
+                    </a:prstGeom>
+                  </pic:spPr>
+                </pic:pic>
+              </a:graphicData>
+            </a:graphic>
+          </wp:inline>
+        </w:drawing>
+      </w:r>
+    </w:p>
+    <w:p>
+      <w:pPr>
+        <w:rPr>
+          <w:rFonts w:hint="eastAsia"/>
+        </w:rPr>
+      </w:pPr>
     </w:p>
     <w:p>
       <w:r>
@@ -1509,7 +2568,6 @@
                 <w:b/>
                 <w:bCs/>
               </w:rPr>
-              <w:lastRenderedPageBreak/>
               <w:t>寄存器</w:t>
             </w:r>
           </w:p>
@@ -1848,6 +2906,7 @@
           <w:p>
             <w:proofErr w:type="spellStart"/>
             <w:r>
+              <w:lastRenderedPageBreak/>
               <w:t>b_vld</w:t>
             </w:r>
             <w:proofErr w:type="spellEnd"/>
@@ -1925,11 +2984,6 @@
       </w:r>
     </w:p>
     <w:p>
-      <w:pPr>
-        <w:rPr>
-          <w:rFonts w:hint="eastAsia"/>
-        </w:rPr>
-      </w:pPr>
       <w:r>
         <w:t>拍</w:t>
       </w:r>
@@ -2075,38 +3129,22 @@
     </w:p>
     <w:tbl>
       <w:tblPr>
+        <w:tblStyle w:val="a5"/>
         <w:tblW w:w="0" w:type="auto"/>
-        <w:tblCellSpacing w:w="15" w:type="dxa"/>
-        <w:tblCellMar>
-          <w:top w:w="15" w:type="dxa"/>
-          <w:left w:w="15" w:type="dxa"/>
-          <w:bottom w:w="15" w:type="dxa"/>
-          <w:right w:w="15" w:type="dxa"/>
-        </w:tblCellMar>
         <w:tblLook w:val="04A0" w:firstRow="1" w:lastRow="0" w:firstColumn="1" w:lastColumn="0" w:noHBand="0" w:noVBand="1"/>
       </w:tblPr>
       <w:tblGrid>
-        <w:gridCol w:w="874"/>
-        <w:gridCol w:w="1142"/>
-        <w:gridCol w:w="1668"/>
-        <w:gridCol w:w="2960"/>
-        <w:gridCol w:w="1662"/>
+        <w:gridCol w:w="793"/>
+        <w:gridCol w:w="1100"/>
+        <w:gridCol w:w="1673"/>
+        <w:gridCol w:w="3080"/>
+        <w:gridCol w:w="1650"/>
       </w:tblGrid>
       <w:tr>
-        <w:trPr>
-          <w:tblHeader/>
-          <w:tblCellSpacing w:w="15" w:type="dxa"/>
-        </w:trPr>
         <w:tc>
           <w:tcPr>
             <w:tcW w:w="0" w:type="auto"/>
             <w:noWrap/>
-            <w:tcMar>
-              <w:top w:w="90" w:type="dxa"/>
-              <w:left w:w="150" w:type="dxa"/>
-              <w:bottom w:w="90" w:type="dxa"/>
-              <w:right w:w="150" w:type="dxa"/>
-            </w:tcMar>
             <w:hideMark/>
           </w:tcPr>
           <w:p>
@@ -2129,12 +3167,6 @@
           <w:tcPr>
             <w:tcW w:w="0" w:type="auto"/>
             <w:noWrap/>
-            <w:tcMar>
-              <w:top w:w="90" w:type="dxa"/>
-              <w:left w:w="150" w:type="dxa"/>
-              <w:bottom w:w="90" w:type="dxa"/>
-              <w:right w:w="150" w:type="dxa"/>
-            </w:tcMar>
             <w:hideMark/>
           </w:tcPr>
           <w:p>
@@ -2157,12 +3189,6 @@
           <w:tcPr>
             <w:tcW w:w="0" w:type="auto"/>
             <w:noWrap/>
-            <w:tcMar>
-              <w:top w:w="90" w:type="dxa"/>
-              <w:left w:w="150" w:type="dxa"/>
-              <w:bottom w:w="90" w:type="dxa"/>
-              <w:right w:w="150" w:type="dxa"/>
-            </w:tcMar>
             <w:hideMark/>
           </w:tcPr>
           <w:p>
@@ -2185,12 +3211,6 @@
           <w:tcPr>
             <w:tcW w:w="0" w:type="auto"/>
             <w:noWrap/>
-            <w:tcMar>
-              <w:top w:w="90" w:type="dxa"/>
-              <w:left w:w="150" w:type="dxa"/>
-              <w:bottom w:w="90" w:type="dxa"/>
-              <w:right w:w="150" w:type="dxa"/>
-            </w:tcMar>
             <w:hideMark/>
           </w:tcPr>
           <w:p>
@@ -2227,12 +3247,6 @@
           <w:tcPr>
             <w:tcW w:w="0" w:type="auto"/>
             <w:noWrap/>
-            <w:tcMar>
-              <w:top w:w="90" w:type="dxa"/>
-              <w:left w:w="150" w:type="dxa"/>
-              <w:bottom w:w="90" w:type="dxa"/>
-              <w:right w:w="150" w:type="dxa"/>
-            </w:tcMar>
             <w:hideMark/>
           </w:tcPr>
           <w:p>
@@ -2260,18 +3274,9 @@
         </w:tc>
       </w:tr>
       <w:tr>
-        <w:trPr>
-          <w:tblCellSpacing w:w="15" w:type="dxa"/>
-        </w:trPr>
         <w:tc>
           <w:tcPr>
             <w:tcW w:w="0" w:type="auto"/>
-            <w:tcMar>
-              <w:top w:w="90" w:type="dxa"/>
-              <w:left w:w="150" w:type="dxa"/>
-              <w:bottom w:w="90" w:type="dxa"/>
-              <w:right w:w="150" w:type="dxa"/>
-            </w:tcMar>
             <w:hideMark/>
           </w:tcPr>
           <w:p>
@@ -2283,12 +3288,6 @@
         <w:tc>
           <w:tcPr>
             <w:tcW w:w="0" w:type="auto"/>
-            <w:tcMar>
-              <w:top w:w="90" w:type="dxa"/>
-              <w:left w:w="150" w:type="dxa"/>
-              <w:bottom w:w="90" w:type="dxa"/>
-              <w:right w:w="150" w:type="dxa"/>
-            </w:tcMar>
             <w:hideMark/>
           </w:tcPr>
           <w:p>
@@ -2300,12 +3299,6 @@
         <w:tc>
           <w:tcPr>
             <w:tcW w:w="0" w:type="auto"/>
-            <w:tcMar>
-              <w:top w:w="90" w:type="dxa"/>
-              <w:left w:w="150" w:type="dxa"/>
-              <w:bottom w:w="90" w:type="dxa"/>
-              <w:right w:w="150" w:type="dxa"/>
-            </w:tcMar>
             <w:hideMark/>
           </w:tcPr>
           <w:p>
@@ -2326,12 +3319,6 @@
         <w:tc>
           <w:tcPr>
             <w:tcW w:w="0" w:type="auto"/>
-            <w:tcMar>
-              <w:top w:w="90" w:type="dxa"/>
-              <w:left w:w="150" w:type="dxa"/>
-              <w:bottom w:w="90" w:type="dxa"/>
-              <w:right w:w="150" w:type="dxa"/>
-            </w:tcMar>
             <w:hideMark/>
           </w:tcPr>
           <w:p>
@@ -2349,40 +3336,25 @@
         <w:tc>
           <w:tcPr>
             <w:tcW w:w="0" w:type="auto"/>
-            <w:tcMar>
-              <w:top w:w="90" w:type="dxa"/>
-              <w:left w:w="150" w:type="dxa"/>
-              <w:bottom w:w="90" w:type="dxa"/>
-              <w:right w:w="150" w:type="dxa"/>
-            </w:tcMar>
             <w:hideMark/>
           </w:tcPr>
           <w:p>
             <w:r>
-              <w:t xml:space="preserve">0+2=2… </w:t>
-            </w:r>
-            <w:r>
-              <w:t>等等，是</w:t>
-            </w:r>
-            <w:r>
-              <w:t xml:space="preserve"> 2</w:t>
+              <w:rPr>
+                <w:rFonts w:hint="eastAsia"/>
+              </w:rPr>
+              <w:t>0+2=</w:t>
+            </w:r>
+            <w:r>
+              <w:t>2</w:t>
             </w:r>
           </w:p>
         </w:tc>
       </w:tr>
       <w:tr>
-        <w:trPr>
-          <w:tblCellSpacing w:w="15" w:type="dxa"/>
-        </w:trPr>
         <w:tc>
           <w:tcPr>
             <w:tcW w:w="0" w:type="auto"/>
-            <w:tcMar>
-              <w:top w:w="90" w:type="dxa"/>
-              <w:left w:w="150" w:type="dxa"/>
-              <w:bottom w:w="90" w:type="dxa"/>
-              <w:right w:w="150" w:type="dxa"/>
-            </w:tcMar>
             <w:hideMark/>
           </w:tcPr>
           <w:p>
@@ -2394,12 +3366,6 @@
         <w:tc>
           <w:tcPr>
             <w:tcW w:w="0" w:type="auto"/>
-            <w:tcMar>
-              <w:top w:w="90" w:type="dxa"/>
-              <w:left w:w="150" w:type="dxa"/>
-              <w:bottom w:w="90" w:type="dxa"/>
-              <w:right w:w="150" w:type="dxa"/>
-            </w:tcMar>
             <w:hideMark/>
           </w:tcPr>
           <w:p>
@@ -2411,12 +3377,6 @@
         <w:tc>
           <w:tcPr>
             <w:tcW w:w="0" w:type="auto"/>
-            <w:tcMar>
-              <w:top w:w="90" w:type="dxa"/>
-              <w:left w:w="150" w:type="dxa"/>
-              <w:bottom w:w="90" w:type="dxa"/>
-              <w:right w:w="150" w:type="dxa"/>
-            </w:tcMar>
             <w:hideMark/>
           </w:tcPr>
           <w:p>
@@ -2437,12 +3397,6 @@
         <w:tc>
           <w:tcPr>
             <w:tcW w:w="0" w:type="auto"/>
-            <w:tcMar>
-              <w:top w:w="90" w:type="dxa"/>
-              <w:left w:w="150" w:type="dxa"/>
-              <w:bottom w:w="90" w:type="dxa"/>
-              <w:right w:w="150" w:type="dxa"/>
-            </w:tcMar>
             <w:hideMark/>
           </w:tcPr>
           <w:p>
@@ -2454,12 +3408,6 @@
         <w:tc>
           <w:tcPr>
             <w:tcW w:w="0" w:type="auto"/>
-            <w:tcMar>
-              <w:top w:w="90" w:type="dxa"/>
-              <w:left w:w="150" w:type="dxa"/>
-              <w:bottom w:w="90" w:type="dxa"/>
-              <w:right w:w="150" w:type="dxa"/>
-            </w:tcMar>
             <w:hideMark/>
           </w:tcPr>
           <w:p>
@@ -2470,18 +3418,9 @@
         </w:tc>
       </w:tr>
       <w:tr>
-        <w:trPr>
-          <w:tblCellSpacing w:w="15" w:type="dxa"/>
-        </w:trPr>
         <w:tc>
           <w:tcPr>
             <w:tcW w:w="0" w:type="auto"/>
-            <w:tcMar>
-              <w:top w:w="90" w:type="dxa"/>
-              <w:left w:w="150" w:type="dxa"/>
-              <w:bottom w:w="90" w:type="dxa"/>
-              <w:right w:w="150" w:type="dxa"/>
-            </w:tcMar>
             <w:hideMark/>
           </w:tcPr>
           <w:p>
@@ -2493,12 +3432,6 @@
         <w:tc>
           <w:tcPr>
             <w:tcW w:w="0" w:type="auto"/>
-            <w:tcMar>
-              <w:top w:w="90" w:type="dxa"/>
-              <w:left w:w="150" w:type="dxa"/>
-              <w:bottom w:w="90" w:type="dxa"/>
-              <w:right w:w="150" w:type="dxa"/>
-            </w:tcMar>
             <w:hideMark/>
           </w:tcPr>
           <w:p>
@@ -2510,12 +3443,6 @@
         <w:tc>
           <w:tcPr>
             <w:tcW w:w="0" w:type="auto"/>
-            <w:tcMar>
-              <w:top w:w="90" w:type="dxa"/>
-              <w:left w:w="150" w:type="dxa"/>
-              <w:bottom w:w="90" w:type="dxa"/>
-              <w:right w:w="150" w:type="dxa"/>
-            </w:tcMar>
             <w:hideMark/>
           </w:tcPr>
           <w:p>
@@ -2536,12 +3463,6 @@
         <w:tc>
           <w:tcPr>
             <w:tcW w:w="0" w:type="auto"/>
-            <w:tcMar>
-              <w:top w:w="90" w:type="dxa"/>
-              <w:left w:w="150" w:type="dxa"/>
-              <w:bottom w:w="90" w:type="dxa"/>
-              <w:right w:w="150" w:type="dxa"/>
-            </w:tcMar>
             <w:hideMark/>
           </w:tcPr>
           <w:p>
@@ -2565,12 +3486,6 @@
         <w:tc>
           <w:tcPr>
             <w:tcW w:w="0" w:type="auto"/>
-            <w:tcMar>
-              <w:top w:w="90" w:type="dxa"/>
-              <w:left w:w="150" w:type="dxa"/>
-              <w:bottom w:w="90" w:type="dxa"/>
-              <w:right w:w="150" w:type="dxa"/>
-            </w:tcMar>
             <w:hideMark/>
           </w:tcPr>
           <w:p>
@@ -2636,7 +3551,6 @@
           <w:b/>
           <w:bCs/>
         </w:rPr>
-        <w:lastRenderedPageBreak/>
         <w:t xml:space="preserve">2. </w:t>
       </w:r>
       <w:r>
@@ -2644,7 +3558,7 @@
           <w:b/>
           <w:bCs/>
         </w:rPr>
-        <w:t>解码要回答两个问题</w:t>
+        <w:t>解码</w:t>
       </w:r>
     </w:p>
     <w:p>
@@ -2740,6 +3654,7 @@
     </w:p>
     <w:p>
       <w:r>
+        <w:lastRenderedPageBreak/>
         <w:t>关键观察：因为是「从</w:t>
       </w:r>
       <w:r>
@@ -3531,7 +4446,6 @@
     </w:tbl>
     <w:p>
       <w:r>
-        <w:lastRenderedPageBreak/>
         <w:t>对照上面编码表拍</w:t>
       </w:r>
       <w:r>
@@ -3691,6 +4605,7 @@
     </w:p>
     <w:p>
       <w:r>
+        <w:lastRenderedPageBreak/>
         <w:t>一句话：编码是「从</w:t>
       </w:r>
       <w:r>
@@ -3773,11 +4688,6 @@
       </w:r>
     </w:p>
     <w:p>
-      <w:pPr>
-        <w:rPr>
-          <w:rFonts w:hint="eastAsia"/>
-        </w:rPr>
-      </w:pPr>
       <w:r>
         <w:rPr>
           <w:rFonts w:hint="eastAsia"/>
@@ -3800,12 +4710,8 @@
     <w:p>
       <w:pPr>
         <w:pStyle w:val="a4"/>
-        <w:rPr>
-          <w:rFonts w:hint="eastAsia"/>
-        </w:rPr>
-      </w:pPr>
-      <w:r>
-        <w:lastRenderedPageBreak/>
+      </w:pPr>
+      <w:r>
         <w:drawing>
           <wp:inline distT="0" distB="0" distL="0" distR="0" wp14:anchorId="1213B9A0" wp14:editId="20071D07">
             <wp:extent cx="5274310" cy="4824730"/>
@@ -3822,7 +4728,7 @@
                     <pic:cNvPicPr/>
                   </pic:nvPicPr>
                   <pic:blipFill>
-                    <a:blip r:embed="rId5"/>
+                    <a:blip r:embed="rId7"/>
                     <a:stretch>
                       <a:fillRect/>
                     </a:stretch>
@@ -3843,59 +4749,51 @@
         </w:drawing>
       </w:r>
     </w:p>
+    <w:p/>
     <w:p>
       <w:pPr>
-        <w:rPr>
-          <w:rFonts w:hint="eastAsia"/>
-        </w:rPr>
-      </w:pPr>
+        <w:pStyle w:val="1"/>
+      </w:pPr>
+      <w:r>
+        <w:rPr>
+          <w:rFonts w:hint="eastAsia"/>
+        </w:rPr>
+        <w:t>如果下一步从</w:t>
+      </w:r>
+      <w:r>
+        <w:rPr>
+          <w:rFonts w:hint="eastAsia"/>
+        </w:rPr>
+        <w:t>3</w:t>
+      </w:r>
+      <w:r>
+        <w:rPr>
+          <w:rFonts w:hint="eastAsia"/>
+        </w:rPr>
+        <w:t>个函数扩展到</w:t>
+      </w:r>
+      <w:r>
+        <w:rPr>
+          <w:rFonts w:hint="eastAsia"/>
+        </w:rPr>
+        <w:t>10</w:t>
+      </w:r>
+      <w:r>
+        <w:rPr>
+          <w:rFonts w:hint="eastAsia"/>
+        </w:rPr>
+        <w:t>个函数</w:t>
+      </w:r>
     </w:p>
     <w:p>
       <w:pPr>
-        <w:pStyle w:val="1"/>
-        <w:rPr>
-          <w:rFonts w:hint="eastAsia"/>
-        </w:rPr>
-      </w:pPr>
-      <w:r>
-        <w:rPr>
-          <w:rFonts w:hint="eastAsia"/>
-        </w:rPr>
-        <w:t>如果下一步从</w:t>
-      </w:r>
-      <w:r>
-        <w:rPr>
-          <w:rFonts w:hint="eastAsia"/>
-        </w:rPr>
-        <w:t>3</w:t>
-      </w:r>
-      <w:r>
-        <w:rPr>
-          <w:rFonts w:hint="eastAsia"/>
-        </w:rPr>
-        <w:t>个函数扩展到</w:t>
-      </w:r>
-      <w:r>
-        <w:rPr>
-          <w:rFonts w:hint="eastAsia"/>
-        </w:rPr>
-        <w:t>10</w:t>
-      </w:r>
-      <w:r>
-        <w:rPr>
-          <w:rFonts w:hint="eastAsia"/>
-        </w:rPr>
-        <w:t>个函数</w:t>
-      </w:r>
-    </w:p>
-    <w:p>
-      <w:pPr>
         <w:pStyle w:val="a4"/>
       </w:pPr>
       <w:r>
         <w:rPr>
           <w:rFonts w:hint="eastAsia"/>
         </w:rPr>
+        <w:lastRenderedPageBreak/>
         <w:drawing>
           <wp:inline distT="0" distB="0" distL="0" distR="0" wp14:anchorId="1A559338" wp14:editId="1F886772">
             <wp:extent cx="5274310" cy="2461895"/>
@@ -3912,7 +4810,7 @@
                     <pic:cNvPicPr/>
                   </pic:nvPicPr>
                   <pic:blipFill>
-                    <a:blip r:embed="rId6" cstate="print">
+                    <a:blip r:embed="rId8" cstate="print">
                       <a:extLst>
                         <a:ext uri="{28A0092B-C50C-407E-A947-70E740481C1C}">
                           <a14:useLocalDpi xmlns:a14="http://schemas.microsoft.com/office/drawing/2010/main" val="0"/>
@@ -3942,12 +4840,8 @@
     <w:p>
       <w:pPr>
         <w:pStyle w:val="a4"/>
-        <w:rPr>
-          <w:rFonts w:hint="eastAsia"/>
-        </w:rPr>
-      </w:pPr>
-      <w:r>
-        <w:lastRenderedPageBreak/>
+      </w:pPr>
+      <w:r>
         <w:drawing>
           <wp:inline distT="0" distB="0" distL="0" distR="0" wp14:anchorId="78B9A85F" wp14:editId="0F6B3978">
             <wp:extent cx="5274310" cy="2287270"/>
@@ -3964,7 +4858,7 @@
                     <pic:cNvPicPr/>
                   </pic:nvPicPr>
                   <pic:blipFill>
-                    <a:blip r:embed="rId7"/>
+                    <a:blip r:embed="rId9"/>
                     <a:stretch>
                       <a:fillRect/>
                     </a:stretch>
@@ -5198,6 +6092,7 @@
   <w:style w:type="character" w:default="1" w:styleId="a1">
     <w:name w:val="Default Paragraph Font"/>
     <w:uiPriority w:val="1"/>
+    <w:semiHidden/>
     <w:unhideWhenUsed/>
   </w:style>
   <w:style w:type="table" w:default="1" w:styleId="a2">

</xml_diff>

<commit_message>
feat(rtl): parameterized depth-tiled SRAM wrappers + unit testbenches
- sram_8192x171_tiled / sram_8192x5_tiled / sram_4096x34_tiled: TILES=1/2/4
  depth tiling over existing macros; single-tile CEN gating, delayed
  chip-select (sel_q) aligned with sync read, balanced two-level 2:1 mux for
  TILES=4; no extra read-latency stage (II=1 unchanged)
- tb_sram_*_tiled: full-depth continuous read-back, tile-boundary bursts,
  per-cycle at-most-one-tile gating assertion, EOP-at-boundary stop
- verified on real TSMC 28nm macros at 1 GHz: 3 wrappers x TILES 1/2/4 all pass
- plan_sram_tiled_wrapper_2026-09-08.md: wrapper/tb plan (confirmed)
- also: two plan docs from 2026-09-08, updated 28nm synthesis summary
</commit_message>
<xml_diff>
--- a/汇总28nm综合结果.docx
+++ b/汇总28nm综合结果.docx
@@ -8873,6 +8873,7 @@
             <w:pPr>
               <w:ind w:firstLine="0"/>
             </w:pPr>
+            <w:bookmarkStart w:id="3" w:name="OLE_LINK7"/>
             <w:r>
               <w:t>4× 8192×171</w:t>
             </w:r>
@@ -8885,6 +8886,7 @@
             <w:r>
               <w:t>）</w:t>
             </w:r>
+            <w:bookmarkEnd w:id="3"/>
           </w:p>
         </w:tc>
         <w:tc>
@@ -9895,13 +9897,16 @@
     <w:p>
       <w:pPr>
         <w:ind w:firstLine="0"/>
+        <w:rPr>
+          <w:rFonts w:hint="eastAsia"/>
+        </w:rPr>
       </w:pPr>
     </w:p>
     <w:p>
       <w:pPr>
         <w:ind w:firstLine="0"/>
       </w:pPr>
-      <w:bookmarkStart w:id="3" w:name="OLE_LINK6"/>
+      <w:bookmarkStart w:id="4" w:name="OLE_LINK6"/>
       <w:r>
         <w:rPr>
           <w:rFonts w:hint="eastAsia"/>
@@ -10176,7 +10181,7 @@
       <w:pPr>
         <w:ind w:firstLine="0"/>
         <w:rPr>
-          <w:rFonts w:hint="eastAsia"/>
+          <w:rStyle w:val="ui-markdowninline-path-filename"/>
         </w:rPr>
       </w:pPr>
       <w:r>
@@ -10185,6 +10190,7 @@
         </w:rPr>
         <w:t>请帮我探索这个方案。探索过程的实验基准采用最新的</w:t>
       </w:r>
+      <w:bookmarkStart w:id="5" w:name="OLE_LINK8"/>
       <w:r>
         <w:rPr>
           <w:rStyle w:val="ui-markdowninline-path-prefix"/>
@@ -10216,13 +10222,21 @@
           <w:rStyle w:val="ui-markdowninline-path-filename"/>
           <w:rFonts w:hint="eastAsia"/>
         </w:rPr>
-        <w:t>个程序池的实验测例。将软件预估的</w:t>
-      </w:r>
+        <w:t>个程序池的实验测例</w:t>
+      </w:r>
+      <w:bookmarkEnd w:id="5"/>
       <w:r>
         <w:rPr>
           <w:rStyle w:val="ui-markdowninline-path-filename"/>
           <w:rFonts w:hint="eastAsia"/>
         </w:rPr>
+        <w:t>。将软件预估的</w:t>
+      </w:r>
+      <w:r>
+        <w:rPr>
+          <w:rStyle w:val="ui-markdowninline-path-filename"/>
+          <w:rFonts w:hint="eastAsia"/>
+        </w:rPr>
         <w:t>E0/E1/E2/E5</w:t>
       </w:r>
       <w:r>
@@ -10260,87 +10274,178 @@
         </w:rPr>
         <w:t>个程序池的结果分别总结出来。</w:t>
       </w:r>
-    </w:p>
-    <w:bookmarkEnd w:id="3"/>
-    <w:p>
-      <w:pPr>
-        <w:pStyle w:val="a4"/>
-      </w:pPr>
     </w:p>
     <w:p>
       <w:pPr>
-        <w:pStyle w:val="a4"/>
+        <w:ind w:firstLine="0"/>
+        <w:rPr>
+          <w:rStyle w:val="ui-markdowninline-path-filename"/>
+        </w:rPr>
       </w:pPr>
     </w:p>
     <w:p>
       <w:pPr>
+        <w:ind w:firstLine="0"/>
+        <w:rPr>
+          <w:rFonts w:hint="eastAsia"/>
+        </w:rPr>
+      </w:pPr>
+      <w:bookmarkStart w:id="6" w:name="OLE_LINK9"/>
+      <w:r>
+        <w:rPr>
+          <w:rStyle w:val="ui-markdowninline-path-filename"/>
+          <w:rFonts w:hint="eastAsia"/>
+        </w:rPr>
+        <w:t>给</w:t>
+      </w:r>
+      <w:r>
+        <w:rPr>
+          <w:rStyle w:val="ui-markdowninline-path-filename"/>
+          <w:rFonts w:hint="eastAsia"/>
+        </w:rPr>
+        <w:t>GPT</w:t>
+      </w:r>
+      <w:r>
+        <w:rPr>
+          <w:rStyle w:val="ui-markdowninline-path-filename"/>
+          <w:rFonts w:hint="eastAsia"/>
+        </w:rPr>
+        <w:t>：我下一步要实现</w:t>
+      </w:r>
+      <w:r>
+        <w:rPr>
+          <w:rStyle w:val="ui-markdowninline-path-prefix"/>
+        </w:rPr>
+        <w:t>plan/</w:t>
+      </w:r>
+      <w:r>
+        <w:rPr>
+          <w:rStyle w:val="ui-markdowninline-path-filename"/>
+        </w:rPr>
+        <w:t>model_pool_compression_study_2026-09-08.html</w:t>
+      </w:r>
+      <w:r>
+        <w:rPr>
+          <w:rStyle w:val="ui-markdowninline-path-filename"/>
+          <w:rFonts w:hint="eastAsia"/>
+        </w:rPr>
+        <w:t>描述的</w:t>
+      </w:r>
+      <w:r>
+        <w:rPr>
+          <w:rStyle w:val="ui-markdowninline-path-filename"/>
+          <w:rFonts w:hint="eastAsia"/>
+        </w:rPr>
+        <w:t>3</w:t>
+      </w:r>
+      <w:r>
+        <w:rPr>
+          <w:rStyle w:val="ui-markdowninline-path-filename"/>
+          <w:rFonts w:hint="eastAsia"/>
+        </w:rPr>
+        <w:t>个程序池的实验测例</w:t>
+      </w:r>
+      <w:r>
+        <w:rPr>
+          <w:rStyle w:val="ui-markdowninline-path-filename"/>
+          <w:rFonts w:hint="eastAsia"/>
+        </w:rPr>
+        <w:t>。我现在已经有部分</w:t>
+      </w:r>
+      <w:proofErr w:type="spellStart"/>
+      <w:r>
+        <w:rPr>
+          <w:rStyle w:val="ui-markdowninline-path-filename"/>
+          <w:rFonts w:hint="eastAsia"/>
+        </w:rPr>
+        <w:t>sram</w:t>
+      </w:r>
+      <w:proofErr w:type="spellEnd"/>
+      <w:r>
+        <w:rPr>
+          <w:rStyle w:val="ui-markdowninline-path-filename"/>
+          <w:rFonts w:hint="eastAsia"/>
+        </w:rPr>
+        <w:t>宏，但是</w:t>
+      </w:r>
+      <w:r>
+        <w:rPr>
+          <w:rFonts w:hint="eastAsia"/>
+        </w:rPr>
+        <w:t>待完成的实验需要更深的</w:t>
+      </w:r>
+      <w:proofErr w:type="spellStart"/>
+      <w:r>
+        <w:rPr>
+          <w:rFonts w:hint="eastAsia"/>
+        </w:rPr>
+        <w:t>sram</w:t>
+      </w:r>
+      <w:proofErr w:type="spellEnd"/>
+      <w:r>
+        <w:rPr>
+          <w:rFonts w:hint="eastAsia"/>
+        </w:rPr>
+        <w:t>。请用软件模型进行面积和功耗评估，在</w:t>
+      </w:r>
+      <w:r>
+        <w:rPr>
+          <w:rFonts w:hint="eastAsia"/>
+        </w:rPr>
+        <w:t>1GHz</w:t>
+      </w:r>
+      <w:r>
+        <w:rPr>
+          <w:rFonts w:hint="eastAsia"/>
+        </w:rPr>
+        <w:t>的时钟约束下，哪些深宏适合用已有宏拼接，哪些</w:t>
+      </w:r>
+      <w:proofErr w:type="spellStart"/>
+      <w:r>
+        <w:rPr>
+          <w:rFonts w:hint="eastAsia"/>
+        </w:rPr>
+        <w:t>sram</w:t>
+      </w:r>
+      <w:proofErr w:type="spellEnd"/>
+      <w:r>
+        <w:rPr>
+          <w:rFonts w:hint="eastAsia"/>
+        </w:rPr>
+        <w:t>适合专门用</w:t>
+      </w:r>
+      <w:r>
+        <w:rPr>
+          <w:rFonts w:hint="eastAsia"/>
+        </w:rPr>
+        <w:t>MC</w:t>
+      </w:r>
+      <w:r>
+        <w:rPr>
+          <w:rFonts w:hint="eastAsia"/>
+        </w:rPr>
+        <w:t>生成专门的宏。</w:t>
+      </w:r>
+    </w:p>
+    <w:bookmarkEnd w:id="4"/>
+    <w:bookmarkEnd w:id="6"/>
+    <w:p>
+      <w:pPr>
         <w:pStyle w:val="a4"/>
-        <w:rPr>
-          <w:rFonts w:hint="eastAsia"/>
-        </w:rPr>
       </w:pPr>
     </w:p>
     <w:p>
       <w:pPr>
-        <w:rPr>
-          <w:rFonts w:ascii="Cambria" w:hAnsi="Cambria" w:cs="Cambria"/>
-        </w:rPr>
-      </w:pPr>
-      <w:r>
-        <w:rPr>
-          <w:rFonts w:hint="eastAsia"/>
-        </w:rPr>
-        <w:t>每周期必须</w:t>
-      </w:r>
-      <w:r>
-        <w:rPr>
-          <w:rFonts w:ascii="Cambria" w:hAnsi="Cambria" w:cs="Cambria" w:hint="eastAsia"/>
-        </w:rPr>
-        <w:t>恢复一条完整指令，每个槽一样宽。</w:t>
-      </w:r>
+        <w:pStyle w:val="a4"/>
+      </w:pPr>
     </w:p>
     <w:p>
       <w:pPr>
-        <w:rPr>
-          <w:rFonts w:ascii="Cambria" w:hAnsi="Cambria" w:cs="Cambria"/>
-        </w:rPr>
-      </w:pPr>
-      <w:r>
-        <w:rPr>
-          <w:rFonts w:ascii="Cambria" w:hAnsi="Cambria" w:cs="Cambria" w:hint="eastAsia"/>
-        </w:rPr>
-        <w:t>N bank  -</w:t>
-      </w:r>
-      <w:r>
-        <w:rPr>
-          <w:rFonts w:ascii="Cambria" w:hAnsi="Cambria" w:cs="Cambria"/>
-        </w:rPr>
-        <w:t>&gt;</w:t>
-      </w:r>
-      <w:r>
-        <w:rPr>
-          <w:rFonts w:ascii="Cambria" w:hAnsi="Cambria" w:cs="Cambria" w:hint="eastAsia"/>
-        </w:rPr>
-        <w:t xml:space="preserve">  </w:t>
-      </w:r>
-      <w:r>
-        <w:rPr>
-          <w:rFonts w:ascii="Cambria" w:hAnsi="Cambria" w:cs="Cambria" w:hint="eastAsia"/>
-        </w:rPr>
-        <w:t>一周期</w:t>
-      </w:r>
-      <w:r>
-        <w:rPr>
-          <w:rFonts w:ascii="Cambria" w:hAnsi="Cambria" w:cs="Cambria" w:hint="eastAsia"/>
-        </w:rPr>
-        <w:t>N</w:t>
-      </w:r>
-      <w:r>
-        <w:rPr>
-          <w:rFonts w:ascii="Cambria" w:hAnsi="Cambria" w:cs="Cambria" w:hint="eastAsia"/>
-        </w:rPr>
-        <w:t>有效槽（不会太影响性能）。</w:t>
-      </w:r>
+        <w:pStyle w:val="a4"/>
+        <w:rPr>
+          <w:rFonts w:hint="eastAsia"/>
+        </w:rPr>
+      </w:pPr>
     </w:p>
     <w:p>
       <w:pPr>
@@ -10348,37 +10453,17 @@
           <w:rFonts w:ascii="Cambria" w:hAnsi="Cambria" w:cs="Cambria"/>
         </w:rPr>
       </w:pPr>
-      <w:bookmarkStart w:id="4" w:name="OLE_LINK3"/>
+      <w:r>
+        <w:rPr>
+          <w:rFonts w:hint="eastAsia"/>
+        </w:rPr>
+        <w:t>每周期必须</w:t>
+      </w:r>
       <w:r>
         <w:rPr>
           <w:rFonts w:ascii="Cambria" w:hAnsi="Cambria" w:cs="Cambria" w:hint="eastAsia"/>
         </w:rPr>
-        <w:t>完整指令</w:t>
-      </w:r>
-      <w:r>
-        <w:rPr>
-          <w:rFonts w:ascii="Cambria" w:hAnsi="Cambria" w:cs="Cambria" w:hint="eastAsia"/>
-        </w:rPr>
-        <w:t>M</w:t>
-      </w:r>
-      <w:r>
-        <w:rPr>
-          <w:rFonts w:ascii="Cambria" w:hAnsi="Cambria" w:cs="Cambria" w:hint="eastAsia"/>
-        </w:rPr>
-        <w:t>个槽</w:t>
-      </w:r>
-      <w:r>
-        <w:rPr>
-          <w:rFonts w:ascii="Cambria" w:hAnsi="Cambria" w:cs="Cambria"/>
-        </w:rPr>
-        <w:t xml:space="preserve">&gt;=N.  </w:t>
-      </w:r>
-      <w:bookmarkEnd w:id="4"/>
-      <w:r>
-        <w:rPr>
-          <w:rFonts w:ascii="Cambria" w:hAnsi="Cambria" w:cs="Cambria"/>
-        </w:rPr>
-        <w:t xml:space="preserve">  </w:t>
+        <w:t>恢复一条完整指令，每个槽一样宽。</w:t>
       </w:r>
     </w:p>
     <w:p>
@@ -10389,23 +10474,39 @@
       </w:pPr>
       <w:r>
         <w:rPr>
+          <w:rFonts w:ascii="Cambria" w:hAnsi="Cambria" w:cs="Cambria" w:hint="eastAsia"/>
+        </w:rPr>
+        <w:t>N bank  -</w:t>
+      </w:r>
+      <w:r>
+        <w:rPr>
           <w:rFonts w:ascii="Cambria" w:hAnsi="Cambria" w:cs="Cambria"/>
         </w:rPr>
-        <w:t xml:space="preserve">mask </w:t>
-      </w:r>
-      <w:proofErr w:type="spellStart"/>
-      <w:r>
-        <w:rPr>
-          <w:rFonts w:ascii="Cambria" w:hAnsi="Cambria" w:cs="Cambria"/>
-        </w:rPr>
-        <w:t>sram</w:t>
-      </w:r>
-      <w:proofErr w:type="spellEnd"/>
-      <w:r>
-        <w:rPr>
-          <w:rFonts w:ascii="Cambria" w:hAnsi="Cambria" w:cs="Cambria"/>
-        </w:rPr>
-        <w:t xml:space="preserve"> M * T</w:t>
+        <w:t>&gt;</w:t>
+      </w:r>
+      <w:r>
+        <w:rPr>
+          <w:rFonts w:ascii="Cambria" w:hAnsi="Cambria" w:cs="Cambria" w:hint="eastAsia"/>
+        </w:rPr>
+        <w:t xml:space="preserve">  </w:t>
+      </w:r>
+      <w:r>
+        <w:rPr>
+          <w:rFonts w:ascii="Cambria" w:hAnsi="Cambria" w:cs="Cambria" w:hint="eastAsia"/>
+        </w:rPr>
+        <w:t>一周期</w:t>
+      </w:r>
+      <w:r>
+        <w:rPr>
+          <w:rFonts w:ascii="Cambria" w:hAnsi="Cambria" w:cs="Cambria" w:hint="eastAsia"/>
+        </w:rPr>
+        <w:t>N</w:t>
+      </w:r>
+      <w:r>
+        <w:rPr>
+          <w:rFonts w:ascii="Cambria" w:hAnsi="Cambria" w:cs="Cambria" w:hint="eastAsia"/>
+        </w:rPr>
+        <w:t>有效槽（不会太影响性能）。</w:t>
       </w:r>
     </w:p>
     <w:p>
@@ -10414,55 +10515,37 @@
           <w:rFonts w:ascii="Cambria" w:hAnsi="Cambria" w:cs="Cambria"/>
         </w:rPr>
       </w:pPr>
+      <w:bookmarkStart w:id="7" w:name="OLE_LINK3"/>
+      <w:r>
+        <w:rPr>
+          <w:rFonts w:ascii="Cambria" w:hAnsi="Cambria" w:cs="Cambria" w:hint="eastAsia"/>
+        </w:rPr>
+        <w:t>完整指令</w:t>
+      </w:r>
+      <w:r>
+        <w:rPr>
+          <w:rFonts w:ascii="Cambria" w:hAnsi="Cambria" w:cs="Cambria" w:hint="eastAsia"/>
+        </w:rPr>
+        <w:t>M</w:t>
+      </w:r>
+      <w:r>
+        <w:rPr>
+          <w:rFonts w:ascii="Cambria" w:hAnsi="Cambria" w:cs="Cambria" w:hint="eastAsia"/>
+        </w:rPr>
+        <w:t>个槽</w:t>
+      </w:r>
       <w:r>
         <w:rPr>
           <w:rFonts w:ascii="Cambria" w:hAnsi="Cambria" w:cs="Cambria"/>
         </w:rPr>
-        <w:t xml:space="preserve">instruction </w:t>
-      </w:r>
-      <w:proofErr w:type="spellStart"/>
+        <w:t xml:space="preserve">&gt;=N.  </w:t>
+      </w:r>
+      <w:bookmarkEnd w:id="7"/>
       <w:r>
         <w:rPr>
           <w:rFonts w:ascii="Cambria" w:hAnsi="Cambria" w:cs="Cambria"/>
         </w:rPr>
-        <w:t>sram</w:t>
-      </w:r>
-      <w:proofErr w:type="spellEnd"/>
-      <w:r>
-        <w:rPr>
-          <w:rFonts w:ascii="Cambria" w:hAnsi="Cambria" w:cs="Cambria"/>
-        </w:rPr>
-        <w:t xml:space="preserve"> </w:t>
-      </w:r>
-      <w:r>
-        <w:rPr>
-          <w:rFonts w:ascii="Cambria" w:hAnsi="Cambria" w:cs="Cambria" w:hint="eastAsia"/>
-        </w:rPr>
-        <w:t>：有效槽的量（</w:t>
-      </w:r>
-      <w:r>
-        <w:rPr>
-          <w:rFonts w:ascii="Cambria" w:hAnsi="Cambria" w:cs="Cambria" w:hint="eastAsia"/>
-        </w:rPr>
-        <w:t>pad</w:t>
-      </w:r>
-      <w:r>
-        <w:rPr>
-          <w:rFonts w:ascii="Cambria" w:hAnsi="Cambria" w:cs="Cambria" w:hint="eastAsia"/>
-        </w:rPr>
-        <w:t>到</w:t>
-      </w:r>
-      <w:r>
-        <w:rPr>
-          <w:rFonts w:ascii="Cambria" w:hAnsi="Cambria" w:cs="Cambria" w:hint="eastAsia"/>
-        </w:rPr>
-        <w:t>2</w:t>
-      </w:r>
-      <w:r>
-        <w:rPr>
-          <w:rFonts w:ascii="Cambria" w:hAnsi="Cambria" w:cs="Cambria" w:hint="eastAsia"/>
-        </w:rPr>
-        <w:t>的幂）。</w:t>
+        <w:t xml:space="preserve">  </w:t>
       </w:r>
     </w:p>
     <w:p>
@@ -10471,6 +10554,26 @@
           <w:rFonts w:ascii="Cambria" w:hAnsi="Cambria" w:cs="Cambria"/>
         </w:rPr>
       </w:pPr>
+      <w:r>
+        <w:rPr>
+          <w:rFonts w:ascii="Cambria" w:hAnsi="Cambria" w:cs="Cambria"/>
+        </w:rPr>
+        <w:t xml:space="preserve">mask </w:t>
+      </w:r>
+      <w:proofErr w:type="spellStart"/>
+      <w:r>
+        <w:rPr>
+          <w:rFonts w:ascii="Cambria" w:hAnsi="Cambria" w:cs="Cambria"/>
+        </w:rPr>
+        <w:t>sram</w:t>
+      </w:r>
+      <w:proofErr w:type="spellEnd"/>
+      <w:r>
+        <w:rPr>
+          <w:rFonts w:ascii="Cambria" w:hAnsi="Cambria" w:cs="Cambria"/>
+        </w:rPr>
+        <w:t xml:space="preserve"> M * T</w:t>
+      </w:r>
     </w:p>
     <w:p>
       <w:pPr>
@@ -10480,21 +10583,53 @@
       </w:pPr>
       <w:r>
         <w:rPr>
+          <w:rFonts w:ascii="Cambria" w:hAnsi="Cambria" w:cs="Cambria"/>
+        </w:rPr>
+        <w:t xml:space="preserve">instruction </w:t>
+      </w:r>
+      <w:proofErr w:type="spellStart"/>
+      <w:r>
+        <w:rPr>
+          <w:rFonts w:ascii="Cambria" w:hAnsi="Cambria" w:cs="Cambria"/>
+        </w:rPr>
+        <w:t>sram</w:t>
+      </w:r>
+      <w:proofErr w:type="spellEnd"/>
+      <w:r>
+        <w:rPr>
+          <w:rFonts w:ascii="Cambria" w:hAnsi="Cambria" w:cs="Cambria"/>
+        </w:rPr>
+        <w:t xml:space="preserve"> </w:t>
+      </w:r>
+      <w:r>
+        <w:rPr>
           <w:rFonts w:ascii="Cambria" w:hAnsi="Cambria" w:cs="Cambria" w:hint="eastAsia"/>
         </w:rPr>
-        <w:t>搜其他论文</w:t>
+        <w:t>：有效槽的量（</w:t>
       </w:r>
       <w:r>
         <w:rPr>
           <w:rFonts w:ascii="Cambria" w:hAnsi="Cambria" w:cs="Cambria" w:hint="eastAsia"/>
         </w:rPr>
-        <w:t>/</w:t>
+        <w:t>pad</w:t>
       </w:r>
       <w:r>
         <w:rPr>
           <w:rFonts w:ascii="Cambria" w:hAnsi="Cambria" w:cs="Cambria" w:hint="eastAsia"/>
         </w:rPr>
-        <w:t>处理器还有什么可以用这个方法。需要满足以下条件：</w:t>
+        <w:t>到</w:t>
+      </w:r>
+      <w:r>
+        <w:rPr>
+          <w:rFonts w:ascii="Cambria" w:hAnsi="Cambria" w:cs="Cambria" w:hint="eastAsia"/>
+        </w:rPr>
+        <w:t>2</w:t>
+      </w:r>
+      <w:r>
+        <w:rPr>
+          <w:rFonts w:ascii="Cambria" w:hAnsi="Cambria" w:cs="Cambria" w:hint="eastAsia"/>
+        </w:rPr>
+        <w:t>的幂）。</w:t>
       </w:r>
     </w:p>
     <w:p>
@@ -10503,19 +10638,6 @@
           <w:rFonts w:ascii="Cambria" w:hAnsi="Cambria" w:cs="Cambria"/>
         </w:rPr>
       </w:pPr>
-      <w:bookmarkStart w:id="5" w:name="OLE_LINK4"/>
-      <w:r>
-        <w:rPr>
-          <w:rFonts w:hint="eastAsia"/>
-        </w:rPr>
-        <w:t>每周期必须</w:t>
-      </w:r>
-      <w:r>
-        <w:rPr>
-          <w:rFonts w:ascii="Cambria" w:hAnsi="Cambria" w:cs="Cambria" w:hint="eastAsia"/>
-        </w:rPr>
-        <w:t>恢复一条完整指令，每个槽一样宽。</w:t>
-      </w:r>
     </w:p>
     <w:p>
       <w:pPr>
@@ -10527,25 +10649,19 @@
         <w:rPr>
           <w:rFonts w:ascii="Cambria" w:hAnsi="Cambria" w:cs="Cambria" w:hint="eastAsia"/>
         </w:rPr>
-        <w:t>完整指令</w:t>
+        <w:t>搜其他论文</w:t>
       </w:r>
       <w:r>
         <w:rPr>
           <w:rFonts w:ascii="Cambria" w:hAnsi="Cambria" w:cs="Cambria" w:hint="eastAsia"/>
         </w:rPr>
-        <w:t>M</w:t>
+        <w:t>/</w:t>
       </w:r>
       <w:r>
         <w:rPr>
           <w:rFonts w:ascii="Cambria" w:hAnsi="Cambria" w:cs="Cambria" w:hint="eastAsia"/>
         </w:rPr>
-        <w:t>个槽</w:t>
-      </w:r>
-      <w:r>
-        <w:rPr>
-          <w:rFonts w:ascii="Cambria" w:hAnsi="Cambria" w:cs="Cambria"/>
-        </w:rPr>
-        <w:t xml:space="preserve">&gt;=N.  </w:t>
+        <w:t>处理器还有什么可以用这个方法。需要满足以下条件：</w:t>
       </w:r>
     </w:p>
     <w:p>
@@ -10554,10 +10670,62 @@
           <w:rFonts w:ascii="Cambria" w:hAnsi="Cambria" w:cs="Cambria"/>
         </w:rPr>
       </w:pPr>
+      <w:bookmarkStart w:id="8" w:name="OLE_LINK4"/>
+      <w:r>
+        <w:rPr>
+          <w:rFonts w:hint="eastAsia"/>
+        </w:rPr>
+        <w:lastRenderedPageBreak/>
+        <w:t>每周期必须</w:t>
+      </w:r>
       <w:r>
         <w:rPr>
           <w:rFonts w:ascii="Cambria" w:hAnsi="Cambria" w:cs="Cambria" w:hint="eastAsia"/>
         </w:rPr>
+        <w:t>恢复一条完整指令，每个槽一样宽。</w:t>
+      </w:r>
+    </w:p>
+    <w:p>
+      <w:pPr>
+        <w:rPr>
+          <w:rFonts w:ascii="Cambria" w:hAnsi="Cambria" w:cs="Cambria"/>
+        </w:rPr>
+      </w:pPr>
+      <w:r>
+        <w:rPr>
+          <w:rFonts w:ascii="Cambria" w:hAnsi="Cambria" w:cs="Cambria" w:hint="eastAsia"/>
+        </w:rPr>
+        <w:t>完整指令</w:t>
+      </w:r>
+      <w:r>
+        <w:rPr>
+          <w:rFonts w:ascii="Cambria" w:hAnsi="Cambria" w:cs="Cambria" w:hint="eastAsia"/>
+        </w:rPr>
+        <w:t>M</w:t>
+      </w:r>
+      <w:r>
+        <w:rPr>
+          <w:rFonts w:ascii="Cambria" w:hAnsi="Cambria" w:cs="Cambria" w:hint="eastAsia"/>
+        </w:rPr>
+        <w:t>个槽</w:t>
+      </w:r>
+      <w:r>
+        <w:rPr>
+          <w:rFonts w:ascii="Cambria" w:hAnsi="Cambria" w:cs="Cambria"/>
+        </w:rPr>
+        <w:t xml:space="preserve">&gt;=N.  </w:t>
+      </w:r>
+    </w:p>
+    <w:p>
+      <w:pPr>
+        <w:rPr>
+          <w:rFonts w:ascii="Cambria" w:hAnsi="Cambria" w:cs="Cambria"/>
+        </w:rPr>
+      </w:pPr>
+      <w:r>
+        <w:rPr>
+          <w:rFonts w:ascii="Cambria" w:hAnsi="Cambria" w:cs="Cambria" w:hint="eastAsia"/>
+        </w:rPr>
         <w:t>N bank  -</w:t>
       </w:r>
       <w:r>
@@ -10590,7 +10758,7 @@
         </w:rPr>
         <w:t>有效槽（不会太影响性能）</w:t>
       </w:r>
-      <w:bookmarkEnd w:id="5"/>
+      <w:bookmarkEnd w:id="8"/>
       <w:r>
         <w:rPr>
           <w:rFonts w:ascii="Cambria" w:hAnsi="Cambria" w:cs="Cambria" w:hint="eastAsia"/>

</xml_diff>